<commit_message>
Phase 4: sync manuscript and supplementary to docx; update figure index (S1-S11)
</commit_message>
<xml_diff>
--- a/paper/manuscript/SUPPLEMENTARY.docx
+++ b/paper/manuscript/SUPPLEMENTARY.docx
@@ -2,7 +2,7 @@
 <file path=word/document.xml><?xml version="1.0" encoding="utf-8"?>
 <w:document xmlns:w="http://schemas.openxmlformats.org/wordprocessingml/2006/main" xmlns:m="http://schemas.openxmlformats.org/officeDocument/2006/math" xmlns:r="http://schemas.openxmlformats.org/officeDocument/2006/relationships" xmlns:o="urn:schemas-microsoft-com:office:office" xmlns:v="urn:schemas-microsoft-com:vml" xmlns:w10="urn:schemas-microsoft-com:office:word" xmlns:a="http://schemas.openxmlformats.org/drawingml/2006/main" xmlns:pic="http://schemas.openxmlformats.org/drawingml/2006/picture" xmlns:wp="http://schemas.openxmlformats.org/drawingml/2006/wordprocessingDrawing">
   <w:body>
-    <w:bookmarkStart w:id="17" w:name="Xc3fcc6656da83e08d67075bda016bbdc5c3d5f9"/>
+    <w:bookmarkStart w:id="26" w:name="Xc3fcc6656da83e08d67075bda016bbdc5c3d5f9"/>
     <w:p>
       <w:pPr>
         <w:pStyle w:val="Heading1"/>
@@ -16,7 +16,7 @@
         <w:pStyle w:val="FirstParagraph"/>
       </w:pPr>
       <w:r>
-        <w:t xml:space="preserve">This document collects the supplementary figure and tables referenced from</w:t>
+        <w:t xml:space="preserve">This document collects the supplementary figures and tables referenced from</w:t>
       </w:r>
       <w:r>
         <w:t xml:space="preserve"> </w:t>
@@ -230,7 +230,832 @@
       </w:r>
     </w:p>
     <w:bookmarkEnd w:id="10"/>
-    <w:bookmarkStart w:id="11" w:name="Xb79c9bf020a903d02af45c43b651fa33d5c8e03"/>
+    <w:bookmarkStart w:id="11" w:name="X6e0b9eecebc3bbf314ac8a2bb7a52303cf3a9cc"/>
+    <w:p>
+      <w:pPr>
+        <w:pStyle w:val="Heading2"/>
+      </w:pPr>
+      <w:r>
+        <w:t xml:space="preserve">Supplementary Figure S3 — Unified GTDB-R207 80–100% benchmark</w:t>
+      </w:r>
+    </w:p>
+    <w:p>
+      <w:pPr>
+        <w:pStyle w:val="FirstParagraph"/>
+      </w:pPr>
+      <w:r>
+        <w:t xml:space="preserve">(</w:t>
+      </w:r>
+      <w:r>
+        <w:rPr>
+          <w:rStyle w:val="VerbatimChar"/>
+        </w:rPr>
+        <w:t xml:space="preserve">figures/gtdb_r207_unified_benchmark.png</w:t>
+      </w:r>
+      <w:r>
+        <w:t xml:space="preserve">)</w:t>
+      </w:r>
+    </w:p>
+    <w:p>
+      <w:pPr>
+        <w:pStyle w:val="BodyText"/>
+      </w:pPr>
+      <w:r>
+        <w:t xml:space="preserve">43,334 held-out same-genus pairs (80–95% plus the 95–100% stratum split into</w:t>
+      </w:r>
+      <w:r>
+        <w:t xml:space="preserve"> </w:t>
+      </w:r>
+      <w:r>
+        <w:t xml:space="preserve">95–97 and 97–100 by truth) combined with 727 high-ANI test pairs sampled from</w:t>
+      </w:r>
+      <w:r>
+        <w:t xml:space="preserve"> </w:t>
+      </w:r>
+      <w:r>
+        <w:t xml:space="preserve">non-representative GTDB-R207 genomes. (a) Estimated vs ANIm truth for Syn2bANI</w:t>
+      </w:r>
+      <w:r>
+        <w:t xml:space="preserve"> </w:t>
+      </w:r>
+      <w:r>
+        <w:t xml:space="preserve">raw gated, Syn2bANI v6-calibrated, Syn2bANI hybrid (raw ≥98% / calibrated</w:t>
+      </w:r>
+      <w:r>
+        <w:t xml:space="preserve"> </w:t>
+      </w:r>
+      <w:r>
+        <w:t xml:space="preserve">&lt;98%), skani, and FastANI. (b) Per-band MAE. (c) Signed-error distributions.</w:t>
+      </w:r>
+      <w:r>
+        <w:t xml:space="preserve"> </w:t>
+      </w:r>
+      <w:r>
+        <w:t xml:space="preserve">(d) High-ANI zoom (95–100%). On the full 80–100% range the Syn2bANI hybrid</w:t>
+      </w:r>
+      <w:r>
+        <w:t xml:space="preserve"> </w:t>
+      </w:r>
+      <w:r>
+        <w:t xml:space="preserve">estimator attains the lowest overall MAE (</w:t>
+      </w:r>
+      <w:r>
+        <w:rPr>
+          <w:b/>
+          <w:bCs/>
+        </w:rPr>
+        <w:t xml:space="preserve">0.615</w:t>
+      </w:r>
+      <w:r>
+        <w:t xml:space="preserve">), while recovering the</w:t>
+      </w:r>
+      <w:r>
+        <w:t xml:space="preserve"> </w:t>
+      </w:r>
+      <w:r>
+        <w:t xml:space="preserve">accurate raw gated estimate in the 97–100% sub-band (MAE 0.23).</w:t>
+      </w:r>
+    </w:p>
+    <w:bookmarkEnd w:id="11"/>
+    <w:bookmarkStart w:id="12" w:name="X9c05ab7676dba1214c8a6507a30270464495a16"/>
+    <w:p>
+      <w:pPr>
+        <w:pStyle w:val="Heading2"/>
+      </w:pPr>
+      <w:r>
+        <w:t xml:space="preserve">Supplementary Figure S4 — Genome quality does not drive ANI error on GTDB-R207</w:t>
+      </w:r>
+    </w:p>
+    <w:p>
+      <w:pPr>
+        <w:pStyle w:val="FirstParagraph"/>
+      </w:pPr>
+      <w:r>
+        <w:t xml:space="preserve">(</w:t>
+      </w:r>
+      <w:r>
+        <w:rPr>
+          <w:rStyle w:val="VerbatimChar"/>
+        </w:rPr>
+        <w:t xml:space="preserve">figures/report/gtdb_quality_vs_mae_combined.png</w:t>
+      </w:r>
+      <w:r>
+        <w:t xml:space="preserve">)</w:t>
+      </w:r>
+    </w:p>
+    <w:p>
+      <w:pPr>
+        <w:pStyle w:val="BodyText"/>
+      </w:pPr>
+      <w:r>
+        <w:t xml:space="preserve">39,903 held-out same-genus pairs with GTDB R207 metadata (completeness,</w:t>
+      </w:r>
+      <w:r>
+        <w:t xml:space="preserve"> </w:t>
+      </w:r>
+      <w:r>
+        <w:t xml:space="preserve">contamination, contig count, mean contig length) and dnadiff/ANIm truth.</w:t>
+      </w:r>
+      <w:r>
+        <w:t xml:space="preserve"> </w:t>
+      </w:r>
+      <w:r>
+        <w:t xml:space="preserve">Calibrated Syn2bANI v5 overall MAE = 0.619, Pearson r = 0.962. (a) MAE by</w:t>
+      </w:r>
+      <w:r>
+        <w:t xml:space="preserve"> </w:t>
+      </w:r>
+      <w:r>
+        <w:t xml:space="preserve">minimum pair completeness (n = 3,972 below 70%, MAE 0.82; n = 22,259 at</w:t>
+      </w:r>
+      <w:r>
+        <w:t xml:space="preserve"> </w:t>
+      </w:r>
+      <w:r>
+        <w:t xml:space="preserve">95–100%, MAE 0.59). (b) MAE by maximum pair contamination. (c) MAE by maximum</w:t>
+      </w:r>
+      <w:r>
+        <w:t xml:space="preserve"> </w:t>
+      </w:r>
+      <w:r>
+        <w:t xml:space="preserve">contig count. (d) MAE by minimum mean contig length (&lt;5 kb: MAE 0.81; ≥10 kb:</w:t>
+      </w:r>
+      <w:r>
+        <w:t xml:space="preserve"> </w:t>
+      </w:r>
+      <w:r>
+        <w:t xml:space="preserve">MAE 0.59–0.66). Error bars are 95% confidence intervals by bootstrap. Only the</w:t>
+      </w:r>
+      <w:r>
+        <w:t xml:space="preserve"> </w:t>
+      </w:r>
+      <w:r>
+        <w:t xml:space="preserve">most fragmented genomes (&lt;5 kb mean contig length) show a modest accuracy</w:t>
+      </w:r>
+      <w:r>
+        <w:t xml:space="preserve"> </w:t>
+      </w:r>
+      <w:r>
+        <w:t xml:space="preserve">degradation; typical MAG-level completeness/contamination variation has little</w:t>
+      </w:r>
+      <w:r>
+        <w:t xml:space="preserve"> </w:t>
+      </w:r>
+      <w:r>
+        <w:t xml:space="preserve">effect on ANI accuracy.</w:t>
+      </w:r>
+    </w:p>
+    <w:bookmarkEnd w:id="12"/>
+    <w:bookmarkStart w:id="13" w:name="Xb9aadcf455a7400e875f71e07652b618a72b771"/>
+    <w:p>
+      <w:pPr>
+        <w:pStyle w:val="Heading2"/>
+      </w:pPr>
+      <w:r>
+        <w:t xml:space="preserve">Supplementary Figure S5 — Exact-truth indel ladder and indel sweep</w:t>
+      </w:r>
+    </w:p>
+    <w:p>
+      <w:pPr>
+        <w:pStyle w:val="FirstParagraph"/>
+      </w:pPr>
+      <w:r>
+        <w:t xml:space="preserve">(</w:t>
+      </w:r>
+      <w:r>
+        <w:rPr>
+          <w:rStyle w:val="VerbatimChar"/>
+        </w:rPr>
+        <w:t xml:space="preserve">figures/report/fig_s5_simulation_indel.png</w:t>
+      </w:r>
+      <w:r>
+        <w:t xml:space="preserve">)</w:t>
+      </w:r>
+    </w:p>
+    <w:p>
+      <w:pPr>
+        <w:pStyle w:val="Compact"/>
+        <w:numPr>
+          <w:ilvl w:val="0"/>
+          <w:numId w:val="1001"/>
+        </w:numPr>
+      </w:pPr>
+      <w:r>
+        <w:t xml:space="preserve">ANI ladder evolved from</w:t>
+      </w:r>
+      <w:r>
+        <w:t xml:space="preserve"> </w:t>
+      </w:r>
+      <w:r>
+        <w:rPr>
+          <w:i/>
+          <w:iCs/>
+        </w:rPr>
+        <w:t xml:space="preserve">E. coli</w:t>
+      </w:r>
+      <w:r>
+        <w:t xml:space="preserve"> </w:t>
+      </w:r>
+      <w:r>
+        <w:t xml:space="preserve">K-12 MG1655 at 85.0–99.9% true ANI with</w:t>
+      </w:r>
+      <w:r>
+        <w:t xml:space="preserve"> </w:t>
+      </w:r>
+      <w:r>
+        <w:t xml:space="preserve">a 400 kb inversion plus ~1 deletion per 100 kb; Syn2bANI (4-enzyme panel) MAE</w:t>
+      </w:r>
+      <w:r>
+        <w:t xml:space="preserve"> </w:t>
+      </w:r>
+      <w:r>
+        <w:t xml:space="preserve">= 0.073 ANI points. (b) Indel sweep at fixed true ANI 95.000 with 0–4 deletions</w:t>
+      </w:r>
+      <w:r>
+        <w:t xml:space="preserve"> </w:t>
+      </w:r>
+      <w:r>
+        <w:t xml:space="preserve">per 100 kb; error stays between +0.032 and +0.184 (MAE 0.081). Gamma and</w:t>
+      </w:r>
+      <w:r>
+        <w:t xml:space="preserve"> </w:t>
+      </w:r>
+      <w:r>
+        <w:t xml:space="preserve">uniform estimates are identical on uniform-rate data.</w:t>
+      </w:r>
+    </w:p>
+    <w:bookmarkEnd w:id="13"/>
+    <w:bookmarkStart w:id="14" w:name="X9219aba7d48231b41a1133743bdf123496fe817"/>
+    <w:p>
+      <w:pPr>
+        <w:pStyle w:val="Heading2"/>
+      </w:pPr>
+      <w:r>
+        <w:t xml:space="preserve">Supplementary Figure S6 — GC coverage ladder</w:t>
+      </w:r>
+    </w:p>
+    <w:p>
+      <w:pPr>
+        <w:pStyle w:val="FirstParagraph"/>
+      </w:pPr>
+      <w:r>
+        <w:t xml:space="preserve">(</w:t>
+      </w:r>
+      <w:r>
+        <w:rPr>
+          <w:rStyle w:val="VerbatimChar"/>
+        </w:rPr>
+        <w:t xml:space="preserve">figures/report/fig_s6_simulation_gc.png</w:t>
+      </w:r>
+      <w:r>
+        <w:t xml:space="preserve">)</w:t>
+      </w:r>
+    </w:p>
+    <w:p>
+      <w:pPr>
+        <w:pStyle w:val="BodyText"/>
+      </w:pPr>
+      <w:r>
+        <w:t xml:space="preserve">Substitution ladders evolved on five real template genomes spanning GC</w:t>
+      </w:r>
+      <w:r>
+        <w:t xml:space="preserve"> </w:t>
+      </w:r>
+      <w:r>
+        <w:t xml:space="preserve">27.2–72.1%. Syn2bANI error is 0.074–0.356 ANI points and is</w:t>
+      </w:r>
+      <w:r>
+        <w:t xml:space="preserve"> </w:t>
+      </w:r>
+      <w:r>
+        <w:rPr>
+          <w:i/>
+          <w:iCs/>
+        </w:rPr>
+        <w:t xml:space="preserve">not</w:t>
+      </w:r>
+      <w:r>
+        <w:t xml:space="preserve"> </w:t>
+      </w:r>
+      <w:r>
+        <w:t xml:space="preserve">monotone in</w:t>
+      </w:r>
+      <w:r>
+        <w:t xml:space="preserve"> </w:t>
+      </w:r>
+      <w:r>
+        <w:t xml:space="preserve">GC; the worst genome (</w:t>
+      </w:r>
+      <w:r>
+        <w:rPr>
+          <w:i/>
+          <w:iCs/>
+        </w:rPr>
+        <w:t xml:space="preserve">B. longum</w:t>
+      </w:r>
+      <w:r>
+        <w:t xml:space="preserve">, GC 60.1%) sits mid-range. The GC sweep</w:t>
+      </w:r>
+      <w:r>
+        <w:t xml:space="preserve"> </w:t>
+      </w:r>
+      <w:r>
+        <w:t xml:space="preserve">source genomes are not present in the repository, so this panel reproduces the</w:t>
+      </w:r>
+      <w:r>
+        <w:t xml:space="preserve"> </w:t>
+      </w:r>
+      <w:r>
+        <w:t xml:space="preserve">historical 4-enzyme sweep reported in</w:t>
+      </w:r>
+      <w:r>
+        <w:t xml:space="preserve"> </w:t>
+      </w:r>
+      <w:r>
+        <w:rPr>
+          <w:rStyle w:val="VerbatimChar"/>
+        </w:rPr>
+        <w:t xml:space="preserve">ALGORITHM_MLE.md</w:t>
+      </w:r>
+      <w:r>
+        <w:t xml:space="preserve"> </w:t>
+      </w:r>
+      <w:r>
+        <w:t xml:space="preserve">§4.8.</w:t>
+      </w:r>
+    </w:p>
+    <w:bookmarkEnd w:id="14"/>
+    <w:bookmarkStart w:id="15" w:name="X61eb234984ace44e0cbdb79e3b450674d3917ff"/>
+    <w:p>
+      <w:pPr>
+        <w:pStyle w:val="Heading2"/>
+      </w:pPr>
+      <w:r>
+        <w:t xml:space="preserve">Supplementary Figure S7 — Simulated fragmentation</w:t>
+      </w:r>
+    </w:p>
+    <w:p>
+      <w:pPr>
+        <w:pStyle w:val="FirstParagraph"/>
+      </w:pPr>
+      <w:r>
+        <w:t xml:space="preserve">(</w:t>
+      </w:r>
+      <w:r>
+        <w:rPr>
+          <w:rStyle w:val="VerbatimChar"/>
+        </w:rPr>
+        <w:t xml:space="preserve">figures/report/fig_s7_simulation_fragment.png</w:t>
+      </w:r>
+      <w:r>
+        <w:t xml:space="preserve">)</w:t>
+      </w:r>
+    </w:p>
+    <w:p>
+      <w:pPr>
+        <w:pStyle w:val="BodyText"/>
+      </w:pPr>
+      <w:r>
+        <w:t xml:space="preserve">A 95% ANI</w:t>
+      </w:r>
+      <w:r>
+        <w:t xml:space="preserve"> </w:t>
+      </w:r>
+      <w:r>
+        <w:rPr>
+          <w:i/>
+          <w:iCs/>
+        </w:rPr>
+        <w:t xml:space="preserve">E. coli</w:t>
+      </w:r>
+      <w:r>
+        <w:t xml:space="preserve"> </w:t>
+      </w:r>
+      <w:r>
+        <w:t xml:space="preserve">query was fragmented into 20–201 contigs (~50%</w:t>
+      </w:r>
+      <w:r>
+        <w:t xml:space="preserve"> </w:t>
+      </w:r>
+      <w:r>
+        <w:t xml:space="preserve">reverse-complemented, order shuffled, no sequence lost). Syn2bANI error is</w:t>
+      </w:r>
+      <w:r>
+        <w:t xml:space="preserve"> </w:t>
+      </w:r>
+      <w:r>
+        <w:t xml:space="preserve">0.018–0.179 (MAE 0.070), confirming that random fragmentation per se does not</w:t>
+      </w:r>
+      <w:r>
+        <w:t xml:space="preserve"> </w:t>
+      </w:r>
+      <w:r>
+        <w:t xml:space="preserve">bias the chain-restricted MLE. Real assemblies below ~20 kb N50 behave</w:t>
+      </w:r>
+      <w:r>
+        <w:t xml:space="preserve"> </w:t>
+      </w:r>
+      <w:r>
+        <w:t xml:space="preserve">differently because they lose sequence at repeat boundaries; see Results 2.3</w:t>
+      </w:r>
+      <w:r>
+        <w:t xml:space="preserve"> </w:t>
+      </w:r>
+      <w:r>
+        <w:t xml:space="preserve">and Fig. 10c.</w:t>
+      </w:r>
+    </w:p>
+    <w:bookmarkEnd w:id="15"/>
+    <w:bookmarkStart w:id="16" w:name="X255f769d9dfa38e9ab64bc08df98141a49fdfa6"/>
+    <w:p>
+      <w:pPr>
+        <w:pStyle w:val="Heading2"/>
+      </w:pPr>
+      <w:r>
+        <w:t xml:space="preserve">Supplementary Figure S8 — Accessory-content confound</w:t>
+      </w:r>
+    </w:p>
+    <w:p>
+      <w:pPr>
+        <w:pStyle w:val="FirstParagraph"/>
+      </w:pPr>
+      <w:r>
+        <w:t xml:space="preserve">(</w:t>
+      </w:r>
+      <w:r>
+        <w:rPr>
+          <w:rStyle w:val="VerbatimChar"/>
+        </w:rPr>
+        <w:t xml:space="preserve">figures/report/fig_s8_simulation_accessory.png</w:t>
+      </w:r>
+      <w:r>
+        <w:t xml:space="preserve">)</w:t>
+      </w:r>
+    </w:p>
+    <w:p>
+      <w:pPr>
+        <w:pStyle w:val="BodyText"/>
+      </w:pPr>
+      <w:r>
+        <w:t xml:space="preserve">Core ANI fixed at 95.000 with 0–50% of the genome replaced by</w:t>
+      </w:r>
+      <w:r>
+        <w:t xml:space="preserve"> </w:t>
+      </w:r>
+      <w:r>
+        <w:t xml:space="preserve">composition-preserving, homology-destroying shuffled blocks. (a) ANI estimate</w:t>
+      </w:r>
+      <w:r>
+        <w:t xml:space="preserve"> </w:t>
+      </w:r>
+      <w:r>
+        <w:t xml:space="preserve">remains flat across accessory fractions (+0.044 to +0.250, MAE 0.112) because</w:t>
+      </w:r>
+      <w:r>
+        <w:t xml:space="preserve"> </w:t>
+      </w:r>
+      <w:r>
+        <w:t xml:space="preserve">only tags inside chains contribute to the likelihood. (b)</w:t>
+      </w:r>
+      <w:r>
+        <w:t xml:space="preserve"> </w:t>
+      </w:r>
+      <w:r>
+        <w:rPr>
+          <w:rStyle w:val="VerbatimChar"/>
+        </w:rPr>
+        <w:t xml:space="preserve">af_query</w:t>
+      </w:r>
+      <w:r>
+        <w:t xml:space="preserve"> </w:t>
+      </w:r>
+      <w:r>
+        <w:t xml:space="preserve">tracks</w:t>
+      </w:r>
+      <w:r>
+        <w:t xml:space="preserve"> </w:t>
+      </w:r>
+      <w:r>
+        <w:t xml:space="preserve">the true shared fraction (1 − F) to within 0.004, demonstrating the decoupling</w:t>
+      </w:r>
+      <w:r>
+        <w:t xml:space="preserve"> </w:t>
+      </w:r>
+      <w:r>
+        <w:t xml:space="preserve">of divergence and shared-content estimates.</w:t>
+      </w:r>
+    </w:p>
+    <w:bookmarkEnd w:id="16"/>
+    <w:bookmarkStart w:id="17" w:name="Xb1b4e0d6fb143f378a2ff2503f4916df308316e"/>
+    <w:p>
+      <w:pPr>
+        <w:pStyle w:val="Heading2"/>
+      </w:pPr>
+      <w:r>
+        <w:t xml:space="preserve">Supplementary Figure S9 — Mosaic/rate-heterogeneity family</w:t>
+      </w:r>
+    </w:p>
+    <w:p>
+      <w:pPr>
+        <w:pStyle w:val="FirstParagraph"/>
+      </w:pPr>
+      <w:r>
+        <w:t xml:space="preserve">(</w:t>
+      </w:r>
+      <w:r>
+        <w:rPr>
+          <w:rStyle w:val="VerbatimChar"/>
+        </w:rPr>
+        <w:t xml:space="preserve">figures/report/fig_s9_simulation_mosaic.png</w:t>
+      </w:r>
+      <w:r>
+        <w:t xml:space="preserve">)</w:t>
+      </w:r>
+    </w:p>
+    <w:p>
+      <w:pPr>
+        <w:pStyle w:val="BodyText"/>
+      </w:pPr>
+      <w:r>
+        <w:t xml:space="preserve">Per-block divergence rates sampled from Gamma(α, α) with α = 0.5/1/2 (mean</w:t>
+      </w:r>
+      <w:r>
+        <w:t xml:space="preserve"> </w:t>
+      </w:r>
+      <w:r>
+        <w:t xml:space="preserve">ANI 90–98) and deliberately misspecified bimodal 50/70%-core cases. The gamma</w:t>
+      </w:r>
+      <w:r>
+        <w:t xml:space="preserve"> </w:t>
+      </w:r>
+      <w:r>
+        <w:t xml:space="preserve">estimator reduces error relative to the uniform estimator (e.g., gamma MAE</w:t>
+      </w:r>
+      <w:r>
+        <w:t xml:space="preserve"> </w:t>
+      </w:r>
+      <w:r>
+        <w:t xml:space="preserve">1.35 vs uniform 2.75 on gamma regimes), but residual bias remains on bimodal</w:t>
+      </w:r>
+      <w:r>
+        <w:t xml:space="preserve"> </w:t>
+      </w:r>
+      <w:r>
+        <w:t xml:space="preserve">misspecification (gamma MAE 2.43 vs uniform 3.42), motivating the real-genome</w:t>
+      </w:r>
+      <w:r>
+        <w:t xml:space="preserve"> </w:t>
+      </w:r>
+      <w:r>
+        <w:t xml:space="preserve">ridge calibration of Results 2.5.</w:t>
+      </w:r>
+    </w:p>
+    <w:bookmarkEnd w:id="17"/>
+    <w:bookmarkStart w:id="18" w:name="Xe1cceedd7fe263e162e74e3896e191392fdf8fb"/>
+    <w:p>
+      <w:pPr>
+        <w:pStyle w:val="Heading2"/>
+      </w:pPr>
+      <w:r>
+        <w:t xml:space="preserve">Supplementary Figure S10 — Breakpoint counts scale independently of ANI in high-ANI isolate collections</w:t>
+      </w:r>
+    </w:p>
+    <w:p>
+      <w:pPr>
+        <w:pStyle w:val="FirstParagraph"/>
+      </w:pPr>
+      <w:r>
+        <w:t xml:space="preserve">(</w:t>
+      </w:r>
+      <w:r>
+        <w:rPr>
+          <w:rStyle w:val="VerbatimChar"/>
+        </w:rPr>
+        <w:t xml:space="preserve">figures/syntracker_validation/syntracker_breakpoints_vs_ani.png</w:t>
+      </w:r>
+      <w:r>
+        <w:t xml:space="preserve">)</w:t>
+      </w:r>
+    </w:p>
+    <w:p>
+      <w:pPr>
+        <w:pStyle w:val="BodyText"/>
+      </w:pPr>
+      <w:r>
+        <w:t xml:space="preserve">Syn2bANI ANI versus breakpoint count for (a)</w:t>
+      </w:r>
+      <w:r>
+        <w:t xml:space="preserve"> </w:t>
+      </w:r>
+      <w:r>
+        <w:rPr>
+          <w:i/>
+          <w:iCs/>
+        </w:rPr>
+        <w:t xml:space="preserve">E. coli</w:t>
+      </w:r>
+      <w:r>
+        <w:t xml:space="preserve"> </w:t>
+      </w:r>
+      <w:r>
+        <w:t xml:space="preserve">hypermutator (23</w:t>
+      </w:r>
+      <w:r>
+        <w:t xml:space="preserve"> </w:t>
+      </w:r>
+      <w:r>
+        <w:t xml:space="preserve">isolates, 253 pairs) and (b)</w:t>
+      </w:r>
+      <w:r>
+        <w:t xml:space="preserve"> </w:t>
+      </w:r>
+      <w:r>
+        <w:rPr>
+          <w:i/>
+          <w:iCs/>
+        </w:rPr>
+        <w:t xml:space="preserve">H. pylori</w:t>
+      </w:r>
+      <w:r>
+        <w:t xml:space="preserve"> </w:t>
+      </w:r>
+      <w:r>
+        <w:t xml:space="preserve">(77 isolates, 2,926 pairs). In both</w:t>
+      </w:r>
+      <w:r>
+        <w:t xml:space="preserve"> </w:t>
+      </w:r>
+      <w:r>
+        <w:t xml:space="preserve">collections ANI is pinned near 100% while breakpoint counts vary over more</w:t>
+      </w:r>
+      <w:r>
+        <w:t xml:space="preserve"> </w:t>
+      </w:r>
+      <w:r>
+        <w:t xml:space="preserve">than an order of magnitude, illustrating that rearrangement burden is not</w:t>
+      </w:r>
+      <w:r>
+        <w:t xml:space="preserve"> </w:t>
+      </w:r>
+      <w:r>
+        <w:t xml:space="preserve">captured by the divergence scalar. Annotated points are the top discordant</w:t>
+      </w:r>
+      <w:r>
+        <w:t xml:space="preserve"> </w:t>
+      </w:r>
+      <w:r>
+        <w:t xml:space="preserve">cases by ANI–synteny rank difference.</w:t>
+      </w:r>
+    </w:p>
+    <w:bookmarkEnd w:id="18"/>
+    <w:bookmarkStart w:id="19" w:name="X2a085c8894582dbc4d4b13cc4852f4509f790fd"/>
+    <w:p>
+      <w:pPr>
+        <w:pStyle w:val="Heading2"/>
+      </w:pPr>
+      <w:r>
+        <w:t xml:space="preserve">Supplementary Figure S11 — Near-clonal</w:t>
+      </w:r>
+      <w:r>
+        <w:t xml:space="preserve"> </w:t>
+      </w:r>
+      <w:r>
+        <w:rPr>
+          <w:i/>
+          <w:iCs/>
+        </w:rPr>
+        <w:t xml:space="preserve">Neisseria gonorrhoeae</w:t>
+      </w:r>
+      <w:r>
+        <w:t xml:space="preserve"> </w:t>
+      </w:r>
+      <w:r>
+        <w:t xml:space="preserve">and</w:t>
+      </w:r>
+      <w:r>
+        <w:t xml:space="preserve"> </w:t>
+      </w:r>
+      <w:r>
+        <w:rPr>
+          <w:i/>
+          <w:iCs/>
+        </w:rPr>
+        <w:t xml:space="preserve">Streptomyces rimosus</w:t>
+      </w:r>
+      <w:r>
+        <w:t xml:space="preserve"> </w:t>
+      </w:r>
+      <w:r>
+        <w:t xml:space="preserve">isolates also show ANI–synteny decoupling</w:t>
+      </w:r>
+    </w:p>
+    <w:p>
+      <w:pPr>
+        <w:pStyle w:val="FirstParagraph"/>
+      </w:pPr>
+      <w:r>
+        <w:t xml:space="preserve">(</w:t>
+      </w:r>
+      <w:r>
+        <w:rPr>
+          <w:rStyle w:val="VerbatimChar"/>
+        </w:rPr>
+        <w:t xml:space="preserve">figures/syntracker_validation/syntracker_supp_ngonorrhoeae_srimosus.png</w:t>
+      </w:r>
+      <w:r>
+        <w:t xml:space="preserve">)</w:t>
+      </w:r>
+    </w:p>
+    <w:p>
+      <w:pPr>
+        <w:pStyle w:val="BodyText"/>
+      </w:pPr>
+      <w:r>
+        <w:t xml:space="preserve">Left column: Syn2bANI ANI vs synteny score; right column: skani ANI vs the</w:t>
+      </w:r>
+      <w:r>
+        <w:t xml:space="preserve"> </w:t>
+      </w:r>
+      <w:r>
+        <w:t xml:space="preserve">same synteny score. (a,b) 12</w:t>
+      </w:r>
+      <w:r>
+        <w:t xml:space="preserve"> </w:t>
+      </w:r>
+      <w:r>
+        <w:rPr>
+          <w:i/>
+          <w:iCs/>
+        </w:rPr>
+        <w:t xml:space="preserve">N. gonorrhoeae</w:t>
+      </w:r>
+      <w:r>
+        <w:t xml:space="preserve"> </w:t>
+      </w:r>
+      <w:r>
+        <w:t xml:space="preserve">isolates (66 pairs); pairs with</w:t>
+      </w:r>
+      <w:r>
+        <w:t xml:space="preserve"> </w:t>
+      </w:r>
+      <w:r>
+        <w:t xml:space="preserve">ANI &gt;99.9% have synteny scores 0.85–0.89 and up to 376 breakpoints. (c,d) 20</w:t>
+      </w:r>
+      <w:r>
+        <w:t xml:space="preserve"> </w:t>
+      </w:r>
+      <w:r>
+        <w:rPr>
+          <w:i/>
+          <w:iCs/>
+        </w:rPr>
+        <w:t xml:space="preserve">S. rimosus</w:t>
+      </w:r>
+      <w:r>
+        <w:t xml:space="preserve"> </w:t>
+      </w:r>
+      <w:r>
+        <w:t xml:space="preserve">isolates (190 pairs); near-clonal pairs (ANI 99.99–100%) have</w:t>
+      </w:r>
+      <w:r>
+        <w:t xml:space="preserve"> </w:t>
+      </w:r>
+      <w:r>
+        <w:t xml:space="preserve">synteny scores 0.89–0.96 and an average of ~1,980 breakpoints. The most</w:t>
+      </w:r>
+      <w:r>
+        <w:t xml:space="preserve"> </w:t>
+      </w:r>
+      <w:r>
+        <w:t xml:space="preserve">discordant cases (NG_05 vs NG_10 and SR_06 vs SR_10) were re-analyzed with</w:t>
+      </w:r>
+      <w:r>
+        <w:t xml:space="preserve"> </w:t>
+      </w:r>
+      <w:r>
+        <w:rPr>
+          <w:rStyle w:val="VerbatimChar"/>
+        </w:rPr>
+        <w:t xml:space="preserve">syn2bani struct</w:t>
+      </w:r>
+      <w:r>
+        <w:t xml:space="preserve">; counts are in Table 4 and</w:t>
+      </w:r>
+      <w:r>
+        <w:t xml:space="preserve"> </w:t>
+      </w:r>
+      <w:r>
+        <w:rPr>
+          <w:rStyle w:val="VerbatimChar"/>
+        </w:rPr>
+        <w:t xml:space="preserve">results/syntracker_validation/struct_top_cases_summary.tsv</w:t>
+      </w:r>
+      <w:r>
+        <w:t xml:space="preserve">.</w:t>
+      </w:r>
+    </w:p>
+    <w:bookmarkEnd w:id="19"/>
+    <w:bookmarkStart w:id="20" w:name="Xb79c9bf020a903d02af45c43b651fa33d5c8e03"/>
     <w:p>
       <w:pPr>
         <w:pStyle w:val="Heading2"/>
@@ -556,8 +1381,8 @@
         </w:tc>
       </w:tr>
     </w:tbl>
-    <w:bookmarkEnd w:id="11"/>
-    <w:bookmarkStart w:id="12" w:name="X1d1a5b89358b225a547ea735bc71b43678427f8"/>
+    <w:bookmarkEnd w:id="20"/>
+    <w:bookmarkStart w:id="21" w:name="X1d1a5b89358b225a547ea735bc71b43678427f8"/>
     <w:p>
       <w:pPr>
         <w:pStyle w:val="Heading2"/>
@@ -871,8 +1696,8 @@
         </w:tc>
       </w:tr>
     </w:tbl>
-    <w:bookmarkEnd w:id="12"/>
-    <w:bookmarkStart w:id="13" w:name="X791b5905c3cbd3b80da6a27b4633a9dc2eda705"/>
+    <w:bookmarkEnd w:id="21"/>
+    <w:bookmarkStart w:id="22" w:name="X791b5905c3cbd3b80da6a27b4633a9dc2eda705"/>
     <w:p>
       <w:pPr>
         <w:pStyle w:val="Heading2"/>
@@ -1081,8 +1906,8 @@
         </w:tc>
       </w:tr>
     </w:tbl>
-    <w:bookmarkEnd w:id="13"/>
-    <w:bookmarkStart w:id="14" w:name="Xe280e63292e65e7cc12ffc5dad24d6a06d19d0f"/>
+    <w:bookmarkEnd w:id="22"/>
+    <w:bookmarkStart w:id="23" w:name="Xe280e63292e65e7cc12ffc5dad24d6a06d19d0f"/>
     <w:p>
       <w:pPr>
         <w:pStyle w:val="Heading2"/>
@@ -1135,13 +1960,13 @@
         <w:t xml:space="preserve"> </w:t>
       </w:r>
       <w:r>
-        <w:t xml:space="preserve">near-clonal pairs are pushed above 100. The model learned the +2.02 raw</w:t>
-      </w:r>
-      <w:r>
-        <w:t xml:space="preserve"> </w:t>
-      </w:r>
-      <w:r>
-        <w:t xml:space="preserve">bias of complete-genome pairs, while raw bias on MAGs is only +0.16, so the</w:t>
+        <w:t xml:space="preserve">near-clonal pairs are pushed above 100. The model learned the +2.02 raw bias</w:t>
+      </w:r>
+      <w:r>
+        <w:t xml:space="preserve"> </w:t>
+      </w:r>
+      <w:r>
+        <w:t xml:space="preserve">of complete-genome pairs, while raw bias on MAGs is only +0.16, so the</w:t>
       </w:r>
       <w:r>
         <w:t xml:space="preserve"> </w:t>
@@ -1180,8 +2005,8 @@
         <w:t xml:space="preserve">.</w:t>
       </w:r>
     </w:p>
-    <w:bookmarkEnd w:id="14"/>
-    <w:bookmarkStart w:id="15" w:name="Xd013ccaae7d4dde06816ab37078854f863f6c97"/>
+    <w:bookmarkEnd w:id="23"/>
+    <w:bookmarkStart w:id="24" w:name="Xd013ccaae7d4dde06816ab37078854f863f6c97"/>
     <w:p>
       <w:pPr>
         <w:pStyle w:val="Heading2"/>
@@ -1352,8 +2177,8 @@
         <w:t xml:space="preserve">further is not expected to improve it (main text, Methods 4.6).</w:t>
       </w:r>
     </w:p>
-    <w:bookmarkEnd w:id="15"/>
-    <w:bookmarkStart w:id="16" w:name="X335171f238bd89d569aec4e4b5b6643057b0b49"/>
+    <w:bookmarkEnd w:id="24"/>
+    <w:bookmarkStart w:id="25" w:name="X335171f238bd89d569aec4e4b5b6643057b0b49"/>
     <w:p>
       <w:pPr>
         <w:pStyle w:val="Heading2"/>
@@ -1454,8 +2279,8 @@
         <w:t xml:space="preserve">.</w:t>
       </w:r>
     </w:p>
-    <w:bookmarkEnd w:id="16"/>
-    <w:bookmarkEnd w:id="17"/>
+    <w:bookmarkEnd w:id="25"/>
+    <w:bookmarkEnd w:id="26"/>
     <w:sectPr>
       <w:footnotePr>
         <w:numRestart w:val="eachSect"/>
@@ -1566,8 +2391,123 @@
       </w:pPr>
     </w:lvl>
   </w:abstractNum>
+  <w:abstractNum w:abstractNumId="99731">
+    <w:nsid w:val="00A99731"/>
+    <w:multiLevelType w:val="multilevel"/>
+    <w:lvl w:ilvl="0">
+      <w:start w:val="1"/>
+      <w:numFmt w:val="lowerLetter"/>
+      <w:lvlText w:val="(%1)"/>
+      <w:lvlJc w:val="left"/>
+      <w:pPr>
+        <w:ind w:left="720" w:hanging="360"/>
+      </w:pPr>
+    </w:lvl>
+    <w:lvl w:ilvl="1">
+      <w:start w:val="1"/>
+      <w:numFmt w:val="lowerLetter"/>
+      <w:lvlText w:val="(%2)"/>
+      <w:lvlJc w:val="left"/>
+      <w:pPr>
+        <w:ind w:left="1440" w:hanging="360"/>
+      </w:pPr>
+    </w:lvl>
+    <w:lvl w:ilvl="2">
+      <w:start w:val="1"/>
+      <w:numFmt w:val="lowerLetter"/>
+      <w:lvlText w:val="(%3)"/>
+      <w:lvlJc w:val="left"/>
+      <w:pPr>
+        <w:ind w:left="2160" w:hanging="360"/>
+      </w:pPr>
+    </w:lvl>
+    <w:lvl w:ilvl="3">
+      <w:start w:val="1"/>
+      <w:numFmt w:val="lowerLetter"/>
+      <w:lvlText w:val="(%4)"/>
+      <w:lvlJc w:val="left"/>
+      <w:pPr>
+        <w:ind w:left="2880" w:hanging="360"/>
+      </w:pPr>
+    </w:lvl>
+    <w:lvl w:ilvl="4">
+      <w:start w:val="1"/>
+      <w:numFmt w:val="lowerLetter"/>
+      <w:lvlText w:val="(%5)"/>
+      <w:lvlJc w:val="left"/>
+      <w:pPr>
+        <w:ind w:left="3600" w:hanging="360"/>
+      </w:pPr>
+    </w:lvl>
+    <w:lvl w:ilvl="5">
+      <w:start w:val="1"/>
+      <w:numFmt w:val="lowerLetter"/>
+      <w:lvlText w:val="(%6)"/>
+      <w:lvlJc w:val="left"/>
+      <w:pPr>
+        <w:ind w:left="4320" w:hanging="360"/>
+      </w:pPr>
+    </w:lvl>
+    <w:lvl w:ilvl="6">
+      <w:start w:val="1"/>
+      <w:numFmt w:val="lowerLetter"/>
+      <w:lvlText w:val="(%7)"/>
+      <w:lvlJc w:val="left"/>
+      <w:pPr>
+        <w:ind w:left="5040" w:hanging="360"/>
+      </w:pPr>
+    </w:lvl>
+    <w:lvl w:ilvl="7">
+      <w:start w:val="1"/>
+      <w:numFmt w:val="lowerLetter"/>
+      <w:lvlText w:val="(%8)"/>
+      <w:lvlJc w:val="left"/>
+      <w:pPr>
+        <w:ind w:left="5760" w:hanging="360"/>
+      </w:pPr>
+    </w:lvl>
+    <w:lvl w:ilvl="8">
+      <w:start w:val="1"/>
+      <w:numFmt w:val="lowerLetter"/>
+      <w:lvlText w:val="(%9)"/>
+      <w:lvlJc w:val="left"/>
+      <w:pPr>
+        <w:ind w:left="6480" w:hanging="360"/>
+      </w:pPr>
+    </w:lvl>
+  </w:abstractNum>
   <w:num w:numId="1000">
     <w:abstractNumId w:val="990"/>
+  </w:num>
+  <w:num w:numId="1001">
+    <w:abstractNumId w:val="99731"/>
+    <w:lvlOverride w:ilvl="0">
+      <w:startOverride w:val="1"/>
+    </w:lvlOverride>
+    <w:lvlOverride w:ilvl="1">
+      <w:startOverride w:val="1"/>
+    </w:lvlOverride>
+    <w:lvlOverride w:ilvl="2">
+      <w:startOverride w:val="1"/>
+    </w:lvlOverride>
+    <w:lvlOverride w:ilvl="3">
+      <w:startOverride w:val="1"/>
+    </w:lvlOverride>
+    <w:lvlOverride w:ilvl="4">
+      <w:startOverride w:val="1"/>
+    </w:lvlOverride>
+    <w:lvlOverride w:ilvl="5">
+      <w:startOverride w:val="1"/>
+    </w:lvlOverride>
+    <w:lvlOverride w:ilvl="6">
+      <w:startOverride w:val="1"/>
+    </w:lvlOverride>
+    <w:lvlOverride w:ilvl="7">
+      <w:startOverride w:val="1"/>
+    </w:lvlOverride>
+    <w:lvlOverride w:ilvl="8">
+      <w:startOverride w:val="1"/>
+    </w:lvlOverride>
   </w:num>
 </w:numbering>
 </file>

</xml_diff>

<commit_message>
regenerate docx from updated markdown; ignore Office lock files
</commit_message>
<xml_diff>
--- a/paper/manuscript/SUPPLEMENTARY.docx
+++ b/paper/manuscript/SUPPLEMENTARY.docx
@@ -2,7 +2,7 @@
 <file path=word/document.xml><?xml version="1.0" encoding="utf-8"?>
 <w:document xmlns:w="http://schemas.openxmlformats.org/wordprocessingml/2006/main" xmlns:m="http://schemas.openxmlformats.org/officeDocument/2006/math" xmlns:r="http://schemas.openxmlformats.org/officeDocument/2006/relationships" xmlns:o="urn:schemas-microsoft-com:office:office" xmlns:v="urn:schemas-microsoft-com:vml" xmlns:w10="urn:schemas-microsoft-com:office:word" xmlns:a="http://schemas.openxmlformats.org/drawingml/2006/main" xmlns:pic="http://schemas.openxmlformats.org/drawingml/2006/picture" xmlns:wp="http://schemas.openxmlformats.org/drawingml/2006/wordprocessingDrawing">
   <w:body>
-    <w:bookmarkStart w:id="26" w:name="Xc3fcc6656da83e08d67075bda016bbdc5c3d5f9"/>
+    <w:bookmarkStart w:id="27" w:name="Xc3fcc6656da83e08d67075bda016bbdc5c3d5f9"/>
     <w:p>
       <w:pPr>
         <w:pStyle w:val="Heading1"/>
@@ -1055,7 +1055,131 @@
       </w:r>
     </w:p>
     <w:bookmarkEnd w:id="19"/>
-    <w:bookmarkStart w:id="20" w:name="Xb79c9bf020a903d02af45c43b651fa33d5c8e03"/>
+    <w:bookmarkStart w:id="20" w:name="X2422f0469f3022556b72e2e5eef1a136783d04b"/>
+    <w:p>
+      <w:pPr>
+        <w:pStyle w:val="Heading2"/>
+      </w:pPr>
+      <w:r>
+        <w:t xml:space="preserve">Supplementary Figure S12 — Engineered</w:t>
+      </w:r>
+      <w:r>
+        <w:t xml:space="preserve"> </w:t>
+      </w:r>
+      <w:r>
+        <w:rPr>
+          <w:i/>
+          <w:iCs/>
+        </w:rPr>
+        <w:t xml:space="preserve">H. pylori</w:t>
+      </w:r>
+      <w:r>
+        <w:t xml:space="preserve"> </w:t>
+      </w:r>
+      <w:r>
+        <w:t xml:space="preserve">cagPAI deletion is recovered at exact size</w:t>
+      </w:r>
+    </w:p>
+    <w:p>
+      <w:pPr>
+        <w:pStyle w:val="FirstParagraph"/>
+      </w:pPr>
+      <w:r>
+        <w:t xml:space="preserve">(</w:t>
+      </w:r>
+      <w:r>
+        <w:rPr>
+          <w:rStyle w:val="VerbatimChar"/>
+        </w:rPr>
+        <w:t xml:space="preserve">figures/report/fig_s12_cagpai_pilot.png</w:t>
+      </w:r>
+      <w:r>
+        <w:t xml:space="preserve">)</w:t>
+      </w:r>
+    </w:p>
+    <w:p>
+      <w:pPr>
+        <w:pStyle w:val="BodyText"/>
+      </w:pPr>
+      <w:r>
+        <w:t xml:space="preserve">Eight</w:t>
+      </w:r>
+      <w:r>
+        <w:t xml:space="preserve"> </w:t>
+      </w:r>
+      <w:r>
+        <w:rPr>
+          <w:i/>
+          <w:iCs/>
+        </w:rPr>
+        <w:t xml:space="preserve">H. pylori</w:t>
+      </w:r>
+      <w:r>
+        <w:t xml:space="preserve"> </w:t>
+      </w:r>
+      <w:r>
+        <w:t xml:space="preserve">26695-derived genomes: wild-type (WT), a 36,154 bp cagPAI deletion (ΔcagPAI), cagPAI inversion, cagPAI translocation, and the same four structures on a mut1 background carrying ~1% substitutions. All pairwise comparisons were run with</w:t>
+      </w:r>
+      <w:r>
+        <w:t xml:space="preserve"> </w:t>
+      </w:r>
+      <w:r>
+        <w:rPr>
+          <w:rStyle w:val="VerbatimChar"/>
+        </w:rPr>
+        <w:t xml:space="preserve">syn2bani ani</w:t>
+      </w:r>
+      <w:r>
+        <w:t xml:space="preserve"> </w:t>
+      </w:r>
+      <w:r>
+        <w:t xml:space="preserve">and</w:t>
+      </w:r>
+      <w:r>
+        <w:t xml:space="preserve"> </w:t>
+      </w:r>
+      <w:r>
+        <w:rPr>
+          <w:rStyle w:val="VerbatimChar"/>
+        </w:rPr>
+        <w:t xml:space="preserve">syn2bani struct</w:t>
+      </w:r>
+      <w:r>
+        <w:t xml:space="preserve">. (a) ANI is ~100% for same-background pairs and ~99% across backgrounds, independent of the 36 kb rearrangement. (b)</w:t>
+      </w:r>
+      <w:r>
+        <w:t xml:space="preserve"> </w:t>
+      </w:r>
+      <w:r>
+        <w:rPr>
+          <w:rStyle w:val="VerbatimChar"/>
+        </w:rPr>
+        <w:t xml:space="preserve">breakpoint_count</w:t>
+      </w:r>
+      <w:r>
+        <w:t xml:space="preserve"> </w:t>
+      </w:r>
+      <w:r>
+        <w:t xml:space="preserve">increases for inversion and translocation pairs. (c)</w:t>
+      </w:r>
+      <w:r>
+        <w:t xml:space="preserve"> </w:t>
+      </w:r>
+      <w:r>
+        <w:rPr>
+          <w:rStyle w:val="VerbatimChar"/>
+        </w:rPr>
+        <w:t xml:space="preserve">synteny_score</w:t>
+      </w:r>
+      <w:r>
+        <w:t xml:space="preserve"> </w:t>
+      </w:r>
+      <w:r>
+        <w:t xml:space="preserve">(chain coverage) drops only modestly with the deletion and is insensitive to inversion/translocation, confirming that it measures coverage rather than rearrangement burden. The WT vs ΔcagPAI comparison returns a single insertion call of exactly 36,154 bp.</w:t>
+      </w:r>
+    </w:p>
+    <w:bookmarkEnd w:id="20"/>
+    <w:bookmarkStart w:id="21" w:name="Xb79c9bf020a903d02af45c43b651fa33d5c8e03"/>
     <w:p>
       <w:pPr>
         <w:pStyle w:val="Heading2"/>
@@ -1381,8 +1505,8 @@
         </w:tc>
       </w:tr>
     </w:tbl>
-    <w:bookmarkEnd w:id="20"/>
-    <w:bookmarkStart w:id="21" w:name="X1d1a5b89358b225a547ea735bc71b43678427f8"/>
+    <w:bookmarkEnd w:id="21"/>
+    <w:bookmarkStart w:id="22" w:name="X1d1a5b89358b225a547ea735bc71b43678427f8"/>
     <w:p>
       <w:pPr>
         <w:pStyle w:val="Heading2"/>
@@ -1696,8 +1820,8 @@
         </w:tc>
       </w:tr>
     </w:tbl>
-    <w:bookmarkEnd w:id="21"/>
-    <w:bookmarkStart w:id="22" w:name="X791b5905c3cbd3b80da6a27b4633a9dc2eda705"/>
+    <w:bookmarkEnd w:id="22"/>
+    <w:bookmarkStart w:id="23" w:name="X791b5905c3cbd3b80da6a27b4633a9dc2eda705"/>
     <w:p>
       <w:pPr>
         <w:pStyle w:val="Heading2"/>
@@ -1906,8 +2030,8 @@
         </w:tc>
       </w:tr>
     </w:tbl>
-    <w:bookmarkEnd w:id="22"/>
-    <w:bookmarkStart w:id="23" w:name="Xe280e63292e65e7cc12ffc5dad24d6a06d19d0f"/>
+    <w:bookmarkEnd w:id="23"/>
+    <w:bookmarkStart w:id="24" w:name="Xe280e63292e65e7cc12ffc5dad24d6a06d19d0f"/>
     <w:p>
       <w:pPr>
         <w:pStyle w:val="Heading2"/>
@@ -2005,8 +2129,8 @@
         <w:t xml:space="preserve">.</w:t>
       </w:r>
     </w:p>
-    <w:bookmarkEnd w:id="23"/>
-    <w:bookmarkStart w:id="24" w:name="Xd013ccaae7d4dde06816ab37078854f863f6c97"/>
+    <w:bookmarkEnd w:id="24"/>
+    <w:bookmarkStart w:id="25" w:name="Xd013ccaae7d4dde06816ab37078854f863f6c97"/>
     <w:p>
       <w:pPr>
         <w:pStyle w:val="Heading2"/>
@@ -2177,8 +2301,8 @@
         <w:t xml:space="preserve">further is not expected to improve it (main text, Methods 4.6).</w:t>
       </w:r>
     </w:p>
-    <w:bookmarkEnd w:id="24"/>
-    <w:bookmarkStart w:id="25" w:name="X335171f238bd89d569aec4e4b5b6643057b0b49"/>
+    <w:bookmarkEnd w:id="25"/>
+    <w:bookmarkStart w:id="26" w:name="X335171f238bd89d569aec4e4b5b6643057b0b49"/>
     <w:p>
       <w:pPr>
         <w:pStyle w:val="Heading2"/>
@@ -2279,8 +2403,8 @@
         <w:t xml:space="preserve">.</w:t>
       </w:r>
     </w:p>
-    <w:bookmarkEnd w:id="25"/>
     <w:bookmarkEnd w:id="26"/>
+    <w:bookmarkEnd w:id="27"/>
     <w:sectPr>
       <w:footnotePr>
         <w:numRestart w:val="eachSect"/>

</xml_diff>

<commit_message>
rename Syn2bANI output column synteny_score -> anchor_adjacency across code, results, figures, and manuscript
</commit_message>
<xml_diff>
--- a/paper/manuscript/SUPPLEMENTARY.docx
+++ b/paper/manuscript/SUPPLEMENTARY.docx
@@ -80,7 +80,7 @@
         <w:t xml:space="preserve"> </w:t>
       </w:r>
       <w:r>
-        <w:t xml:space="preserve">(b) synteny_score vs inversion count: monotone decline 1.0000 → 0.9835.</w:t>
+        <w:t xml:space="preserve">(b) anchor_adjacency vs inversion count: monotone decline 1.0000 → 0.9835.</w:t>
       </w:r>
       <w:r>
         <w:t xml:space="preserve"> </w:t>
@@ -104,7 +104,7 @@
         <w:t xml:space="preserve"> </w:t>
       </w:r>
       <w:r>
-        <w:t xml:space="preserve">synteny_score 0.9997, no spurious structural flags. Data and report:</w:t>
+        <w:t xml:space="preserve">anchor_adjacency 0.9997, no spurious structural flags. Data and report:</w:t>
       </w:r>
       <w:r>
         <w:t xml:space="preserve"> </w:t>
@@ -908,7 +908,7 @@
       </w:r>
     </w:p>
     <w:bookmarkEnd w:id="18"/>
-    <w:bookmarkStart w:id="19" w:name="X2a085c8894582dbc4d4b13cc4852f4509f790fd"/>
+    <w:bookmarkStart w:id="19" w:name="Xbfd4f00bec33d994e275cc2a80737a7d591fe4d"/>
     <w:p>
       <w:pPr>
         <w:pStyle w:val="Heading2"/>
@@ -946,7 +946,7 @@
         <w:t xml:space="preserve"> </w:t>
       </w:r>
       <w:r>
-        <w:t xml:space="preserve">isolates also show ANI–synteny decoupling</w:t>
+        <w:t xml:space="preserve">isolates also show ANI–anchor-adjacency decoupling</w:t>
       </w:r>
     </w:p>
     <w:p>
@@ -971,13 +971,13 @@
         <w:pStyle w:val="BodyText"/>
       </w:pPr>
       <w:r>
-        <w:t xml:space="preserve">Left column: Syn2bANI ANI vs synteny score; right column: skani ANI vs the</w:t>
-      </w:r>
-      <w:r>
-        <w:t xml:space="preserve"> </w:t>
-      </w:r>
-      <w:r>
-        <w:t xml:space="preserve">same synteny score. (a,b) 12</w:t>
+        <w:t xml:space="preserve">Left column: Syn2bANI ANI vs anchor adjacency; right column: skani ANI vs the</w:t>
+      </w:r>
+      <w:r>
+        <w:t xml:space="preserve"> </w:t>
+      </w:r>
+      <w:r>
+        <w:t xml:space="preserve">same anchor adjacency. (a,b) 12</w:t>
       </w:r>
       <w:r>
         <w:t xml:space="preserve"> </w:t>
@@ -999,7 +999,7 @@
         <w:t xml:space="preserve"> </w:t>
       </w:r>
       <w:r>
-        <w:t xml:space="preserve">ANI &gt;99.9% have synteny scores 0.85–0.89 and up to 376 breakpoints. (c,d) 20</w:t>
+        <w:t xml:space="preserve">ANI &gt;99.9% have anchor adjacencies 0.85–0.89 and up to 376 breakpoints. (c,d) 20</w:t>
       </w:r>
       <w:r>
         <w:t xml:space="preserve"> </w:t>
@@ -1021,7 +1021,7 @@
         <w:t xml:space="preserve"> </w:t>
       </w:r>
       <w:r>
-        <w:t xml:space="preserve">synteny scores 0.89–0.96 and an average of ~1,980 breakpoints. The most</w:t>
+        <w:t xml:space="preserve">anchor adjacencies 0.89–0.96 and an average of ~1,980 breakpoints. The most</w:t>
       </w:r>
       <w:r>
         <w:t xml:space="preserve"> </w:t>
@@ -1169,7 +1169,7 @@
         <w:rPr>
           <w:rStyle w:val="VerbatimChar"/>
         </w:rPr>
-        <w:t xml:space="preserve">synteny_score</w:t>
+        <w:t xml:space="preserve">anchor_adjacency</w:t>
       </w:r>
       <w:r>
         <w:t xml:space="preserve"> </w:t>

</xml_diff>

<commit_message>
Regenerate all main and supplementary figures from data with publication style
- Add shared Nature Methods-compatible style module scripts/plot_style.py.
- Update Fig 5 SV validation: use raw_inverted_fraction for high-ANI panel (r=0.996).
- Rewrite Fig 6 ANI-SV discordance from all_high_ani_high_af_pairs.tsv.
- Add data-driven scripts for Fig 2, 3, 4, 7, 8.
- Add data-driven scripts for Supplementary Figures S1-S11 and regenerate S12.
- Fix supplementary figure numbering in manuscript (S9/S10, not S15/S16).
- Regenerate manuscript docx exports.
</commit_message>
<xml_diff>
--- a/paper/manuscript/SUPPLEMENTARY.docx
+++ b/paper/manuscript/SUPPLEMENTARY.docx
@@ -2,7 +2,7 @@
 <file path=word/document.xml><?xml version="1.0" encoding="utf-8"?>
 <w:document xmlns:w="http://schemas.openxmlformats.org/wordprocessingml/2006/main" xmlns:m="http://schemas.openxmlformats.org/officeDocument/2006/math" xmlns:r="http://schemas.openxmlformats.org/officeDocument/2006/relationships" xmlns:o="urn:schemas-microsoft-com:office:office" xmlns:v="urn:schemas-microsoft-com:vml" xmlns:w10="urn:schemas-microsoft-com:office:word" xmlns:a="http://schemas.openxmlformats.org/drawingml/2006/main" xmlns:pic="http://schemas.openxmlformats.org/drawingml/2006/picture" xmlns:wp="http://schemas.openxmlformats.org/drawingml/2006/wordprocessingDrawing">
   <w:body>
-    <w:bookmarkStart w:id="27" w:name="Xc3fcc6656da83e08d67075bda016bbdc5c3d5f9"/>
+    <w:bookmarkStart w:id="31" w:name="Xc3fcc6656da83e08d67075bda016bbdc5c3d5f9"/>
     <w:p>
       <w:pPr>
         <w:pStyle w:val="Heading1"/>
@@ -51,7 +51,7 @@
         <w:rPr>
           <w:rStyle w:val="VerbatimChar"/>
         </w:rPr>
-        <w:t xml:space="preserve">figures/report/fig_synteny_ladder.png</w:t>
+        <w:t xml:space="preserve">paper/figures/supplementary/fig_s1_synteny_ladder.png</w:t>
       </w:r>
       <w:r>
         <w:t xml:space="preserve">)</w:t>
@@ -120,13 +120,13 @@
       </w:r>
     </w:p>
     <w:bookmarkEnd w:id="9"/>
-    <w:bookmarkStart w:id="10" w:name="Xaf75ea201c68b3991c0a496ef9b243e8e5da9b8"/>
+    <w:bookmarkStart w:id="10" w:name="Xc212d59051500608a6a292fa9e7516d81d06b47"/>
     <w:p>
       <w:pPr>
         <w:pStyle w:val="Heading2"/>
       </w:pPr>
       <w:r>
-        <w:t xml:space="preserve">Supplementary Figure S2 — Held-out GTDB-R207 benchmark</w:t>
+        <w:t xml:space="preserve">Supplementary Figure S2 — Held-out GTDB-R207 benchmark (v5 detail)</w:t>
       </w:r>
     </w:p>
     <w:p>
@@ -140,7 +140,7 @@
         <w:rPr>
           <w:rStyle w:val="VerbatimChar"/>
         </w:rPr>
-        <w:t xml:space="preserve">figures/report/fig_gtdb50k_heldout.png</w:t>
+        <w:t xml:space="preserve">paper/figures/supplementary/fig_s2_gtdb50k_heldout.png</w:t>
       </w:r>
       <w:r>
         <w:t xml:space="preserve">)</w:t>
@@ -230,13 +230,13 @@
       </w:r>
     </w:p>
     <w:bookmarkEnd w:id="10"/>
-    <w:bookmarkStart w:id="11" w:name="X6e0b9eecebc3bbf314ac8a2bb7a52303cf3a9cc"/>
+    <w:bookmarkStart w:id="11" w:name="Xfcc31fb3a442a56c962a2b940984516d699f2a4"/>
     <w:p>
       <w:pPr>
         <w:pStyle w:val="Heading2"/>
       </w:pPr>
       <w:r>
-        <w:t xml:space="preserve">Supplementary Figure S3 — Unified GTDB-R207 80–100% benchmark</w:t>
+        <w:t xml:space="preserve">Supplementary Figure S3 — Per-band ANI comparison</w:t>
       </w:r>
     </w:p>
     <w:p>
@@ -250,7 +250,7 @@
         <w:rPr>
           <w:rStyle w:val="VerbatimChar"/>
         </w:rPr>
-        <w:t xml:space="preserve">figures/gtdb_r207_unified_benchmark.png</w:t>
+        <w:t xml:space="preserve">paper/figures/supplementary/fig_s3_anim_by_band.png</w:t>
       </w:r>
       <w:r>
         <w:t xml:space="preserve">)</w:t>
@@ -261,59 +261,19 @@
         <w:pStyle w:val="BodyText"/>
       </w:pPr>
       <w:r>
-        <w:t xml:space="preserve">43,334 held-out same-genus pairs (80–95% plus the 95–100% stratum split into</w:t>
-      </w:r>
-      <w:r>
-        <w:t xml:space="preserve"> </w:t>
-      </w:r>
-      <w:r>
-        <w:t xml:space="preserve">95–97 and 97–100 by truth) combined with 727 high-ANI test pairs sampled from</w:t>
-      </w:r>
-      <w:r>
-        <w:t xml:space="preserve"> </w:t>
-      </w:r>
-      <w:r>
-        <w:t xml:space="preserve">non-representative GTDB-R207 genomes. (a) Estimated vs ANIm truth for Syn2bANI</w:t>
-      </w:r>
-      <w:r>
-        <w:t xml:space="preserve"> </w:t>
-      </w:r>
-      <w:r>
-        <w:t xml:space="preserve">raw gated, Syn2bANI v6-calibrated, Syn2bANI hybrid (raw ≥98% / calibrated</w:t>
-      </w:r>
-      <w:r>
-        <w:t xml:space="preserve"> </w:t>
-      </w:r>
-      <w:r>
-        <w:t xml:space="preserve">&lt;98%), skani, and FastANI. (b) Per-band MAE. (c) Signed-error distributions.</w:t>
-      </w:r>
-      <w:r>
-        <w:t xml:space="preserve"> </w:t>
-      </w:r>
-      <w:r>
-        <w:t xml:space="preserve">(d) High-ANI zoom (95–100%). On the full 80–100% range the Syn2bANI hybrid</w:t>
-      </w:r>
-      <w:r>
-        <w:t xml:space="preserve"> </w:t>
-      </w:r>
-      <w:r>
-        <w:t xml:space="preserve">estimator attains the lowest overall MAE (</w:t>
-      </w:r>
-      <w:r>
-        <w:rPr>
-          <w:b/>
-          <w:bCs/>
-        </w:rPr>
-        <w:t xml:space="preserve">0.615</w:t>
-      </w:r>
-      <w:r>
-        <w:t xml:space="preserve">), while recovering the</w:t>
-      </w:r>
-      <w:r>
-        <w:t xml:space="preserve"> </w:t>
-      </w:r>
-      <w:r>
-        <w:t xml:space="preserve">accurate raw gated estimate in the 97–100% sub-band (MAE 0.23).</w:t>
+        <w:t xml:space="preserve">Band-holdout cross-validation on the 2,074-pair GTDB-R207 ANIm benchmark:</w:t>
+      </w:r>
+      <w:r>
+        <w:t xml:space="preserve"> </w:t>
+      </w:r>
+      <w:r>
+        <w:t xml:space="preserve">MAE by ANI band for raw gamma, calibrated v5, skani, and FastANI. This is the</w:t>
+      </w:r>
+      <w:r>
+        <w:t xml:space="preserve"> </w:t>
+      </w:r>
+      <w:r>
+        <w:t xml:space="preserve">per-band detail behind the unified benchmark of Fig. 3.</w:t>
       </w:r>
     </w:p>
     <w:bookmarkEnd w:id="11"/>
@@ -337,7 +297,7 @@
         <w:rPr>
           <w:rStyle w:val="VerbatimChar"/>
         </w:rPr>
-        <w:t xml:space="preserve">figures/report/gtdb_quality_vs_mae_combined.png</w:t>
+        <w:t xml:space="preserve">paper/figures/supplementary/fig_s4_gtdb_quality_vs_mae.png</w:t>
       </w:r>
       <w:r>
         <w:t xml:space="preserve">)</w:t>
@@ -406,13 +366,13 @@
       </w:r>
     </w:p>
     <w:bookmarkEnd w:id="12"/>
-    <w:bookmarkStart w:id="13" w:name="Xb9aadcf455a7400e875f71e07652b618a72b771"/>
+    <w:bookmarkStart w:id="13" w:name="X103d984b7b1b66b1ed5dd442b5fc71304f3b16a"/>
     <w:p>
       <w:pPr>
         <w:pStyle w:val="Heading2"/>
       </w:pPr>
       <w:r>
-        <w:t xml:space="preserve">Supplementary Figure S5 — Exact-truth indel ladder and indel sweep</w:t>
+        <w:t xml:space="preserve">Supplementary Figure S5 — GC coverage ladder</w:t>
       </w:r>
     </w:p>
     <w:p>
@@ -426,7 +386,7 @@
         <w:rPr>
           <w:rStyle w:val="VerbatimChar"/>
         </w:rPr>
-        <w:t xml:space="preserve">figures/report/fig_s5_simulation_indel.png</w:t>
+        <w:t xml:space="preserve">paper/figures/supplementary/fig_s5_simulation_gc.png</w:t>
       </w:r>
       <w:r>
         <w:t xml:space="preserve">)</w:t>
@@ -434,14 +394,16 @@
     </w:p>
     <w:p>
       <w:pPr>
-        <w:pStyle w:val="Compact"/>
-        <w:numPr>
-          <w:ilvl w:val="0"/>
-          <w:numId w:val="1001"/>
-        </w:numPr>
-      </w:pPr>
-      <w:r>
-        <w:t xml:space="preserve">ANI ladder evolved from</w:t>
+        <w:pStyle w:val="BodyText"/>
+      </w:pPr>
+      <w:r>
+        <w:t xml:space="preserve">Substitution ladders evolved on five real template genomes spanning GC</w:t>
+      </w:r>
+      <w:r>
+        <w:t xml:space="preserve"> </w:t>
+      </w:r>
+      <w:r>
+        <w:t xml:space="preserve">27.2–72.1%. Syn2bANI error is 0.074–0.356 ANI points and is</w:t>
       </w:r>
       <w:r>
         <w:t xml:space="preserve"> </w:t>
@@ -451,172 +413,219 @@
           <w:i/>
           <w:iCs/>
         </w:rPr>
-        <w:t xml:space="preserve">E. coli</w:t>
-      </w:r>
-      <w:r>
-        <w:t xml:space="preserve"> </w:t>
-      </w:r>
-      <w:r>
-        <w:t xml:space="preserve">K-12 MG1655 at 85.0–99.9% true ANI with</w:t>
-      </w:r>
-      <w:r>
-        <w:t xml:space="preserve"> </w:t>
-      </w:r>
-      <w:r>
-        <w:t xml:space="preserve">a 400 kb inversion plus ~1 deletion per 100 kb; Syn2bANI (4-enzyme panel) MAE</w:t>
-      </w:r>
-      <w:r>
-        <w:t xml:space="preserve"> </w:t>
-      </w:r>
-      <w:r>
-        <w:t xml:space="preserve">= 0.073 ANI points. (b) Indel sweep at fixed true ANI 95.000 with 0–4 deletions</w:t>
-      </w:r>
-      <w:r>
-        <w:t xml:space="preserve"> </w:t>
-      </w:r>
-      <w:r>
-        <w:t xml:space="preserve">per 100 kb; error stays between +0.032 and +0.184 (MAE 0.081). Gamma and</w:t>
-      </w:r>
-      <w:r>
-        <w:t xml:space="preserve"> </w:t>
-      </w:r>
-      <w:r>
-        <w:t xml:space="preserve">uniform estimates are identical on uniform-rate data.</w:t>
-      </w:r>
-    </w:p>
-    <w:bookmarkEnd w:id="13"/>
-    <w:bookmarkStart w:id="14" w:name="X9219aba7d48231b41a1133743bdf123496fe817"/>
-    <w:p>
-      <w:pPr>
-        <w:pStyle w:val="Heading2"/>
-      </w:pPr>
-      <w:r>
-        <w:t xml:space="preserve">Supplementary Figure S6 — GC coverage ladder</w:t>
-      </w:r>
-    </w:p>
-    <w:p>
-      <w:pPr>
-        <w:pStyle w:val="FirstParagraph"/>
-      </w:pPr>
-      <w:r>
-        <w:t xml:space="preserve">(</w:t>
-      </w:r>
-      <w:r>
-        <w:rPr>
-          <w:rStyle w:val="VerbatimChar"/>
-        </w:rPr>
-        <w:t xml:space="preserve">figures/report/fig_s6_simulation_gc.png</w:t>
-      </w:r>
-      <w:r>
-        <w:t xml:space="preserve">)</w:t>
-      </w:r>
-    </w:p>
-    <w:p>
-      <w:pPr>
-        <w:pStyle w:val="BodyText"/>
-      </w:pPr>
-      <w:r>
-        <w:t xml:space="preserve">Substitution ladders evolved on five real template genomes spanning GC</w:t>
-      </w:r>
-      <w:r>
-        <w:t xml:space="preserve"> </w:t>
-      </w:r>
-      <w:r>
-        <w:t xml:space="preserve">27.2–72.1%. Syn2bANI error is 0.074–0.356 ANI points and is</w:t>
-      </w:r>
-      <w:r>
-        <w:t xml:space="preserve"> </w:t>
+        <w:t xml:space="preserve">not</w:t>
+      </w:r>
+      <w:r>
+        <w:t xml:space="preserve"> </w:t>
+      </w:r>
+      <w:r>
+        <w:t xml:space="preserve">monotone in</w:t>
+      </w:r>
+      <w:r>
+        <w:t xml:space="preserve"> </w:t>
+      </w:r>
+      <w:r>
+        <w:t xml:space="preserve">GC; the worst genome (</w:t>
       </w:r>
       <w:r>
         <w:rPr>
           <w:i/>
           <w:iCs/>
         </w:rPr>
-        <w:t xml:space="preserve">not</w:t>
-      </w:r>
-      <w:r>
-        <w:t xml:space="preserve"> </w:t>
-      </w:r>
-      <w:r>
-        <w:t xml:space="preserve">monotone in</w:t>
-      </w:r>
-      <w:r>
-        <w:t xml:space="preserve"> </w:t>
-      </w:r>
-      <w:r>
-        <w:t xml:space="preserve">GC; the worst genome (</w:t>
+        <w:t xml:space="preserve">B. longum</w:t>
+      </w:r>
+      <w:r>
+        <w:t xml:space="preserve">, GC 60.1%) sits mid-range.</w:t>
+      </w:r>
+    </w:p>
+    <w:bookmarkEnd w:id="13"/>
+    <w:bookmarkStart w:id="14" w:name="X666e434bde45df385021466176a192bfa919e50"/>
+    <w:p>
+      <w:pPr>
+        <w:pStyle w:val="Heading2"/>
+      </w:pPr>
+      <w:r>
+        <w:t xml:space="preserve">Supplementary Figure S6 — Mosaic/rate-heterogeneity family</w:t>
+      </w:r>
+    </w:p>
+    <w:p>
+      <w:pPr>
+        <w:pStyle w:val="FirstParagraph"/>
+      </w:pPr>
+      <w:r>
+        <w:t xml:space="preserve">(</w:t>
+      </w:r>
+      <w:r>
+        <w:rPr>
+          <w:rStyle w:val="VerbatimChar"/>
+        </w:rPr>
+        <w:t xml:space="preserve">paper/figures/supplementary/fig_s6_simulation_mosaic.png</w:t>
+      </w:r>
+      <w:r>
+        <w:t xml:space="preserve">)</w:t>
+      </w:r>
+    </w:p>
+    <w:p>
+      <w:pPr>
+        <w:pStyle w:val="BodyText"/>
+      </w:pPr>
+      <w:r>
+        <w:t xml:space="preserve">Per-block divergence rates sampled from Gamma(α, α) with α = 0.5/1/2 (mean</w:t>
+      </w:r>
+      <w:r>
+        <w:t xml:space="preserve"> </w:t>
+      </w:r>
+      <w:r>
+        <w:t xml:space="preserve">ANI 90–98) and deliberately misspecified bimodal 50/70%-core cases. The gamma</w:t>
+      </w:r>
+      <w:r>
+        <w:t xml:space="preserve"> </w:t>
+      </w:r>
+      <w:r>
+        <w:t xml:space="preserve">estimator reduces error relative to the uniform estimator (e.g., gamma MAE</w:t>
+      </w:r>
+      <w:r>
+        <w:t xml:space="preserve"> </w:t>
+      </w:r>
+      <w:r>
+        <w:t xml:space="preserve">1.35 vs uniform 2.75 on gamma regimes), but residual bias remains on bimodal</w:t>
+      </w:r>
+      <w:r>
+        <w:t xml:space="preserve"> </w:t>
+      </w:r>
+      <w:r>
+        <w:t xml:space="preserve">misspecification (gamma MAE 2.43 vs uniform 3.42), motivating the real-genome</w:t>
+      </w:r>
+      <w:r>
+        <w:t xml:space="preserve"> </w:t>
+      </w:r>
+      <w:r>
+        <w:t xml:space="preserve">ridge calibration of Results 2.5.</w:t>
+      </w:r>
+    </w:p>
+    <w:bookmarkEnd w:id="14"/>
+    <w:bookmarkStart w:id="15" w:name="Xc411bf5e54ec307f23dd8b9e5c1815c33f67f91"/>
+    <w:p>
+      <w:pPr>
+        <w:pStyle w:val="Heading2"/>
+      </w:pPr>
+      <w:r>
+        <w:t xml:space="preserve">Supplementary Figure S7 — Accuracy on 695 CAMI2 MAGs</w:t>
+      </w:r>
+    </w:p>
+    <w:p>
+      <w:pPr>
+        <w:pStyle w:val="FirstParagraph"/>
+      </w:pPr>
+      <w:r>
+        <w:t xml:space="preserve">(</w:t>
+      </w:r>
+      <w:r>
+        <w:rPr>
+          <w:rStyle w:val="VerbatimChar"/>
+        </w:rPr>
+        <w:t xml:space="preserve">paper/figures/supplementary/fig_s7_mag_validation.png</w:t>
+      </w:r>
+      <w:r>
+        <w:t xml:space="preserve">)</w:t>
+      </w:r>
+    </w:p>
+    <w:p>
+      <w:pPr>
+        <w:pStyle w:val="BodyText"/>
+      </w:pPr>
+      <w:r>
+        <w:t xml:space="preserve">695 CAMI2 bins vs dnadiff ANIm truth (raw gated syn2bani; skani; FastANI).</w:t>
+      </w:r>
+      <w:r>
+        <w:t xml:space="preserve"> </w:t>
+      </w:r>
+      <w:r>
+        <w:t xml:space="preserve">(a) Syn2bANI raw gated estimate vs dnadiff ANIm truth, colored by contamination</w:t>
+      </w:r>
+      <w:r>
+        <w:t xml:space="preserve"> </w:t>
+      </w:r>
+      <w:r>
+        <w:t xml:space="preserve">class. (b) Absolute-error distributions by tool. (c) Syn2bANI error by CheckM2</w:t>
+      </w:r>
+      <w:r>
+        <w:t xml:space="preserve"> </w:t>
+      </w:r>
+      <w:r>
+        <w:t xml:space="preserve">quality tier.</w:t>
+      </w:r>
+    </w:p>
+    <w:bookmarkEnd w:id="15"/>
+    <w:bookmarkStart w:id="16" w:name="X395fcc4879aa2caa98aa8b4904a4197641f6244"/>
+    <w:p>
+      <w:pPr>
+        <w:pStyle w:val="Heading2"/>
+      </w:pPr>
+      <w:r>
+        <w:t xml:space="preserve">Supplementary Figure S8 — High-ANI isolate collections show extensive rearrangements</w:t>
+      </w:r>
+    </w:p>
+    <w:p>
+      <w:pPr>
+        <w:pStyle w:val="FirstParagraph"/>
+      </w:pPr>
+      <w:r>
+        <w:t xml:space="preserve">(</w:t>
+      </w:r>
+      <w:r>
+        <w:rPr>
+          <w:rStyle w:val="VerbatimChar"/>
+        </w:rPr>
+        <w:t xml:space="preserve">paper/figures/supplementary/fig_s8_syntracker_breakpoints.png</w:t>
+      </w:r>
+      <w:r>
+        <w:t xml:space="preserve">)</w:t>
+      </w:r>
+    </w:p>
+    <w:p>
+      <w:pPr>
+        <w:pStyle w:val="BodyText"/>
+      </w:pPr>
+      <w:r>
+        <w:t xml:space="preserve">skani ANI versus Syn2bANI</w:t>
+      </w:r>
+      <w:r>
+        <w:t xml:space="preserve"> </w:t>
+      </w:r>
+      <w:r>
+        <w:rPr>
+          <w:rStyle w:val="VerbatimChar"/>
+        </w:rPr>
+        <w:t xml:space="preserve">breakpoint_count</w:t>
+      </w:r>
+      <w:r>
+        <w:t xml:space="preserve"> </w:t>
+      </w:r>
+      <w:r>
+        <w:t xml:space="preserve">for four published near-clonal</w:t>
+      </w:r>
+      <w:r>
+        <w:t xml:space="preserve"> </w:t>
+      </w:r>
+      <w:r>
+        <w:t xml:space="preserve">isolate collections: (a)</w:t>
+      </w:r>
+      <w:r>
+        <w:t xml:space="preserve"> </w:t>
       </w:r>
       <w:r>
         <w:rPr>
           <w:i/>
           <w:iCs/>
         </w:rPr>
-        <w:t xml:space="preserve">B. longum</w:t>
-      </w:r>
-      <w:r>
-        <w:t xml:space="preserve">, GC 60.1%) sits mid-range. The GC sweep</w:t>
-      </w:r>
-      <w:r>
-        <w:t xml:space="preserve"> </w:t>
-      </w:r>
-      <w:r>
-        <w:t xml:space="preserve">source genomes are not present in the repository, so this panel reproduces the</w:t>
-      </w:r>
-      <w:r>
-        <w:t xml:space="preserve"> </w:t>
-      </w:r>
-      <w:r>
-        <w:t xml:space="preserve">historical 4-enzyme sweep reported in</w:t>
-      </w:r>
-      <w:r>
-        <w:t xml:space="preserve"> </w:t>
-      </w:r>
-      <w:r>
-        <w:rPr>
-          <w:rStyle w:val="VerbatimChar"/>
-        </w:rPr>
-        <w:t xml:space="preserve">ALGORITHM_MLE.md</w:t>
-      </w:r>
-      <w:r>
-        <w:t xml:space="preserve"> </w:t>
-      </w:r>
-      <w:r>
-        <w:t xml:space="preserve">§4.8.</w:t>
-      </w:r>
-    </w:p>
-    <w:bookmarkEnd w:id="14"/>
-    <w:bookmarkStart w:id="15" w:name="X61eb234984ace44e0cbdb79e3b450674d3917ff"/>
-    <w:p>
-      <w:pPr>
-        <w:pStyle w:val="Heading2"/>
-      </w:pPr>
-      <w:r>
-        <w:t xml:space="preserve">Supplementary Figure S7 — Simulated fragmentation</w:t>
-      </w:r>
-    </w:p>
-    <w:p>
-      <w:pPr>
-        <w:pStyle w:val="FirstParagraph"/>
-      </w:pPr>
-      <w:r>
-        <w:t xml:space="preserve">(</w:t>
-      </w:r>
-      <w:r>
-        <w:rPr>
-          <w:rStyle w:val="VerbatimChar"/>
-        </w:rPr>
-        <w:t xml:space="preserve">figures/report/fig_s7_simulation_fragment.png</w:t>
-      </w:r>
-      <w:r>
-        <w:t xml:space="preserve">)</w:t>
-      </w:r>
-    </w:p>
-    <w:p>
-      <w:pPr>
-        <w:pStyle w:val="BodyText"/>
-      </w:pPr>
-      <w:r>
-        <w:t xml:space="preserve">A 95% ANI</w:t>
+        <w:t xml:space="preserve">E. coli</w:t>
+      </w:r>
+      <w:r>
+        <w:t xml:space="preserve"> </w:t>
+      </w:r>
+      <w:r>
+        <w:t xml:space="preserve">hypermutator (253 pairs), (b)</w:t>
       </w:r>
       <w:r>
         <w:t xml:space="preserve"> </w:t>
@@ -626,223 +635,13 @@
           <w:i/>
           <w:iCs/>
         </w:rPr>
-        <w:t xml:space="preserve">E. coli</w:t>
-      </w:r>
-      <w:r>
-        <w:t xml:space="preserve"> </w:t>
-      </w:r>
-      <w:r>
-        <w:t xml:space="preserve">query was fragmented into 20–201 contigs (~50%</w:t>
-      </w:r>
-      <w:r>
-        <w:t xml:space="preserve"> </w:t>
-      </w:r>
-      <w:r>
-        <w:t xml:space="preserve">reverse-complemented, order shuffled, no sequence lost). Syn2bANI error is</w:t>
-      </w:r>
-      <w:r>
-        <w:t xml:space="preserve"> </w:t>
-      </w:r>
-      <w:r>
-        <w:t xml:space="preserve">0.018–0.179 (MAE 0.070), confirming that random fragmentation per se does not</w:t>
-      </w:r>
-      <w:r>
-        <w:t xml:space="preserve"> </w:t>
-      </w:r>
-      <w:r>
-        <w:t xml:space="preserve">bias the chain-restricted MLE. Real assemblies below ~20 kb N50 behave</w:t>
-      </w:r>
-      <w:r>
-        <w:t xml:space="preserve"> </w:t>
-      </w:r>
-      <w:r>
-        <w:t xml:space="preserve">differently because they lose sequence at repeat boundaries; see Results 2.3</w:t>
-      </w:r>
-      <w:r>
-        <w:t xml:space="preserve"> </w:t>
-      </w:r>
-      <w:r>
-        <w:t xml:space="preserve">and Fig. 10c.</w:t>
-      </w:r>
-    </w:p>
-    <w:bookmarkEnd w:id="15"/>
-    <w:bookmarkStart w:id="16" w:name="X255f769d9dfa38e9ab64bc08df98141a49fdfa6"/>
-    <w:p>
-      <w:pPr>
-        <w:pStyle w:val="Heading2"/>
-      </w:pPr>
-      <w:r>
-        <w:t xml:space="preserve">Supplementary Figure S8 — Accessory-content confound</w:t>
-      </w:r>
-    </w:p>
-    <w:p>
-      <w:pPr>
-        <w:pStyle w:val="FirstParagraph"/>
-      </w:pPr>
-      <w:r>
-        <w:t xml:space="preserve">(</w:t>
-      </w:r>
-      <w:r>
-        <w:rPr>
-          <w:rStyle w:val="VerbatimChar"/>
-        </w:rPr>
-        <w:t xml:space="preserve">figures/report/fig_s8_simulation_accessory.png</w:t>
-      </w:r>
-      <w:r>
-        <w:t xml:space="preserve">)</w:t>
-      </w:r>
-    </w:p>
-    <w:p>
-      <w:pPr>
-        <w:pStyle w:val="BodyText"/>
-      </w:pPr>
-      <w:r>
-        <w:t xml:space="preserve">Core ANI fixed at 95.000 with 0–50% of the genome replaced by</w:t>
-      </w:r>
-      <w:r>
-        <w:t xml:space="preserve"> </w:t>
-      </w:r>
-      <w:r>
-        <w:t xml:space="preserve">composition-preserving, homology-destroying shuffled blocks. (a) ANI estimate</w:t>
-      </w:r>
-      <w:r>
-        <w:t xml:space="preserve"> </w:t>
-      </w:r>
-      <w:r>
-        <w:t xml:space="preserve">remains flat across accessory fractions (+0.044 to +0.250, MAE 0.112) because</w:t>
-      </w:r>
-      <w:r>
-        <w:t xml:space="preserve"> </w:t>
-      </w:r>
-      <w:r>
-        <w:t xml:space="preserve">only tags inside chains contribute to the likelihood. (b)</w:t>
-      </w:r>
-      <w:r>
-        <w:t xml:space="preserve"> </w:t>
-      </w:r>
-      <w:r>
-        <w:rPr>
-          <w:rStyle w:val="VerbatimChar"/>
-        </w:rPr>
-        <w:t xml:space="preserve">af_query</w:t>
-      </w:r>
-      <w:r>
-        <w:t xml:space="preserve"> </w:t>
-      </w:r>
-      <w:r>
-        <w:t xml:space="preserve">tracks</w:t>
-      </w:r>
-      <w:r>
-        <w:t xml:space="preserve"> </w:t>
-      </w:r>
-      <w:r>
-        <w:t xml:space="preserve">the true shared fraction (1 − F) to within 0.004, demonstrating the decoupling</w:t>
-      </w:r>
-      <w:r>
-        <w:t xml:space="preserve"> </w:t>
-      </w:r>
-      <w:r>
-        <w:t xml:space="preserve">of divergence and shared-content estimates.</w:t>
-      </w:r>
-    </w:p>
-    <w:bookmarkEnd w:id="16"/>
-    <w:bookmarkStart w:id="17" w:name="Xb1b4e0d6fb143f378a2ff2503f4916df308316e"/>
-    <w:p>
-      <w:pPr>
-        <w:pStyle w:val="Heading2"/>
-      </w:pPr>
-      <w:r>
-        <w:t xml:space="preserve">Supplementary Figure S9 — Mosaic/rate-heterogeneity family</w:t>
-      </w:r>
-    </w:p>
-    <w:p>
-      <w:pPr>
-        <w:pStyle w:val="FirstParagraph"/>
-      </w:pPr>
-      <w:r>
-        <w:t xml:space="preserve">(</w:t>
-      </w:r>
-      <w:r>
-        <w:rPr>
-          <w:rStyle w:val="VerbatimChar"/>
-        </w:rPr>
-        <w:t xml:space="preserve">figures/report/fig_s9_simulation_mosaic.png</w:t>
-      </w:r>
-      <w:r>
-        <w:t xml:space="preserve">)</w:t>
-      </w:r>
-    </w:p>
-    <w:p>
-      <w:pPr>
-        <w:pStyle w:val="BodyText"/>
-      </w:pPr>
-      <w:r>
-        <w:t xml:space="preserve">Per-block divergence rates sampled from Gamma(α, α) with α = 0.5/1/2 (mean</w:t>
-      </w:r>
-      <w:r>
-        <w:t xml:space="preserve"> </w:t>
-      </w:r>
-      <w:r>
-        <w:t xml:space="preserve">ANI 90–98) and deliberately misspecified bimodal 50/70%-core cases. The gamma</w:t>
-      </w:r>
-      <w:r>
-        <w:t xml:space="preserve"> </w:t>
-      </w:r>
-      <w:r>
-        <w:t xml:space="preserve">estimator reduces error relative to the uniform estimator (e.g., gamma MAE</w:t>
-      </w:r>
-      <w:r>
-        <w:t xml:space="preserve"> </w:t>
-      </w:r>
-      <w:r>
-        <w:t xml:space="preserve">1.35 vs uniform 2.75 on gamma regimes), but residual bias remains on bimodal</w:t>
-      </w:r>
-      <w:r>
-        <w:t xml:space="preserve"> </w:t>
-      </w:r>
-      <w:r>
-        <w:t xml:space="preserve">misspecification (gamma MAE 2.43 vs uniform 3.42), motivating the real-genome</w:t>
-      </w:r>
-      <w:r>
-        <w:t xml:space="preserve"> </w:t>
-      </w:r>
-      <w:r>
-        <w:t xml:space="preserve">ridge calibration of Results 2.5.</w:t>
-      </w:r>
-    </w:p>
-    <w:bookmarkEnd w:id="17"/>
-    <w:bookmarkStart w:id="18" w:name="Xe1cceedd7fe263e162e74e3896e191392fdf8fb"/>
-    <w:p>
-      <w:pPr>
-        <w:pStyle w:val="Heading2"/>
-      </w:pPr>
-      <w:r>
-        <w:t xml:space="preserve">Supplementary Figure S10 — Breakpoint counts scale independently of ANI in high-ANI isolate collections</w:t>
-      </w:r>
-    </w:p>
-    <w:p>
-      <w:pPr>
-        <w:pStyle w:val="FirstParagraph"/>
-      </w:pPr>
-      <w:r>
-        <w:t xml:space="preserve">(</w:t>
-      </w:r>
-      <w:r>
-        <w:rPr>
-          <w:rStyle w:val="VerbatimChar"/>
-        </w:rPr>
-        <w:t xml:space="preserve">figures/syntracker_validation/syntracker_breakpoints_vs_ani.png</w:t>
-      </w:r>
-      <w:r>
-        <w:t xml:space="preserve">)</w:t>
-      </w:r>
-    </w:p>
-    <w:p>
-      <w:pPr>
-        <w:pStyle w:val="BodyText"/>
-      </w:pPr>
-      <w:r>
-        <w:t xml:space="preserve">Syn2bANI ANI versus breakpoint count for (a)</w:t>
+        <w:t xml:space="preserve">H. pylori</w:t>
+      </w:r>
+      <w:r>
+        <w:t xml:space="preserve"> </w:t>
+      </w:r>
+      <w:r>
+        <w:t xml:space="preserve">(2,926 pairs), (c)</w:t>
       </w:r>
       <w:r>
         <w:t xml:space="preserve"> </w:t>
@@ -852,19 +651,13 @@
           <w:i/>
           <w:iCs/>
         </w:rPr>
-        <w:t xml:space="preserve">E. coli</w:t>
-      </w:r>
-      <w:r>
-        <w:t xml:space="preserve"> </w:t>
-      </w:r>
-      <w:r>
-        <w:t xml:space="preserve">hypermutator (23</w:t>
-      </w:r>
-      <w:r>
-        <w:t xml:space="preserve"> </w:t>
-      </w:r>
-      <w:r>
-        <w:t xml:space="preserve">isolates, 253 pairs) and (b)</w:t>
+        <w:t xml:space="preserve">N. gonorrhoeae</w:t>
+      </w:r>
+      <w:r>
+        <w:t xml:space="preserve"> </w:t>
+      </w:r>
+      <w:r>
+        <w:t xml:space="preserve">(66 pairs), and (d)</w:t>
       </w:r>
       <w:r>
         <w:t xml:space="preserve"> </w:t>
@@ -874,47 +667,35 @@
           <w:i/>
           <w:iCs/>
         </w:rPr>
-        <w:t xml:space="preserve">H. pylori</w:t>
-      </w:r>
-      <w:r>
-        <w:t xml:space="preserve"> </w:t>
-      </w:r>
-      <w:r>
-        <w:t xml:space="preserve">(77 isolates, 2,926 pairs). In both</w:t>
-      </w:r>
-      <w:r>
-        <w:t xml:space="preserve"> </w:t>
-      </w:r>
-      <w:r>
-        <w:t xml:space="preserve">collections ANI is pinned near 100% while breakpoint counts vary over more</w:t>
-      </w:r>
-      <w:r>
-        <w:t xml:space="preserve"> </w:t>
-      </w:r>
-      <w:r>
-        <w:t xml:space="preserve">than an order of magnitude, illustrating that rearrangement burden is not</w:t>
-      </w:r>
-      <w:r>
-        <w:t xml:space="preserve"> </w:t>
-      </w:r>
-      <w:r>
-        <w:t xml:space="preserve">captured by the divergence scalar. Annotated points are the top discordant</w:t>
-      </w:r>
-      <w:r>
-        <w:t xml:space="preserve"> </w:t>
-      </w:r>
-      <w:r>
-        <w:t xml:space="preserve">cases by ANI–synteny rank difference.</w:t>
-      </w:r>
-    </w:p>
-    <w:bookmarkEnd w:id="18"/>
-    <w:bookmarkStart w:id="19" w:name="Xbfd4f00bec33d994e275cc2a80737a7d591fe4d"/>
+        <w:t xml:space="preserve">S. rimosus</w:t>
+      </w:r>
+      <w:r>
+        <w:t xml:space="preserve"> </w:t>
+      </w:r>
+      <w:r>
+        <w:t xml:space="preserve">(190</w:t>
+      </w:r>
+      <w:r>
+        <w:t xml:space="preserve"> </w:t>
+      </w:r>
+      <w:r>
+        <w:t xml:space="preserve">pairs). In all four collections ANI is pinned near 100% while breakpoint counts</w:t>
+      </w:r>
+      <w:r>
+        <w:t xml:space="preserve"> </w:t>
+      </w:r>
+      <w:r>
+        <w:t xml:space="preserve">vary over orders of magnitude.</w:t>
+      </w:r>
+    </w:p>
+    <w:bookmarkEnd w:id="16"/>
+    <w:bookmarkStart w:id="17" w:name="X0901c4e02efe3f664fe55d0ba0a51784ec0ccd3"/>
     <w:p>
       <w:pPr>
         <w:pStyle w:val="Heading2"/>
       </w:pPr>
       <w:r>
-        <w:t xml:space="preserve">Supplementary Figure S11 — Near-clonal</w:t>
+        <w:t xml:space="preserve">Supplementary Figure S9 — High-ANI</w:t>
       </w:r>
       <w:r>
         <w:t xml:space="preserve"> </w:t>
@@ -924,13 +705,66 @@
           <w:i/>
           <w:iCs/>
         </w:rPr>
-        <w:t xml:space="preserve">Neisseria gonorrhoeae</w:t>
-      </w:r>
-      <w:r>
-        <w:t xml:space="preserve"> </w:t>
-      </w:r>
-      <w:r>
-        <w:t xml:space="preserve">and</w:t>
+        <w:t xml:space="preserve">E. coli</w:t>
+      </w:r>
+      <w:r>
+        <w:t xml:space="preserve"> </w:t>
+      </w:r>
+      <w:r>
+        <w:t xml:space="preserve">O157:H7 pairs carry hundreds of breakpoints</w:t>
+      </w:r>
+    </w:p>
+    <w:p>
+      <w:pPr>
+        <w:pStyle w:val="FirstParagraph"/>
+      </w:pPr>
+      <w:r>
+        <w:t xml:space="preserve">(</w:t>
+      </w:r>
+      <w:r>
+        <w:rPr>
+          <w:rStyle w:val="VerbatimChar"/>
+        </w:rPr>
+        <w:t xml:space="preserve">paper/figures/supplementary/fig_s9_ecoli_o157_breakpoints.png</w:t>
+      </w:r>
+      <w:r>
+        <w:t xml:space="preserve">)</w:t>
+      </w:r>
+    </w:p>
+    <w:p>
+      <w:pPr>
+        <w:pStyle w:val="BodyText"/>
+      </w:pPr>
+      <w:r>
+        <w:t xml:space="preserve">Seventy-four genomes from Fitzgerald et al. (2021), 2,701 non-self pairs.</w:t>
+      </w:r>
+      <w:r>
+        <w:t xml:space="preserve"> </w:t>
+      </w:r>
+      <w:r>
+        <w:t xml:space="preserve">(a) ANI vs breakpoint count colored by lineage (I/II, II, Ia, Ic). (b) Same</w:t>
+      </w:r>
+      <w:r>
+        <w:t xml:space="preserve"> </w:t>
+      </w:r>
+      <w:r>
+        <w:t xml:space="preserve">data colored by host category (bovine, human, other/unknown). All pairwise ANIs</w:t>
+      </w:r>
+      <w:r>
+        <w:t xml:space="preserve"> </w:t>
+      </w:r>
+      <w:r>
+        <w:t xml:space="preserve">exceed 99.886% yet breakpoints range from 171 to &gt;1,100.</w:t>
+      </w:r>
+    </w:p>
+    <w:bookmarkEnd w:id="17"/>
+    <w:bookmarkStart w:id="18" w:name="X3f3356e481db4642ed3127a5f0205142ae48f68"/>
+    <w:p>
+      <w:pPr>
+        <w:pStyle w:val="Heading2"/>
+      </w:pPr>
+      <w:r>
+        <w:t xml:space="preserve">Supplementary Figure S10 — High-ANI FDA-ARGOS</w:t>
       </w:r>
       <w:r>
         <w:t xml:space="preserve"> </w:t>
@@ -940,13 +774,13 @@
           <w:i/>
           <w:iCs/>
         </w:rPr>
-        <w:t xml:space="preserve">Streptomyces rimosus</w:t>
-      </w:r>
-      <w:r>
-        <w:t xml:space="preserve"> </w:t>
-      </w:r>
-      <w:r>
-        <w:t xml:space="preserve">isolates also show ANI–anchor-adjacency decoupling</w:t>
+        <w:t xml:space="preserve">Staphylococcus aureus</w:t>
+      </w:r>
+      <w:r>
+        <w:t xml:space="preserve"> </w:t>
+      </w:r>
+      <w:r>
+        <w:t xml:space="preserve">pairs show wide breakpoint variation</w:t>
       </w:r>
     </w:p>
     <w:p>
@@ -960,7 +794,7 @@
         <w:rPr>
           <w:rStyle w:val="VerbatimChar"/>
         </w:rPr>
-        <w:t xml:space="preserve">figures/syntracker_validation/syntracker_supp_ngonorrhoeae_srimosus.png</w:t>
+        <w:t xml:space="preserve">paper/figures/supplementary/fig_s10_saureus_breakpoints.png</w:t>
       </w:r>
       <w:r>
         <w:t xml:space="preserve">)</w:t>
@@ -971,13 +805,66 @@
         <w:pStyle w:val="BodyText"/>
       </w:pPr>
       <w:r>
-        <w:t xml:space="preserve">Left column: Syn2bANI ANI vs anchor adjacency; right column: skani ANI vs the</w:t>
-      </w:r>
-      <w:r>
-        <w:t xml:space="preserve"> </w:t>
-      </w:r>
-      <w:r>
-        <w:t xml:space="preserve">same anchor adjacency. (a,b) 12</w:t>
+        <w:t xml:space="preserve">One hundred and twenty-two genomes, 7,381 refined pairs. (a) ANI vs breakpoint</w:t>
+      </w:r>
+      <w:r>
+        <w:t xml:space="preserve"> </w:t>
+      </w:r>
+      <w:r>
+        <w:t xml:space="preserve">count colored by country. (b) ANI vs breakpoint count colored by isolation</w:t>
+      </w:r>
+      <w:r>
+        <w:t xml:space="preserve"> </w:t>
+      </w:r>
+      <w:r>
+        <w:t xml:space="preserve">source. Pairs at 100% ANI still carry &gt;150 breakpoints.</w:t>
+      </w:r>
+    </w:p>
+    <w:bookmarkEnd w:id="18"/>
+    <w:bookmarkStart w:id="19" w:name="X96c66ff84af8c6054de30314d30f5f9915940f7"/>
+    <w:p>
+      <w:pPr>
+        <w:pStyle w:val="Heading2"/>
+      </w:pPr>
+      <w:r>
+        <w:t xml:space="preserve">Supplementary Figure S11 — cagPAI extended state by country and phylogenetic population</w:t>
+      </w:r>
+    </w:p>
+    <w:p>
+      <w:pPr>
+        <w:pStyle w:val="FirstParagraph"/>
+      </w:pPr>
+      <w:r>
+        <w:t xml:space="preserve">(</w:t>
+      </w:r>
+      <w:r>
+        <w:rPr>
+          <w:rStyle w:val="VerbatimChar"/>
+        </w:rPr>
+        <w:t xml:space="preserve">paper/figures/supplementary/fig_s11_cagpai_country_population.png</w:t>
+      </w:r>
+      <w:r>
+        <w:t xml:space="preserve">)</w:t>
+      </w:r>
+    </w:p>
+    <w:p>
+      <w:pPr>
+        <w:pStyle w:val="BodyText"/>
+      </w:pPr>
+      <w:r>
+        <w:t xml:space="preserve">Stacked-bar distribution of extended cagPAI states (after circular-origin</w:t>
+      </w:r>
+      <w:r>
+        <w:t xml:space="preserve"> </w:t>
+      </w:r>
+      <w:r>
+        <w:t xml:space="preserve">filtering) across countries of isolation and phylogenetic population for the</w:t>
+      </w:r>
+      <w:r>
+        <w:t xml:space="preserve"> </w:t>
+      </w:r>
+      <w:r>
+        <w:t xml:space="preserve">528</w:t>
       </w:r>
       <w:r>
         <w:t xml:space="preserve"> </w:t>
@@ -987,19 +874,23 @@
           <w:i/>
           <w:iCs/>
         </w:rPr>
-        <w:t xml:space="preserve">N. gonorrhoeae</w:t>
-      </w:r>
-      <w:r>
-        <w:t xml:space="preserve"> </w:t>
-      </w:r>
-      <w:r>
-        <w:t xml:space="preserve">isolates (66 pairs); pairs with</w:t>
-      </w:r>
-      <w:r>
-        <w:t xml:space="preserve"> </w:t>
-      </w:r>
-      <w:r>
-        <w:t xml:space="preserve">ANI &gt;99.9% have anchor adjacencies 0.85–0.89 and up to 376 breakpoints. (c,d) 20</w:t>
+        <w:t xml:space="preserve">H. pylori</w:t>
+      </w:r>
+      <w:r>
+        <w:t xml:space="preserve"> </w:t>
+      </w:r>
+      <w:r>
+        <w:t xml:space="preserve">cohort genomes.</w:t>
+      </w:r>
+    </w:p>
+    <w:bookmarkEnd w:id="19"/>
+    <w:bookmarkStart w:id="20" w:name="Xc623022311fbb09c3c20527babe29df8a9f5177"/>
+    <w:p>
+      <w:pPr>
+        <w:pStyle w:val="Heading2"/>
+      </w:pPr>
+      <w:r>
+        <w:t xml:space="preserve">Supplementary Figure S12 — Circular-origin artifact filtering in</w:t>
       </w:r>
       <w:r>
         <w:t xml:space="preserve"> </w:t>
@@ -1009,59 +900,86 @@
           <w:i/>
           <w:iCs/>
         </w:rPr>
-        <w:t xml:space="preserve">S. rimosus</w:t>
-      </w:r>
-      <w:r>
-        <w:t xml:space="preserve"> </w:t>
-      </w:r>
-      <w:r>
-        <w:t xml:space="preserve">isolates (190 pairs); near-clonal pairs (ANI 99.99–100%) have</w:t>
-      </w:r>
-      <w:r>
-        <w:t xml:space="preserve"> </w:t>
-      </w:r>
-      <w:r>
-        <w:t xml:space="preserve">anchor adjacencies 0.89–0.96 and an average of ~1,980 breakpoints. The most</w:t>
-      </w:r>
-      <w:r>
-        <w:t xml:space="preserve"> </w:t>
-      </w:r>
-      <w:r>
-        <w:t xml:space="preserve">discordant cases (NG_05 vs NG_10 and SR_06 vs SR_10) were re-analyzed with</w:t>
-      </w:r>
-      <w:r>
-        <w:t xml:space="preserve"> </w:t>
-      </w:r>
-      <w:r>
-        <w:rPr>
-          <w:rStyle w:val="VerbatimChar"/>
-        </w:rPr>
-        <w:t xml:space="preserve">syn2bani struct</w:t>
-      </w:r>
-      <w:r>
-        <w:t xml:space="preserve">; counts are in Table 4 and</w:t>
-      </w:r>
-      <w:r>
-        <w:t xml:space="preserve"> </w:t>
-      </w:r>
-      <w:r>
-        <w:rPr>
-          <w:rStyle w:val="VerbatimChar"/>
-        </w:rPr>
-        <w:t xml:space="preserve">results/syntracker_validation/struct_top_cases_summary.tsv</w:t>
-      </w:r>
-      <w:r>
-        <w:t xml:space="preserve">.</w:t>
-      </w:r>
-    </w:p>
-    <w:bookmarkEnd w:id="19"/>
-    <w:bookmarkStart w:id="20" w:name="X2422f0469f3022556b72e2e5eef1a136783d04b"/>
-    <w:p>
-      <w:pPr>
-        <w:pStyle w:val="Heading2"/>
-      </w:pPr>
-      <w:r>
-        <w:t xml:space="preserve">Supplementary Figure S12 — Engineered</w:t>
+        <w:t xml:space="preserve">H. pylori</w:t>
+      </w:r>
+      <w:r>
+        <w:t xml:space="preserve"> </w:t>
+      </w:r>
+      <w:r>
+        <w:t xml:space="preserve">cagPAI</w:t>
+      </w:r>
+    </w:p>
+    <w:p>
+      <w:pPr>
+        <w:pStyle w:val="FirstParagraph"/>
+      </w:pPr>
+      <w:r>
+        <w:t xml:space="preserve">(</w:t>
+      </w:r>
+      <w:r>
+        <w:rPr>
+          <w:rStyle w:val="VerbatimChar"/>
+        </w:rPr>
+        <w:t xml:space="preserve">paper/figures/supplementary/fig_s12_circular_origin_filtering.png</w:t>
+      </w:r>
+      <w:r>
+        <w:t xml:space="preserve">)</w:t>
+      </w:r>
+    </w:p>
+    <w:p>
+      <w:pPr>
+        <w:pStyle w:val="BodyText"/>
+      </w:pPr>
+      <w:r>
+        <w:t xml:space="preserve">Before and after counts of the four extended cagPAI states. Filtering</w:t>
+      </w:r>
+      <w:r>
+        <w:t xml:space="preserve"> </w:t>
+      </w:r>
+      <w:r>
+        <w:t xml:space="preserve">reclassifies 133 complete-marker genomes from</w:t>
+      </w:r>
+      <w:r>
+        <w:t xml:space="preserve"> </w:t>
+      </w:r>
+      <w:r>
+        <w:rPr>
+          <w:rStyle w:val="VerbatimChar"/>
+        </w:rPr>
+        <w:t xml:space="preserve">complete_rearranged</w:t>
+      </w:r>
+      <w:r>
+        <w:t xml:space="preserve"> </w:t>
+      </w:r>
+      <w:r>
+        <w:t xml:space="preserve">to</w:t>
+      </w:r>
+      <w:r>
+        <w:t xml:space="preserve"> </w:t>
+      </w:r>
+      <w:r>
+        <w:rPr>
+          <w:rStyle w:val="VerbatimChar"/>
+        </w:rPr>
+        <w:t xml:space="preserve">complete_collinear</w:t>
+      </w:r>
+      <w:r>
+        <w:t xml:space="preserve"> </w:t>
+      </w:r>
+      <w:r>
+        <w:t xml:space="preserve">because their only cagPAI-overlapping SV is a</w:t>
+      </w:r>
+      <w:r>
+        <w:t xml:space="preserve"> </w:t>
+      </w:r>
+      <w:r>
+        <w:t xml:space="preserve">genome-spanning call consistent with a different arbitrary start coordinate on</w:t>
+      </w:r>
+      <w:r>
+        <w:t xml:space="preserve"> </w:t>
+      </w:r>
+      <w:r>
+        <w:t xml:space="preserve">the circular</w:t>
       </w:r>
       <w:r>
         <w:t xml:space="preserve"> </w:t>
@@ -1077,105 +995,7 @@
         <w:t xml:space="preserve"> </w:t>
       </w:r>
       <w:r>
-        <w:t xml:space="preserve">cagPAI deletion is recovered at exact size</w:t>
-      </w:r>
-    </w:p>
-    <w:p>
-      <w:pPr>
-        <w:pStyle w:val="FirstParagraph"/>
-      </w:pPr>
-      <w:r>
-        <w:t xml:space="preserve">(</w:t>
-      </w:r>
-      <w:r>
-        <w:rPr>
-          <w:rStyle w:val="VerbatimChar"/>
-        </w:rPr>
-        <w:t xml:space="preserve">figures/report/fig_s12_cagpai_pilot.png</w:t>
-      </w:r>
-      <w:r>
-        <w:t xml:space="preserve">)</w:t>
-      </w:r>
-    </w:p>
-    <w:p>
-      <w:pPr>
-        <w:pStyle w:val="BodyText"/>
-      </w:pPr>
-      <w:r>
-        <w:t xml:space="preserve">Eight</w:t>
-      </w:r>
-      <w:r>
-        <w:t xml:space="preserve"> </w:t>
-      </w:r>
-      <w:r>
-        <w:rPr>
-          <w:i/>
-          <w:iCs/>
-        </w:rPr>
-        <w:t xml:space="preserve">H. pylori</w:t>
-      </w:r>
-      <w:r>
-        <w:t xml:space="preserve"> </w:t>
-      </w:r>
-      <w:r>
-        <w:t xml:space="preserve">26695-derived genomes: wild-type (WT), a 36,154 bp cagPAI deletion (ΔcagPAI), cagPAI inversion, cagPAI translocation, and the same four structures on a mut1 background carrying ~1% substitutions. All pairwise comparisons were run with</w:t>
-      </w:r>
-      <w:r>
-        <w:t xml:space="preserve"> </w:t>
-      </w:r>
-      <w:r>
-        <w:rPr>
-          <w:rStyle w:val="VerbatimChar"/>
-        </w:rPr>
-        <w:t xml:space="preserve">syn2bani ani</w:t>
-      </w:r>
-      <w:r>
-        <w:t xml:space="preserve"> </w:t>
-      </w:r>
-      <w:r>
-        <w:t xml:space="preserve">and</w:t>
-      </w:r>
-      <w:r>
-        <w:t xml:space="preserve"> </w:t>
-      </w:r>
-      <w:r>
-        <w:rPr>
-          <w:rStyle w:val="VerbatimChar"/>
-        </w:rPr>
-        <w:t xml:space="preserve">syn2bani struct</w:t>
-      </w:r>
-      <w:r>
-        <w:t xml:space="preserve">. (a) ANI is ~100% for same-background pairs and ~99% across backgrounds, independent of the 36 kb rearrangement. (b)</w:t>
-      </w:r>
-      <w:r>
-        <w:t xml:space="preserve"> </w:t>
-      </w:r>
-      <w:r>
-        <w:rPr>
-          <w:rStyle w:val="VerbatimChar"/>
-        </w:rPr>
-        <w:t xml:space="preserve">breakpoint_count</w:t>
-      </w:r>
-      <w:r>
-        <w:t xml:space="preserve"> </w:t>
-      </w:r>
-      <w:r>
-        <w:t xml:space="preserve">increases for inversion and translocation pairs. (c)</w:t>
-      </w:r>
-      <w:r>
-        <w:t xml:space="preserve"> </w:t>
-      </w:r>
-      <w:r>
-        <w:rPr>
-          <w:rStyle w:val="VerbatimChar"/>
-        </w:rPr>
-        <w:t xml:space="preserve">anchor_adjacency</w:t>
-      </w:r>
-      <w:r>
-        <w:t xml:space="preserve"> </w:t>
-      </w:r>
-      <w:r>
-        <w:t xml:space="preserve">(chain coverage) drops only modestly with the deletion and is insensitive to inversion/translocation, confirming that it measures coverage rather than rearrangement burden. The WT vs ΔcagPAI comparison returns a single insertion call of exactly 36,154 bp.</w:t>
+        <w:t xml:space="preserve">chromosome.</w:t>
       </w:r>
     </w:p>
     <w:bookmarkEnd w:id="20"/>
@@ -2031,12 +1851,532 @@
       </w:tr>
     </w:tbl>
     <w:bookmarkEnd w:id="23"/>
-    <w:bookmarkStart w:id="24" w:name="Xe280e63292e65e7cc12ffc5dad24d6a06d19d0f"/>
+    <w:bookmarkStart w:id="24" w:name="X4c50bc026c5465e49f035988aa0fe4463cd86fc"/>
     <w:p>
       <w:pPr>
         <w:pStyle w:val="Heading2"/>
       </w:pPr>
       <w:r>
+        <w:t xml:space="preserve">Supplementary Table S4 — Lineage-stratified cagPAI–disease associations</w:t>
+      </w:r>
+    </w:p>
+    <w:p>
+      <w:pPr>
+        <w:pStyle w:val="FirstParagraph"/>
+      </w:pPr>
+      <w:r>
+        <w:t xml:space="preserve">Five hundred and twenty-eight</w:t>
+      </w:r>
+      <w:r>
+        <w:t xml:space="preserve"> </w:t>
+      </w:r>
+      <w:r>
+        <w:rPr>
+          <w:i/>
+          <w:iCs/>
+        </w:rPr>
+        <w:t xml:space="preserve">H. pylori</w:t>
+      </w:r>
+      <w:r>
+        <w:t xml:space="preserve"> </w:t>
+      </w:r>
+      <w:r>
+        <w:t xml:space="preserve">isolates from Song et al. (2026) were</w:t>
+      </w:r>
+      <w:r>
+        <w:t xml:space="preserve"> </w:t>
+      </w:r>
+      <w:r>
+        <w:t xml:space="preserve">classified into extended cagPAI states after circular-origin filtering (empty</w:t>
+      </w:r>
+      <w:r>
+        <w:t xml:space="preserve"> </w:t>
+      </w:r>
+      <w:r>
+        <w:t xml:space="preserve">85, partial 11, complete_collinear 145, complete_rearranged 287). The raw</w:t>
+      </w:r>
+      <w:r>
+        <w:t xml:space="preserve"> </w:t>
+      </w:r>
+      <w:r>
+        <w:t xml:space="preserve">Pearson χ² test for disease stage is significant (χ² = 24.60, df = 9, p = 0.0034),</w:t>
+      </w:r>
+      <w:r>
+        <w:t xml:space="preserve"> </w:t>
+      </w:r>
+      <w:r>
+        <w:t xml:space="preserve">but the association is confounded by FastBAPS lineage. Cochran–Mantel–Haenszel</w:t>
+      </w:r>
+      <w:r>
+        <w:t xml:space="preserve"> </w:t>
+      </w:r>
+      <w:r>
+        <w:t xml:space="preserve">statistics stratified by FastBAPS lineage:</w:t>
+      </w:r>
+    </w:p>
+    <w:tbl>
+      <w:tblPr>
+        <w:tblStyle w:val="Table"/>
+        <w:tblW w:type="pct" w:w="5000"/>
+        <w:tblLayout w:type="fixed"/>
+        <w:tblLook w:firstRow="1" w:lastRow="0" w:firstColumn="0" w:lastColumn="0" w:noHBand="0" w:noVBand="0" w:val="0020"/>
+      </w:tblPr>
+      <w:tblGrid>
+        <w:gridCol w:w="990"/>
+        <w:gridCol w:w="990"/>
+        <w:gridCol w:w="990"/>
+        <w:gridCol w:w="990"/>
+        <w:gridCol w:w="1320"/>
+        <w:gridCol w:w="1320"/>
+        <w:gridCol w:w="1320"/>
+      </w:tblGrid>
+      <w:tr>
+        <w:trPr>
+          <w:tblHeader w:val="on"/>
+        </w:trPr>
+        <w:tc>
+          <w:tcPr/>
+          <w:p>
+            <w:pPr>
+              <w:pStyle w:val="Compact"/>
+            </w:pPr>
+            <w:r>
+              <w:t xml:space="preserve">Contrast</w:t>
+            </w:r>
+          </w:p>
+        </w:tc>
+        <w:tc>
+          <w:tcPr/>
+          <w:p>
+            <w:pPr>
+              <w:pStyle w:val="Compact"/>
+            </w:pPr>
+            <w:r>
+              <w:t xml:space="preserve">Case</w:t>
+            </w:r>
+          </w:p>
+        </w:tc>
+        <w:tc>
+          <w:tcPr/>
+          <w:p>
+            <w:pPr>
+              <w:pStyle w:val="Compact"/>
+            </w:pPr>
+            <w:r>
+              <w:t xml:space="preserve">Control</w:t>
+            </w:r>
+          </w:p>
+        </w:tc>
+        <w:tc>
+          <w:tcPr/>
+          <w:p>
+            <w:pPr>
+              <w:pStyle w:val="Compact"/>
+            </w:pPr>
+            <w:r>
+              <w:t xml:space="preserve">Outcome</w:t>
+            </w:r>
+          </w:p>
+        </w:tc>
+        <w:tc>
+          <w:tcPr/>
+          <w:p>
+            <w:pPr>
+              <w:pStyle w:val="Compact"/>
+              <w:jc w:val="right"/>
+            </w:pPr>
+            <w:r>
+              <w:t xml:space="preserve">CMH χ²</w:t>
+            </w:r>
+          </w:p>
+        </w:tc>
+        <w:tc>
+          <w:tcPr/>
+          <w:p>
+            <w:pPr>
+              <w:pStyle w:val="Compact"/>
+              <w:jc w:val="right"/>
+            </w:pPr>
+            <w:r>
+              <w:t xml:space="preserve">p</w:t>
+            </w:r>
+          </w:p>
+        </w:tc>
+        <w:tc>
+          <w:tcPr/>
+          <w:p>
+            <w:pPr>
+              <w:pStyle w:val="Compact"/>
+              <w:jc w:val="right"/>
+            </w:pPr>
+            <w:r>
+              <w:t xml:space="preserve">OR_MH</w:t>
+            </w:r>
+          </w:p>
+        </w:tc>
+      </w:tr>
+      <w:tr>
+        <w:tc>
+          <w:tcPr/>
+          <w:p>
+            <w:pPr>
+              <w:pStyle w:val="Compact"/>
+            </w:pPr>
+            <w:r>
+              <w:t xml:space="preserve">cagPAI presence</w:t>
+            </w:r>
+          </w:p>
+        </w:tc>
+        <w:tc>
+          <w:tcPr/>
+          <w:p>
+            <w:pPr>
+              <w:pStyle w:val="Compact"/>
+            </w:pPr>
+            <w:r>
+              <w:t xml:space="preserve">GC</w:t>
+            </w:r>
+          </w:p>
+        </w:tc>
+        <w:tc>
+          <w:tcPr/>
+          <w:p>
+            <w:pPr>
+              <w:pStyle w:val="Compact"/>
+            </w:pPr>
+            <w:r>
+              <w:t xml:space="preserve">NAG</w:t>
+            </w:r>
+          </w:p>
+        </w:tc>
+        <w:tc>
+          <w:tcPr/>
+          <w:p>
+            <w:pPr>
+              <w:pStyle w:val="Compact"/>
+            </w:pPr>
+            <w:r>
+              <w:t xml:space="preserve">complete vs empty/partial</w:t>
+            </w:r>
+          </w:p>
+        </w:tc>
+        <w:tc>
+          <w:tcPr/>
+          <w:p>
+            <w:pPr>
+              <w:pStyle w:val="Compact"/>
+              <w:jc w:val="right"/>
+            </w:pPr>
+            <w:r>
+              <w:t xml:space="preserve">1.4019</w:t>
+            </w:r>
+          </w:p>
+        </w:tc>
+        <w:tc>
+          <w:tcPr/>
+          <w:p>
+            <w:pPr>
+              <w:pStyle w:val="Compact"/>
+              <w:jc w:val="right"/>
+            </w:pPr>
+            <w:r>
+              <w:t xml:space="preserve">0.2364</w:t>
+            </w:r>
+          </w:p>
+        </w:tc>
+        <w:tc>
+          <w:tcPr/>
+          <w:p>
+            <w:pPr>
+              <w:pStyle w:val="Compact"/>
+              <w:jc w:val="right"/>
+            </w:pPr>
+            <w:r>
+              <w:t xml:space="preserve">1.599</w:t>
+            </w:r>
+          </w:p>
+        </w:tc>
+      </w:tr>
+      <w:tr>
+        <w:tc>
+          <w:tcPr/>
+          <w:p>
+            <w:pPr>
+              <w:pStyle w:val="Compact"/>
+            </w:pPr>
+            <w:r>
+              <w:t xml:space="preserve">cagPAI rearrangement</w:t>
+            </w:r>
+          </w:p>
+        </w:tc>
+        <w:tc>
+          <w:tcPr/>
+          <w:p>
+            <w:pPr>
+              <w:pStyle w:val="Compact"/>
+            </w:pPr>
+            <w:r>
+              <w:t xml:space="preserve">GC</w:t>
+            </w:r>
+          </w:p>
+        </w:tc>
+        <w:tc>
+          <w:tcPr/>
+          <w:p>
+            <w:pPr>
+              <w:pStyle w:val="Compact"/>
+            </w:pPr>
+            <w:r>
+              <w:t xml:space="preserve">NAG</w:t>
+            </w:r>
+          </w:p>
+        </w:tc>
+        <w:tc>
+          <w:tcPr/>
+          <w:p>
+            <w:pPr>
+              <w:pStyle w:val="Compact"/>
+            </w:pPr>
+            <w:r>
+              <w:t xml:space="preserve">complete_rearranged vs complete_collinear</w:t>
+            </w:r>
+          </w:p>
+        </w:tc>
+        <w:tc>
+          <w:tcPr/>
+          <w:p>
+            <w:pPr>
+              <w:pStyle w:val="Compact"/>
+              <w:jc w:val="right"/>
+            </w:pPr>
+            <w:r>
+              <w:t xml:space="preserve">0.8028</w:t>
+            </w:r>
+          </w:p>
+        </w:tc>
+        <w:tc>
+          <w:tcPr/>
+          <w:p>
+            <w:pPr>
+              <w:pStyle w:val="Compact"/>
+              <w:jc w:val="right"/>
+            </w:pPr>
+            <w:r>
+              <w:t xml:space="preserve">0.3703</w:t>
+            </w:r>
+          </w:p>
+        </w:tc>
+        <w:tc>
+          <w:tcPr/>
+          <w:p>
+            <w:pPr>
+              <w:pStyle w:val="Compact"/>
+              <w:jc w:val="right"/>
+            </w:pPr>
+            <w:r>
+              <w:t xml:space="preserve">1.294</w:t>
+            </w:r>
+          </w:p>
+        </w:tc>
+      </w:tr>
+      <w:tr>
+        <w:tc>
+          <w:tcPr/>
+          <w:p>
+            <w:pPr>
+              <w:pStyle w:val="Compact"/>
+            </w:pPr>
+            <w:r>
+              <w:t xml:space="preserve">cagPAI presence (advanced vs early)</w:t>
+            </w:r>
+          </w:p>
+        </w:tc>
+        <w:tc>
+          <w:tcPr/>
+          <w:p>
+            <w:pPr>
+              <w:pStyle w:val="Compact"/>
+            </w:pPr>
+            <w:r>
+              <w:t xml:space="preserve">GC/IM</w:t>
+            </w:r>
+          </w:p>
+        </w:tc>
+        <w:tc>
+          <w:tcPr/>
+          <w:p>
+            <w:pPr>
+              <w:pStyle w:val="Compact"/>
+            </w:pPr>
+            <w:r>
+              <w:t xml:space="preserve">AG/NAG</w:t>
+            </w:r>
+          </w:p>
+        </w:tc>
+        <w:tc>
+          <w:tcPr/>
+          <w:p>
+            <w:pPr>
+              <w:pStyle w:val="Compact"/>
+            </w:pPr>
+            <w:r>
+              <w:t xml:space="preserve">complete vs empty/partial</w:t>
+            </w:r>
+          </w:p>
+        </w:tc>
+        <w:tc>
+          <w:tcPr/>
+          <w:p>
+            <w:pPr>
+              <w:pStyle w:val="Compact"/>
+              <w:jc w:val="right"/>
+            </w:pPr>
+            <w:r>
+              <w:t xml:space="preserve">1.5539</w:t>
+            </w:r>
+          </w:p>
+        </w:tc>
+        <w:tc>
+          <w:tcPr/>
+          <w:p>
+            <w:pPr>
+              <w:pStyle w:val="Compact"/>
+              <w:jc w:val="right"/>
+            </w:pPr>
+            <w:r>
+              <w:t xml:space="preserve">0.2126</w:t>
+            </w:r>
+          </w:p>
+        </w:tc>
+        <w:tc>
+          <w:tcPr/>
+          <w:p>
+            <w:pPr>
+              <w:pStyle w:val="Compact"/>
+              <w:jc w:val="right"/>
+            </w:pPr>
+            <w:r>
+              <w:t xml:space="preserve">1.389</w:t>
+            </w:r>
+          </w:p>
+        </w:tc>
+      </w:tr>
+      <w:tr>
+        <w:tc>
+          <w:tcPr/>
+          <w:p>
+            <w:pPr>
+              <w:pStyle w:val="Compact"/>
+            </w:pPr>
+            <w:r>
+              <w:t xml:space="preserve">cagPAI rearrangement (advanced vs early)</w:t>
+            </w:r>
+          </w:p>
+        </w:tc>
+        <w:tc>
+          <w:tcPr/>
+          <w:p>
+            <w:pPr>
+              <w:pStyle w:val="Compact"/>
+            </w:pPr>
+            <w:r>
+              <w:t xml:space="preserve">GC/IM</w:t>
+            </w:r>
+          </w:p>
+        </w:tc>
+        <w:tc>
+          <w:tcPr/>
+          <w:p>
+            <w:pPr>
+              <w:pStyle w:val="Compact"/>
+            </w:pPr>
+            <w:r>
+              <w:t xml:space="preserve">AG/NAG</w:t>
+            </w:r>
+          </w:p>
+        </w:tc>
+        <w:tc>
+          <w:tcPr/>
+          <w:p>
+            <w:pPr>
+              <w:pStyle w:val="Compact"/>
+            </w:pPr>
+            <w:r>
+              <w:t xml:space="preserve">complete_rearranged vs complete_collinear</w:t>
+            </w:r>
+          </w:p>
+        </w:tc>
+        <w:tc>
+          <w:tcPr/>
+          <w:p>
+            <w:pPr>
+              <w:pStyle w:val="Compact"/>
+              <w:jc w:val="right"/>
+            </w:pPr>
+            <w:r>
+              <w:t xml:space="preserve">0.4664</w:t>
+            </w:r>
+          </w:p>
+        </w:tc>
+        <w:tc>
+          <w:tcPr/>
+          <w:p>
+            <w:pPr>
+              <w:pStyle w:val="Compact"/>
+              <w:jc w:val="right"/>
+            </w:pPr>
+            <w:r>
+              <w:t xml:space="preserve">0.4946</w:t>
+            </w:r>
+          </w:p>
+        </w:tc>
+        <w:tc>
+          <w:tcPr/>
+          <w:p>
+            <w:pPr>
+              <w:pStyle w:val="Compact"/>
+              <w:jc w:val="right"/>
+            </w:pPr>
+            <w:r>
+              <w:t xml:space="preserve">1.152</w:t>
+            </w:r>
+          </w:p>
+        </w:tc>
+      </w:tr>
+    </w:tbl>
+    <w:p>
+      <w:pPr>
+        <w:pStyle w:val="BodyText"/>
+      </w:pPr>
+      <w:r>
+        <w:t xml:space="preserve">None of the lineage-stratified associations is significant. Full per-stratum</w:t>
+      </w:r>
+      <w:r>
+        <w:t xml:space="preserve"> </w:t>
+      </w:r>
+      <w:r>
+        <w:t xml:space="preserve">counts:</w:t>
+      </w:r>
+      <w:r>
+        <w:t xml:space="preserve"> </w:t>
+      </w:r>
+      <w:r>
+        <w:rPr>
+          <w:rStyle w:val="VerbatimChar"/>
+        </w:rPr>
+        <w:t xml:space="preserve">case_studies/h_pylori_cagpai/results/cagpai_association_stratified.tsv</w:t>
+      </w:r>
+      <w:r>
+        <w:t xml:space="preserve">.</w:t>
+      </w:r>
+    </w:p>
+    <w:bookmarkEnd w:id="24"/>
+    <w:bookmarkStart w:id="25" w:name="Xe280e63292e65e7cc12ffc5dad24d6a06d19d0f"/>
+    <w:p>
+      <w:pPr>
+        <w:pStyle w:val="Heading2"/>
+      </w:pPr>
+      <w:r>
         <w:t xml:space="preserve">Supplementary Note 1 — Calibration is input-regime-specific (MAG test)</w:t>
       </w:r>
     </w:p>
@@ -2129,8 +2469,8 @@
         <w:t xml:space="preserve">.</w:t>
       </w:r>
     </w:p>
-    <w:bookmarkEnd w:id="24"/>
-    <w:bookmarkStart w:id="25" w:name="Xd013ccaae7d4dde06816ab37078854f863f6c97"/>
+    <w:bookmarkEnd w:id="25"/>
+    <w:bookmarkStart w:id="26" w:name="Xd013ccaae7d4dde06816ab37078854f863f6c97"/>
     <w:p>
       <w:pPr>
         <w:pStyle w:val="Heading2"/>
@@ -2301,8 +2641,8 @@
         <w:t xml:space="preserve">further is not expected to improve it (main text, Methods 4.6).</w:t>
       </w:r>
     </w:p>
-    <w:bookmarkEnd w:id="25"/>
-    <w:bookmarkStart w:id="26" w:name="X335171f238bd89d569aec4e4b5b6643057b0b49"/>
+    <w:bookmarkEnd w:id="26"/>
+    <w:bookmarkStart w:id="27" w:name="X335171f238bd89d569aec4e4b5b6643057b0b49"/>
     <w:p>
       <w:pPr>
         <w:pStyle w:val="Heading2"/>
@@ -2403,8 +2743,1872 @@
         <w:t xml:space="preserve">.</w:t>
       </w:r>
     </w:p>
-    <w:bookmarkEnd w:id="26"/>
     <w:bookmarkEnd w:id="27"/>
+    <w:bookmarkStart w:id="28" w:name="Xfd6529be4a0d1bbd51b24452f2b6f26ebe262a9"/>
+    <w:p>
+      <w:pPr>
+        <w:pStyle w:val="Heading2"/>
+      </w:pPr>
+      <w:r>
+        <w:t xml:space="preserve">Supplementary Note 4 — Chain-restricted stratified MLE, gating, and flags</w:t>
+      </w:r>
+    </w:p>
+    <w:p>
+      <w:pPr>
+        <w:pStyle w:val="FirstParagraph"/>
+      </w:pPr>
+      <w:r>
+        <w:t xml:space="preserve">For a query tag inside a chained region, with tag length</w:t>
+      </w:r>
+      <w:r>
+        <w:t xml:space="preserve"> </w:t>
+      </w:r>
+      <w:r>
+        <w:rPr>
+          <w:rStyle w:val="VerbatimChar"/>
+        </w:rPr>
+        <w:t xml:space="preserve">k</w:t>
+      </w:r>
+      <w:r>
+        <w:t xml:space="preserve">, recognition-site</w:t>
+      </w:r>
+      <w:r>
+        <w:t xml:space="preserve"> </w:t>
+      </w:r>
+      <w:r>
+        <w:t xml:space="preserve">length</w:t>
+      </w:r>
+      <w:r>
+        <w:t xml:space="preserve"> </w:t>
+      </w:r>
+      <w:r>
+        <w:rPr>
+          <w:rStyle w:val="VerbatimChar"/>
+        </w:rPr>
+        <w:t xml:space="preserve">s</w:t>
+      </w:r>
+      <w:r>
+        <w:t xml:space="preserve">, mutable body</w:t>
+      </w:r>
+      <w:r>
+        <w:t xml:space="preserve"> </w:t>
+      </w:r>
+      <w:r>
+        <w:rPr>
+          <w:rStyle w:val="VerbatimChar"/>
+        </w:rPr>
+        <w:t xml:space="preserve">b = k − s</w:t>
+      </w:r>
+      <w:r>
+        <w:t xml:space="preserve">, and mismatch budget</w:t>
+      </w:r>
+      <w:r>
+        <w:t xml:space="preserve"> </w:t>
+      </w:r>
+      <w:r>
+        <w:rPr>
+          <w:rStyle w:val="VerbatimChar"/>
+        </w:rPr>
+        <w:t xml:space="preserve">tol</w:t>
+      </w:r>
+      <w:r>
+        <w:t xml:space="preserve">, the outcome</w:t>
+      </w:r>
+      <w:r>
+        <w:t xml:space="preserve"> </w:t>
+      </w:r>
+      <w:r>
+        <w:t xml:space="preserve">probabilities under per-base identity</w:t>
+      </w:r>
+      <w:r>
+        <w:t xml:space="preserve"> </w:t>
+      </w:r>
+      <w:r>
+        <w:rPr>
+          <w:rStyle w:val="VerbatimChar"/>
+        </w:rPr>
+        <w:t xml:space="preserve">a</w:t>
+      </w:r>
+      <w:r>
+        <w:t xml:space="preserve"> </w:t>
+      </w:r>
+      <w:r>
+        <w:t xml:space="preserve">are:</w:t>
+      </w:r>
+    </w:p>
+    <w:p>
+      <w:pPr>
+        <w:pStyle w:val="Compact"/>
+        <w:numPr>
+          <w:ilvl w:val="0"/>
+          <w:numId w:val="1001"/>
+        </w:numPr>
+      </w:pPr>
+      <w:r>
+        <w:rPr>
+          <w:b/>
+          <w:bCs/>
+        </w:rPr>
+        <w:t xml:space="preserve">Found with</w:t>
+      </w:r>
+      <w:r>
+        <w:rPr>
+          <w:b/>
+          <w:bCs/>
+        </w:rPr>
+        <w:t xml:space="preserve"> </w:t>
+      </w:r>
+      <w:r>
+        <w:rPr>
+          <w:rStyle w:val="VerbatimChar"/>
+          <w:b/>
+          <w:bCs/>
+        </w:rPr>
+        <w:t xml:space="preserve">m</w:t>
+      </w:r>
+      <w:r>
+        <w:rPr>
+          <w:b/>
+          <w:bCs/>
+        </w:rPr>
+        <w:t xml:space="preserve"> </w:t>
+      </w:r>
+      <w:r>
+        <w:rPr>
+          <w:b/>
+          <w:bCs/>
+        </w:rPr>
+        <w:t xml:space="preserve">body mismatches</w:t>
+      </w:r>
+      <w:r>
+        <w:t xml:space="preserve"> </w:t>
+      </w:r>
+      <w:r>
+        <w:t xml:space="preserve">(for</w:t>
+      </w:r>
+      <w:r>
+        <w:t xml:space="preserve"> </w:t>
+      </w:r>
+      <w:r>
+        <w:rPr>
+          <w:rStyle w:val="VerbatimChar"/>
+        </w:rPr>
+        <w:t xml:space="preserve">m ≤ tol</w:t>
+      </w:r>
+      <w:r>
+        <w:t xml:space="preserve">):</w:t>
+      </w:r>
+      <w:r>
+        <w:t xml:space="preserve"> </w:t>
+      </w:r>
+      <w:r>
+        <w:rPr>
+          <w:rStyle w:val="VerbatimChar"/>
+        </w:rPr>
+        <w:t xml:space="preserve">P_m(a) = C(b, m) · (1 − a)^m · a^(k−m)</w:t>
+      </w:r>
+      <w:r>
+        <w:t xml:space="preserve">.</w:t>
+      </w:r>
+    </w:p>
+    <w:p>
+      <w:pPr>
+        <w:pStyle w:val="Compact"/>
+        <w:numPr>
+          <w:ilvl w:val="0"/>
+          <w:numId w:val="1001"/>
+        </w:numPr>
+      </w:pPr>
+      <w:r>
+        <w:rPr>
+          <w:b/>
+          <w:bCs/>
+        </w:rPr>
+        <w:t xml:space="preserve">Not found</w:t>
+      </w:r>
+      <w:r>
+        <w:t xml:space="preserve"> </w:t>
+      </w:r>
+      <w:r>
+        <w:t xml:space="preserve">(miss):</w:t>
+      </w:r>
+      <w:r>
+        <w:t xml:space="preserve"> </w:t>
+      </w:r>
+      <w:r>
+        <w:rPr>
+          <w:rStyle w:val="VerbatimChar"/>
+        </w:rPr>
+        <w:t xml:space="preserve">P_miss(a) = 1 − Σ_{m=0}^{tol} P_m(a)</w:t>
+      </w:r>
+      <w:r>
+        <w:t xml:space="preserve">.</w:t>
+      </w:r>
+    </w:p>
+    <w:p>
+      <w:pPr>
+        <w:pStyle w:val="FirstParagraph"/>
+      </w:pPr>
+      <w:r>
+        <w:t xml:space="preserve">Mismatches are observable only in the mutable body — a mutation inside the</w:t>
+      </w:r>
+      <w:r>
+        <w:t xml:space="preserve"> </w:t>
+      </w:r>
+      <w:r>
+        <w:t xml:space="preserve">recognition site deletes the tag entirely — so the site contributes a factor</w:t>
+      </w:r>
+      <w:r>
+        <w:t xml:space="preserve"> </w:t>
+      </w:r>
+      <w:r>
+        <w:rPr>
+          <w:rStyle w:val="VerbatimChar"/>
+        </w:rPr>
+        <w:t xml:space="preserve">a^s</w:t>
+      </w:r>
+      <w:r>
+        <w:t xml:space="preserve"> </w:t>
+      </w:r>
+      <w:r>
+        <w:t xml:space="preserve">to</w:t>
+      </w:r>
+      <w:r>
+        <w:t xml:space="preserve"> </w:t>
+      </w:r>
+      <w:r>
+        <w:rPr>
+          <w:rStyle w:val="VerbatimChar"/>
+        </w:rPr>
+        <w:t xml:space="preserve">P_found</w:t>
+      </w:r>
+      <w:r>
+        <w:t xml:space="preserve"> </w:t>
+      </w:r>
+      <w:r>
+        <w:t xml:space="preserve">but never appears in the histogram. This also sets a hard</w:t>
+      </w:r>
+      <w:r>
+        <w:t xml:space="preserve"> </w:t>
+      </w:r>
+      <w:r>
+        <w:t xml:space="preserve">retention ceiling (for example, ~0.72 at 95% ANI and ~0.50 at 90% with the</w:t>
+      </w:r>
+      <w:r>
+        <w:t xml:space="preserve"> </w:t>
+      </w:r>
+      <w:r>
+        <w:t xml:space="preserve">default budget). The per-enzyme strata differ in</w:t>
+      </w:r>
+      <w:r>
+        <w:t xml:space="preserve"> </w:t>
+      </w:r>
+      <w:r>
+        <w:rPr>
+          <w:rStyle w:val="VerbatimChar"/>
+        </w:rPr>
+        <w:t xml:space="preserve">k</w:t>
+      </w:r>
+      <w:r>
+        <w:t xml:space="preserve"> </w:t>
+      </w:r>
+      <w:r>
+        <w:t xml:space="preserve">and</w:t>
+      </w:r>
+      <w:r>
+        <w:t xml:space="preserve"> </w:t>
+      </w:r>
+      <w:r>
+        <w:rPr>
+          <w:rStyle w:val="VerbatimChar"/>
+        </w:rPr>
+        <w:t xml:space="preserve">b</w:t>
+      </w:r>
+      <w:r>
+        <w:t xml:space="preserve">; the total</w:t>
+      </w:r>
+      <w:r>
+        <w:t xml:space="preserve"> </w:t>
+      </w:r>
+      <w:r>
+        <w:t xml:space="preserve">log-likelihood is the sum over strata and is maximized over the scalar</w:t>
+      </w:r>
+      <w:r>
+        <w:t xml:space="preserve"> </w:t>
+      </w:r>
+      <w:r>
+        <w:rPr>
+          <w:rStyle w:val="VerbatimChar"/>
+        </w:rPr>
+        <w:t xml:space="preserve">a</w:t>
+      </w:r>
+      <w:r>
+        <w:t xml:space="preserve"> </w:t>
+      </w:r>
+      <w:r>
+        <w:t xml:space="preserve">by</w:t>
+      </w:r>
+      <w:r>
+        <w:t xml:space="preserve"> </w:t>
+      </w:r>
+      <w:r>
+        <w:t xml:space="preserve">golden-section search.</w:t>
+      </w:r>
+    </w:p>
+    <w:p>
+      <w:pPr>
+        <w:pStyle w:val="BodyText"/>
+      </w:pPr>
+      <w:r>
+        <w:t xml:space="preserve">Two partial estimators are computed as diagnostics:</w:t>
+      </w:r>
+    </w:p>
+    <w:p>
+      <w:pPr>
+        <w:pStyle w:val="Compact"/>
+        <w:numPr>
+          <w:ilvl w:val="0"/>
+          <w:numId w:val="1002"/>
+        </w:numPr>
+      </w:pPr>
+      <w:r>
+        <w:rPr>
+          <w:rStyle w:val="VerbatimChar"/>
+        </w:rPr>
+        <w:t xml:space="preserve">ani_from_loss</w:t>
+      </w:r>
+      <w:r>
+        <w:t xml:space="preserve"> </w:t>
+      </w:r>
+      <w:r>
+        <w:t xml:space="preserve">— uses</w:t>
+      </w:r>
+      <w:r>
+        <w:t xml:space="preserve"> </w:t>
+      </w:r>
+      <w:r>
+        <w:rPr>
+          <w:rStyle w:val="VerbatimChar"/>
+        </w:rPr>
+        <w:t xml:space="preserve">P_miss(a)</w:t>
+      </w:r>
+      <w:r>
+        <w:t xml:space="preserve"> </w:t>
+      </w:r>
+      <w:r>
+        <w:t xml:space="preserve">only (the miss-rate channel).</w:t>
+      </w:r>
+    </w:p>
+    <w:p>
+      <w:pPr>
+        <w:pStyle w:val="Compact"/>
+        <w:numPr>
+          <w:ilvl w:val="0"/>
+          <w:numId w:val="1002"/>
+        </w:numPr>
+      </w:pPr>
+      <w:r>
+        <w:rPr>
+          <w:rStyle w:val="VerbatimChar"/>
+        </w:rPr>
+        <w:t xml:space="preserve">ani_from_hist</w:t>
+      </w:r>
+      <w:r>
+        <w:t xml:space="preserve"> </w:t>
+      </w:r>
+      <w:r>
+        <w:t xml:space="preserve">— uses the mismatch histogram renormalized by</w:t>
+      </w:r>
+      <w:r>
+        <w:t xml:space="preserve"> </w:t>
+      </w:r>
+      <w:r>
+        <w:rPr>
+          <w:rStyle w:val="VerbatimChar"/>
+        </w:rPr>
+        <w:t xml:space="preserve">P_found(a)</w:t>
+      </w:r>
+      <w:r>
+        <w:t xml:space="preserve">.</w:t>
+      </w:r>
+    </w:p>
+    <w:p>
+      <w:pPr>
+        <w:pStyle w:val="FirstParagraph"/>
+      </w:pPr>
+      <w:r>
+        <w:t xml:space="preserve">When the data are well behaved these two estimates agree; large divergence</w:t>
+      </w:r>
+      <w:r>
+        <w:t xml:space="preserve"> </w:t>
+      </w:r>
+      <w:r>
+        <w:t xml:space="preserve">signals either model misspecification or sparse data.</w:t>
+      </w:r>
+    </w:p>
+    <w:p>
+      <w:pPr>
+        <w:pStyle w:val="BodyText"/>
+      </w:pPr>
+      <w:r>
+        <w:rPr>
+          <w:b/>
+          <w:bCs/>
+        </w:rPr>
+        <w:t xml:space="preserve">Heterogeneous (gamma) model.</w:t>
+      </w:r>
+      <w:r>
+        <w:t xml:space="preserve"> </w:t>
+      </w:r>
+      <w:r>
+        <w:t xml:space="preserve">To account for rate heterogeneity, each</w:t>
+      </w:r>
+      <w:r>
+        <w:t xml:space="preserve"> </w:t>
+      </w:r>
+      <w:r>
+        <w:t xml:space="preserve">chained region receives a per-region rate multiplier</w:t>
+      </w:r>
+      <w:r>
+        <w:t xml:space="preserve"> </w:t>
+      </w:r>
+      <w:r>
+        <w:rPr>
+          <w:rStyle w:val="VerbatimChar"/>
+        </w:rPr>
+        <w:t xml:space="preserve">r ~ Gamma(α, α)</w:t>
+      </w:r>
+      <w:r>
+        <w:t xml:space="preserve"> </w:t>
+      </w:r>
+      <w:r>
+        <w:t xml:space="preserve">(mean 1,</w:t>
+      </w:r>
+      <w:r>
+        <w:t xml:space="preserve"> </w:t>
+      </w:r>
+      <w:r>
+        <w:t xml:space="preserve">shape α). Because rate variation acts at kilobase scale while a tag is ~30 bp,</w:t>
+      </w:r>
+      <w:r>
+        <w:t xml:space="preserve"> </w:t>
+      </w:r>
+      <w:r>
+        <w:t xml:space="preserve">all sites within one tag share the same</w:t>
+      </w:r>
+      <w:r>
+        <w:t xml:space="preserve"> </w:t>
+      </w:r>
+      <w:r>
+        <w:rPr>
+          <w:rStyle w:val="VerbatimChar"/>
+        </w:rPr>
+        <w:t xml:space="preserve">r</w:t>
+      </w:r>
+      <w:r>
+        <w:t xml:space="preserve">. Integrating</w:t>
+      </w:r>
+      <w:r>
+        <w:t xml:space="preserve"> </w:t>
+      </w:r>
+      <w:r>
+        <w:rPr>
+          <w:rStyle w:val="VerbatimChar"/>
+        </w:rPr>
+        <w:t xml:space="preserve">r</w:t>
+      </w:r>
+      <w:r>
+        <w:t xml:space="preserve"> </w:t>
+      </w:r>
+      <w:r>
+        <w:t xml:space="preserve">out converts the</w:t>
+      </w:r>
+      <w:r>
+        <w:t xml:space="preserve"> </w:t>
+      </w:r>
+      <w:r>
+        <w:t xml:space="preserve">mismatch count distribution into a negative binomial with two parameters: mean</w:t>
+      </w:r>
+      <w:r>
+        <w:t xml:space="preserve"> </w:t>
+      </w:r>
+      <w:r>
+        <w:t xml:space="preserve">divergence</w:t>
+      </w:r>
+      <w:r>
+        <w:t xml:space="preserve"> </w:t>
+      </w:r>
+      <w:r>
+        <w:rPr>
+          <w:rStyle w:val="VerbatimChar"/>
+        </w:rPr>
+        <w:t xml:space="preserve">d</w:t>
+      </w:r>
+      <w:r>
+        <w:t xml:space="preserve"> </w:t>
+      </w:r>
+      <w:r>
+        <w:t xml:space="preserve">and shape</w:t>
+      </w:r>
+      <w:r>
+        <w:t xml:space="preserve"> </w:t>
+      </w:r>
+      <w:r>
+        <w:rPr>
+          <w:rStyle w:val="VerbatimChar"/>
+        </w:rPr>
+        <w:t xml:space="preserve">α</w:t>
+      </w:r>
+      <w:r>
+        <w:t xml:space="preserve">. These are identifiable from the three histogram</w:t>
+      </w:r>
+      <w:r>
+        <w:t xml:space="preserve"> </w:t>
+      </w:r>
+      <w:r>
+        <w:t xml:space="preserve">degrees of freedom plus the miss count. Two guardrails are applied: the second</w:t>
+      </w:r>
+      <w:r>
+        <w:t xml:space="preserve"> </w:t>
+      </w:r>
+      <w:r>
+        <w:t xml:space="preserve">parameter is used only when the likelihood-ratio statistic exceeds 3.841, and</w:t>
+      </w:r>
+      <w:r>
+        <w:t xml:space="preserve"> </w:t>
+      </w:r>
+      <w:r>
+        <w:rPr>
+          <w:rStyle w:val="VerbatimChar"/>
+        </w:rPr>
+        <w:t xml:space="preserve">α</w:t>
+      </w:r>
+      <w:r>
+        <w:t xml:space="preserve"> </w:t>
+      </w:r>
+      <w:r>
+        <w:t xml:space="preserve">is clamped to</w:t>
+      </w:r>
+      <w:r>
+        <w:t xml:space="preserve"> </w:t>
+      </w:r>
+      <w:r>
+        <w:rPr>
+          <w:rStyle w:val="VerbatimChar"/>
+        </w:rPr>
+        <w:t xml:space="preserve">[0.1, 200]</w:t>
+      </w:r>
+      <w:r>
+        <w:t xml:space="preserve">.</w:t>
+      </w:r>
+    </w:p>
+    <w:p>
+      <w:pPr>
+        <w:pStyle w:val="BodyText"/>
+      </w:pPr>
+      <w:r>
+        <w:t xml:space="preserve">At the identifiability boundary with few surviving tags, the gamma shape and</w:t>
+      </w:r>
+      <w:r>
+        <w:t xml:space="preserve"> </w:t>
+      </w:r>
+      <w:r>
+        <w:t xml:space="preserve">mean couple and can overshoot by 4–10 ANI points in the mid-ANI range. The</w:t>
+      </w:r>
+      <w:r>
+        <w:t xml:space="preserve"> </w:t>
+      </w:r>
+      <w:r>
+        <w:t xml:space="preserve">shipped point estimate is therefore</w:t>
+      </w:r>
+      <w:r>
+        <w:t xml:space="preserve"> </w:t>
+      </w:r>
+      <w:r>
+        <w:rPr>
+          <w:b/>
+          <w:bCs/>
+        </w:rPr>
+        <w:t xml:space="preserve">gated</w:t>
+      </w:r>
+      <w:r>
+        <w:t xml:space="preserve">: report the homogeneous (uniform)</w:t>
+      </w:r>
+      <w:r>
+        <w:t xml:space="preserve"> </w:t>
+      </w:r>
+      <w:r>
+        <w:t xml:space="preserve">fit when</w:t>
+      </w:r>
+      <w:r>
+        <w:t xml:space="preserve"> </w:t>
+      </w:r>
+      <w:r>
+        <w:rPr>
+          <w:rStyle w:val="VerbatimChar"/>
+        </w:rPr>
+        <w:t xml:space="preserve">|ani_from_loss − ani_from_hist| &gt; 5</w:t>
+      </w:r>
+      <w:r>
+        <w:t xml:space="preserve"> </w:t>
+      </w:r>
+      <w:r>
+        <w:t xml:space="preserve">ANI points, otherwise report the</w:t>
+      </w:r>
+      <w:r>
+        <w:t xml:space="preserve"> </w:t>
+      </w:r>
+      <w:r>
+        <w:t xml:space="preserve">gamma fit. The threshold is an effect size, not a significance level; threshold</w:t>
+      </w:r>
+      <w:r>
+        <w:t xml:space="preserve"> </w:t>
+      </w:r>
+      <w:r>
+        <w:t xml:space="preserve">sweeps on the GTDB-ANIm training matrix show a flat optimum between 4.5 and 6</w:t>
+      </w:r>
+      <w:r>
+        <w:t xml:space="preserve"> </w:t>
+      </w:r>
+      <w:r>
+        <w:t xml:space="preserve">points. The gate fires on 5.5% of GTDB pairs, on all 15 mid-ANI pairs (where it</w:t>
+      </w:r>
+      <w:r>
+        <w:t xml:space="preserve"> </w:t>
+      </w:r>
+      <w:r>
+        <w:t xml:space="preserve">reduces gamma MAE from 4.48 to 1.42), and never on uniform-rate simulations,</w:t>
+      </w:r>
+      <w:r>
+        <w:t xml:space="preserve"> </w:t>
+      </w:r>
+      <w:r>
+        <w:t xml:space="preserve">mosaic simulations, or oral/gut same-species pairs, preserving gamma’s advantage</w:t>
+      </w:r>
+      <w:r>
+        <w:t xml:space="preserve"> </w:t>
+      </w:r>
+      <w:r>
+        <w:t xml:space="preserve">exactly where it is real.</w:t>
+      </w:r>
+    </w:p>
+    <w:p>
+      <w:pPr>
+        <w:pStyle w:val="BodyText"/>
+      </w:pPr>
+      <w:r>
+        <w:rPr>
+          <w:b/>
+          <w:bCs/>
+        </w:rPr>
+        <w:t xml:space="preserve">Flags.</w:t>
+      </w:r>
+      <w:r>
+        <w:t xml:space="preserve"> </w:t>
+      </w:r>
+      <w:r>
+        <w:t xml:space="preserve">The</w:t>
+      </w:r>
+      <w:r>
+        <w:t xml:space="preserve"> </w:t>
+      </w:r>
+      <w:r>
+        <w:rPr>
+          <w:rStyle w:val="VerbatimChar"/>
+        </w:rPr>
+        <w:t xml:space="preserve">flag</w:t>
+      </w:r>
+      <w:r>
+        <w:t xml:space="preserve"> </w:t>
+      </w:r>
+      <w:r>
+        <w:t xml:space="preserve">column is hierarchical:</w:t>
+      </w:r>
+    </w:p>
+    <w:p>
+      <w:pPr>
+        <w:pStyle w:val="Compact"/>
+        <w:numPr>
+          <w:ilvl w:val="0"/>
+          <w:numId w:val="1003"/>
+        </w:numPr>
+      </w:pPr>
+      <w:r>
+        <w:rPr>
+          <w:rStyle w:val="VerbatimChar"/>
+        </w:rPr>
+        <w:t xml:space="preserve">BELOW_DETECTION</w:t>
+      </w:r>
+      <w:r>
+        <w:t xml:space="preserve"> </w:t>
+      </w:r>
+      <w:r>
+        <w:t xml:space="preserve">— expected retention &lt; 0.20 (takes precedence).</w:t>
+      </w:r>
+    </w:p>
+    <w:p>
+      <w:pPr>
+        <w:pStyle w:val="Compact"/>
+        <w:numPr>
+          <w:ilvl w:val="0"/>
+          <w:numId w:val="1003"/>
+        </w:numPr>
+      </w:pPr>
+      <w:r>
+        <w:rPr>
+          <w:rStyle w:val="VerbatimChar"/>
+        </w:rPr>
+        <w:t xml:space="preserve">INCONSISTENT</w:t>
+      </w:r>
+      <w:r>
+        <w:t xml:space="preserve"> </w:t>
+      </w:r>
+      <w:r>
+        <w:t xml:space="preserve">— the gate fell back to the uniform model, or the chains carry</w:t>
+      </w:r>
+      <w:r>
+        <w:t xml:space="preserve"> </w:t>
+      </w:r>
+      <w:r>
+        <w:t xml:space="preserve">&gt; 0.5 rearrangement breakpoints per anchor (a structural statistic independent</w:t>
+      </w:r>
+      <w:r>
+        <w:t xml:space="preserve"> </w:t>
+      </w:r>
+      <w:r>
+        <w:t xml:space="preserve">of the chain-restricted likelihood denominator).</w:t>
+      </w:r>
+    </w:p>
+    <w:p>
+      <w:pPr>
+        <w:pStyle w:val="Compact"/>
+        <w:numPr>
+          <w:ilvl w:val="0"/>
+          <w:numId w:val="1003"/>
+        </w:numPr>
+      </w:pPr>
+      <w:r>
+        <w:rPr>
+          <w:rStyle w:val="VerbatimChar"/>
+        </w:rPr>
+        <w:t xml:space="preserve">ok</w:t>
+      </w:r>
+      <w:r>
+        <w:t xml:space="preserve"> </w:t>
+      </w:r>
+      <w:r>
+        <w:t xml:space="preserve">— otherwise.</w:t>
+      </w:r>
+    </w:p>
+    <w:p>
+      <w:pPr>
+        <w:pStyle w:val="FirstParagraph"/>
+      </w:pPr>
+      <w:r>
+        <w:t xml:space="preserve">The recalibrated flag never inverts its error ranking on any validation set</w:t>
+      </w:r>
+      <w:r>
+        <w:t xml:space="preserve"> </w:t>
+      </w:r>
+      <w:r>
+        <w:t xml:space="preserve">(kept vs flagged MAE: GTDB-ANIm 2.415 vs 4.153; oral/gut 0.514 vs 4.269;</w:t>
+      </w:r>
+      <w:r>
+        <w:t xml:space="preserve"> </w:t>
+      </w:r>
+      <w:r>
+        <w:t xml:space="preserve">mid-ANI 0.343 vs 1.113), at a disclosed cost in near-clonal sensitivity.</w:t>
+      </w:r>
+    </w:p>
+    <w:bookmarkEnd w:id="28"/>
+    <w:bookmarkStart w:id="29" w:name="X39919e213b71580968f061584f61586905cff88"/>
+    <w:p>
+      <w:pPr>
+        <w:pStyle w:val="Heading2"/>
+      </w:pPr>
+      <w:r>
+        <w:t xml:space="preserve">Supplementary Note 5 — The spatial-model negative result (identifiability analysis)</w:t>
+      </w:r>
+    </w:p>
+    <w:p>
+      <w:pPr>
+        <w:pStyle w:val="FirstParagraph"/>
+      </w:pPr>
+      <w:r>
+        <w:t xml:space="preserve">A mechanistic spatial-rate model was evaluated as an alternative to the ridge</w:t>
+      </w:r>
+      <w:r>
+        <w:t xml:space="preserve"> </w:t>
+      </w:r>
+      <w:r>
+        <w:t xml:space="preserve">calibration layer. The prototype was written in Python, tested on 19 exact-truth</w:t>
+      </w:r>
+      <w:r>
+        <w:t xml:space="preserve"> </w:t>
+      </w:r>
+      <w:r>
+        <w:t xml:space="preserve">mosaic simulations, and then evaluated on the GTDB-ANIm matrix.</w:t>
+      </w:r>
+    </w:p>
+    <w:p>
+      <w:pPr>
+        <w:pStyle w:val="BodyText"/>
+      </w:pPr>
+      <w:r>
+        <w:t xml:space="preserve">The residual bias decomposes into two terms. The first is an in-chain</w:t>
+      </w:r>
+      <w:r>
+        <w:t xml:space="preserve"> </w:t>
+      </w:r>
+      <w:r>
+        <w:t xml:space="preserve">distribution-family term: the asymptotic in-chain MAE is 2.25 for gamma and 1.25</w:t>
+      </w:r>
+      <w:r>
+        <w:t xml:space="preserve"> </w:t>
+      </w:r>
+      <w:r>
+        <w:t xml:space="preserve">for a capped grid NPMLE, so a nonparametric in-chain fit can fix at most</w:t>
+      </w:r>
+      <w:r>
+        <w:t xml:space="preserve"> </w:t>
+      </w:r>
+      <w:r>
+        <w:t xml:space="preserve">~0.1–0.2 ANI points of the GTDB MAE. The second is a coverage term: the</w:t>
+      </w:r>
+      <w:r>
+        <w:t xml:space="preserve"> </w:t>
+      </w:r>
+      <w:r>
+        <w:t xml:space="preserve">divergence of the unchained fraction is not identifiable from tag data, because</w:t>
+      </w:r>
+      <w:r>
+        <w:t xml:space="preserve"> </w:t>
+      </w:r>
+      <w:r>
+        <w:t xml:space="preserve">the out-of-chain anchor residual is approximately zero within multi-match noise</w:t>
+      </w:r>
+      <w:r>
+        <w:t xml:space="preserve"> </w:t>
+      </w:r>
+      <w:r>
+        <w:t xml:space="preserve">whether the unchained mass is saturated-divergent or accessory. Even an oracle</w:t>
+      </w:r>
+      <w:r>
+        <w:t xml:space="preserve"> </w:t>
+      </w:r>
+      <w:r>
+        <w:t xml:space="preserve">given the exact identity of the chained sample still errs by MAE 1.36 against</w:t>
+      </w:r>
+      <w:r>
+        <w:t xml:space="preserve"> </w:t>
+      </w:r>
+      <w:r>
+        <w:t xml:space="preserve">whole-genome truth.</w:t>
+      </w:r>
+    </w:p>
+    <w:p>
+      <w:pPr>
+        <w:pStyle w:val="BodyText"/>
+      </w:pPr>
+      <w:r>
+        <w:t xml:space="preserve">Candidates tested included AF-weighted mixtures, discrete mixtures,</w:t>
+      </w:r>
+      <w:r>
+        <w:t xml:space="preserve"> </w:t>
+      </w:r>
+      <w:r>
+        <w:t xml:space="preserve">ascertainment-aware tilts, capped NPMLE with and without likelihood-ratio gating,</w:t>
+      </w:r>
+      <w:r>
+        <w:t xml:space="preserve"> </w:t>
+      </w:r>
+      <w:r>
+        <w:t xml:space="preserve">and model averaging. None beats the gated homogeneous/gamma baseline while</w:t>
+      </w:r>
+      <w:r>
+        <w:t xml:space="preserve"> </w:t>
+      </w:r>
+      <w:r>
+        <w:t xml:space="preserve">holding all simulation gates. The raw estimator is therefore at its</w:t>
+      </w:r>
+      <w:r>
+        <w:t xml:space="preserve"> </w:t>
+      </w:r>
+      <w:r>
+        <w:t xml:space="preserve">identifiability floor at 4-enzyme tag density; this negative result is why the</w:t>
+      </w:r>
+      <w:r>
+        <w:t xml:space="preserve"> </w:t>
+      </w:r>
+      <w:r>
+        <w:t xml:space="preserve">shipped pipeline uses calibration, rather than a more elaborate likelihood, as</w:t>
+      </w:r>
+      <w:r>
+        <w:t xml:space="preserve"> </w:t>
+      </w:r>
+      <w:r>
+        <w:t xml:space="preserve">the real-genome correction layer.</w:t>
+      </w:r>
+    </w:p>
+    <w:bookmarkEnd w:id="29"/>
+    <w:bookmarkStart w:id="30" w:name="Xb1eb0d0077db50146ab5cb7a6cc963413c0d2d3"/>
+    <w:p>
+      <w:pPr>
+        <w:pStyle w:val="Heading2"/>
+      </w:pPr>
+      <w:r>
+        <w:t xml:space="preserve">Supplementary Note 6 — Ridge calibration protocol details</w:t>
+      </w:r>
+    </w:p>
+    <w:p>
+      <w:pPr>
+        <w:pStyle w:val="FirstParagraph"/>
+      </w:pPr>
+      <w:r>
+        <w:t xml:space="preserve">The v5 calibration model is ridge regression on nine Syn2bANI-internal features:</w:t>
+      </w:r>
+      <w:r>
+        <w:t xml:space="preserve"> </w:t>
+      </w:r>
+      <w:r>
+        <w:rPr>
+          <w:rStyle w:val="VerbatimChar"/>
+        </w:rPr>
+        <w:t xml:space="preserve">ani_gated</w:t>
+      </w:r>
+      <w:r>
+        <w:t xml:space="preserve">,</w:t>
+      </w:r>
+      <w:r>
+        <w:t xml:space="preserve"> </w:t>
+      </w:r>
+      <w:r>
+        <w:rPr>
+          <w:rStyle w:val="VerbatimChar"/>
+        </w:rPr>
+        <w:t xml:space="preserve">ani_uniform</w:t>
+      </w:r>
+      <w:r>
+        <w:t xml:space="preserve">,</w:t>
+      </w:r>
+      <w:r>
+        <w:t xml:space="preserve"> </w:t>
+      </w:r>
+      <w:r>
+        <w:rPr>
+          <w:rStyle w:val="VerbatimChar"/>
+        </w:rPr>
+        <w:t xml:space="preserve">af_query</w:t>
+      </w:r>
+      <w:r>
+        <w:t xml:space="preserve">,</w:t>
+      </w:r>
+      <w:r>
+        <w:t xml:space="preserve"> </w:t>
+      </w:r>
+      <w:r>
+        <w:rPr>
+          <w:rStyle w:val="VerbatimChar"/>
+        </w:rPr>
+        <w:t xml:space="preserve">af_reference</w:t>
+      </w:r>
+      <w:r>
+        <w:t xml:space="preserve">,</w:t>
+      </w:r>
+      <w:r>
+        <w:t xml:space="preserve"> </w:t>
+      </w:r>
+      <w:r>
+        <w:rPr>
+          <w:rStyle w:val="VerbatimChar"/>
+        </w:rPr>
+        <w:t xml:space="preserve">std_err</w:t>
+      </w:r>
+      <w:r>
+        <w:t xml:space="preserve">,</w:t>
+      </w:r>
+      <w:r>
+        <w:t xml:space="preserve"> </w:t>
+      </w:r>
+      <w:r>
+        <w:rPr>
+          <w:rStyle w:val="VerbatimChar"/>
+        </w:rPr>
+        <w:t xml:space="preserve">retention</w:t>
+      </w:r>
+      <w:r>
+        <w:t xml:space="preserve">,</w:t>
+      </w:r>
+      <w:r>
+        <w:t xml:space="preserve"> </w:t>
+      </w:r>
+      <w:r>
+        <w:rPr>
+          <w:rStyle w:val="VerbatimChar"/>
+        </w:rPr>
+        <w:t xml:space="preserve">n_anchors</w:t>
+      </w:r>
+      <w:r>
+        <w:t xml:space="preserve">,</w:t>
+      </w:r>
+      <w:r>
+        <w:t xml:space="preserve"> </w:t>
+      </w:r>
+      <w:r>
+        <w:rPr>
+          <w:rStyle w:val="VerbatimChar"/>
+        </w:rPr>
+        <w:t xml:space="preserve">n_chains</w:t>
+      </w:r>
+      <w:r>
+        <w:t xml:space="preserve">, and</w:t>
+      </w:r>
+      <w:r>
+        <w:t xml:space="preserve"> </w:t>
+      </w:r>
+      <w:r>
+        <w:rPr>
+          <w:rStyle w:val="VerbatimChar"/>
+        </w:rPr>
+        <w:t xml:space="preserve">n_tags_in_chains</w:t>
+      </w:r>
+      <w:r>
+        <w:t xml:space="preserve">. Features are median-imputed and</w:t>
+      </w:r>
+      <w:r>
+        <w:t xml:space="preserve"> </w:t>
+      </w:r>
+      <w:r>
+        <w:t xml:space="preserve">standardized; regularization strength</w:t>
+      </w:r>
+      <w:r>
+        <w:t xml:space="preserve"> </w:t>
+      </w:r>
+      <w:r>
+        <w:rPr>
+          <w:rStyle w:val="VerbatimChar"/>
+        </w:rPr>
+        <w:t xml:space="preserve">α = 10</w:t>
+      </w:r>
+      <w:r>
+        <w:t xml:space="preserve"> </w:t>
+      </w:r>
+      <w:r>
+        <w:t xml:space="preserve">is selected by inner</w:t>
+      </w:r>
+      <w:r>
+        <w:t xml:space="preserve"> </w:t>
+      </w:r>
+      <w:r>
+        <w:t xml:space="preserve">cross-validation with scikit-learn29.</w:t>
+      </w:r>
+    </w:p>
+    <w:p>
+      <w:pPr>
+        <w:pStyle w:val="BodyText"/>
+      </w:pPr>
+      <w:r>
+        <w:rPr>
+          <w:b/>
+          <w:bCs/>
+        </w:rPr>
+        <w:t xml:space="preserve">Training set.</w:t>
+      </w:r>
+      <w:r>
+        <w:t xml:space="preserve"> </w:t>
+      </w:r>
+      <w:r>
+        <w:t xml:space="preserve">2,520 ANIm-truth pairs (80–99.5% ANIm). This combines 2,053</w:t>
+      </w:r>
+      <w:r>
+        <w:t xml:space="preserve"> </w:t>
+      </w:r>
+      <w:r>
+        <w:t xml:space="preserve">finite pairs from a stratified 2,074-pair GTDB benchmark and 467 targeted</w:t>
+      </w:r>
+      <w:r>
+        <w:t xml:space="preserve"> </w:t>
+      </w:r>
+      <w:r>
+        <w:t xml:space="preserve">95.0–99.15% ANIm pairs selected by screening all 2.26 M same-genus GTDB-R207</w:t>
+      </w:r>
+      <w:r>
+        <w:t xml:space="preserve"> </w:t>
+      </w:r>
+      <w:r>
+        <w:t xml:space="preserve">representative pairs with skani and running dnadiff on 650 candidates. The</w:t>
+      </w:r>
+      <w:r>
+        <w:t xml:space="preserve"> </w:t>
+      </w:r>
+      <w:r>
+        <w:t xml:space="preserve">expanded set spans 607 species and 26 phyla and has zero genome-level overlap</w:t>
+      </w:r>
+      <w:r>
+        <w:t xml:space="preserve"> </w:t>
+      </w:r>
+      <w:r>
+        <w:t xml:space="preserve">with the original 2,074-pair set.</w:t>
+      </w:r>
+    </w:p>
+    <w:p>
+      <w:pPr>
+        <w:pStyle w:val="BodyText"/>
+      </w:pPr>
+      <w:r>
+        <w:rPr>
+          <w:b/>
+          <w:bCs/>
+        </w:rPr>
+        <w:t xml:space="preserve">Validation.</w:t>
+      </w:r>
+      <w:r>
+        <w:t xml:space="preserve"> </w:t>
+      </w:r>
+      <w:r>
+        <w:t xml:space="preserve">Band-holdout cross-validation: each of the four ANI bands</w:t>
+      </w:r>
+      <w:r>
+        <w:t xml:space="preserve"> </w:t>
+      </w:r>
+      <w:r>
+        <w:t xml:space="preserve">(80–85, 85–90, 90–95, 95–99) is predicted by a model trained on the other three</w:t>
+      </w:r>
+      <w:r>
+        <w:t xml:space="preserve"> </w:t>
+      </w:r>
+      <w:r>
+        <w:t xml:space="preserve">only. Training rows are shuffled with a fixed seed before CV because the inner</w:t>
+      </w:r>
+      <w:r>
+        <w:t xml:space="preserve"> </w:t>
+      </w:r>
+      <w:r>
+        <w:t xml:space="preserve">KFold of the ridge CV is order-sensitive.</w:t>
+      </w:r>
+    </w:p>
+    <w:p>
+      <w:pPr>
+        <w:pStyle w:val="BodyText"/>
+      </w:pPr>
+      <w:r>
+        <w:rPr>
+          <w:b/>
+          <w:bCs/>
+        </w:rPr>
+        <w:t xml:space="preserve">Model comparisons.</w:t>
+      </w:r>
+      <w:r>
+        <w:t xml:space="preserve"> </w:t>
+      </w:r>
+      <w:r>
+        <w:t xml:space="preserve">An expanded 18-feature variant and a gradient-boosted</w:t>
+      </w:r>
+      <w:r>
+        <w:t xml:space="preserve"> </w:t>
+      </w:r>
+      <w:r>
+        <w:t xml:space="preserve">regressor on the same features were evaluated and rejected: nonlinearity buys</w:t>
+      </w:r>
+      <w:r>
+        <w:t xml:space="preserve"> </w:t>
+      </w:r>
+      <w:r>
+        <w:t xml:space="preserve">nothing at</w:t>
+      </w:r>
+      <w:r>
+        <w:t xml:space="preserve"> </w:t>
+      </w:r>
+      <w:r>
+        <w:rPr>
+          <w:rStyle w:val="VerbatimChar"/>
+        </w:rPr>
+        <w:t xml:space="preserve">n ≈ 2,500</w:t>
+      </w:r>
+      <w:r>
+        <w:t xml:space="preserve">, and the expanded feature set degrades out-of-distribution</w:t>
+      </w:r>
+      <w:r>
+        <w:t xml:space="preserve"> </w:t>
+      </w:r>
+      <w:r>
+        <w:t xml:space="preserve">on near-clonal pairs. Seed spread over 5 seeds is ≤ 0.0015 MAE.</w:t>
+      </w:r>
+    </w:p>
+    <w:p>
+      <w:pPr>
+        <w:pStyle w:val="BodyText"/>
+      </w:pPr>
+      <w:r>
+        <w:rPr>
+          <w:b/>
+          <w:bCs/>
+        </w:rPr>
+        <w:t xml:space="preserve">Learning curve.</w:t>
+      </w:r>
+      <w:r>
+        <w:t xml:space="preserve"> </w:t>
+      </w:r>
+      <w:r>
+        <w:t xml:space="preserve">Subsampling the 2,520-pair training matrix at 492/984/1,476</w:t>
+      </w:r>
+      <w:r>
+        <w:t xml:space="preserve"> </w:t>
+      </w:r>
+      <w:r>
+        <w:t xml:space="preserve">and 1,969 pairs gives band-holdout CV MAE of 0.952, 0.902, 0.887, and 0.893,</w:t>
+      </w:r>
+      <w:r>
+        <w:t xml:space="preserve"> </w:t>
+      </w:r>
+      <w:r>
+        <w:t xml:space="preserve">respectively (Supplementary Note 2); the linear model plateaus at ~1,500 pairs.</w:t>
+      </w:r>
+    </w:p>
+    <w:p>
+      <w:pPr>
+        <w:pStyle w:val="BodyText"/>
+      </w:pPr>
+      <w:r>
+        <w:rPr>
+          <w:b/>
+          <w:bCs/>
+        </w:rPr>
+        <w:t xml:space="preserve">Deployment.</w:t>
+      </w:r>
+      <w:r>
+        <w:t xml:space="preserve"> </w:t>
+      </w:r>
+      <w:r>
+        <w:t xml:space="preserve">The model ships as a versioned JSON file containing ridge</w:t>
+      </w:r>
+      <w:r>
+        <w:t xml:space="preserve"> </w:t>
+      </w:r>
+      <w:r>
+        <w:t xml:space="preserve">weights, scaling parameters, and feature order; it is embedded in the binary and</w:t>
+      </w:r>
+      <w:r>
+        <w:t xml:space="preserve"> </w:t>
+      </w:r>
+      <w:r>
+        <w:t xml:space="preserve">evaluated at runtime in &lt; 1 µs. All feature matrices were regenerated with the</w:t>
+      </w:r>
+      <w:r>
+        <w:t xml:space="preserve"> </w:t>
+      </w:r>
+      <w:r>
+        <w:t xml:space="preserve">post-rescue binary before training, so there is no version skew between the</w:t>
+      </w:r>
+      <w:r>
+        <w:t xml:space="preserve"> </w:t>
+      </w:r>
+      <w:r>
+        <w:t xml:space="preserve">shipped estimator and the deployed model. Calibrated output is a separate column</w:t>
+      </w:r>
+      <w:r>
+        <w:t xml:space="preserve"> </w:t>
+      </w:r>
+      <w:r>
+        <w:t xml:space="preserve">(</w:t>
+      </w:r>
+      <w:r>
+        <w:rPr>
+          <w:rStyle w:val="VerbatimChar"/>
+        </w:rPr>
+        <w:t xml:space="preserve">--calibrate</w:t>
+      </w:r>
+      <w:r>
+        <w:t xml:space="preserve">); it returns no value on</w:t>
+      </w:r>
+      <w:r>
+        <w:t xml:space="preserve"> </w:t>
+      </w:r>
+      <w:r>
+        <w:rPr>
+          <w:rStyle w:val="VerbatimChar"/>
+        </w:rPr>
+        <w:t xml:space="preserve">BELOW_DETECTION</w:t>
+      </w:r>
+      <w:r>
+        <w:t xml:space="preserve"> </w:t>
+      </w:r>
+      <w:r>
+        <w:t xml:space="preserve">pairs rather than</w:t>
+      </w:r>
+      <w:r>
+        <w:t xml:space="preserve"> </w:t>
+      </w:r>
+      <w:r>
+        <w:t xml:space="preserve">extrapolating.</w:t>
+      </w:r>
+    </w:p>
+    <w:p>
+      <w:pPr>
+        <w:pStyle w:val="BodyText"/>
+      </w:pPr>
+      <w:r>
+        <w:rPr>
+          <w:b/>
+          <w:bCs/>
+        </w:rPr>
+        <w:t xml:space="preserve">Hybrid estimator threshold.</w:t>
+      </w:r>
+      <w:r>
+        <w:t xml:space="preserve"> </w:t>
+      </w:r>
+      <w:r>
+        <w:t xml:space="preserve">The raw gated estimate is more accurate than the</w:t>
+      </w:r>
+      <w:r>
+        <w:t xml:space="preserve"> </w:t>
+      </w:r>
+      <w:r>
+        <w:t xml:space="preserve">calibrated estimate in the near-clonal regime, whereas calibration is essential</w:t>
+      </w:r>
+      <w:r>
+        <w:t xml:space="preserve"> </w:t>
+      </w:r>
+      <w:r>
+        <w:t xml:space="preserve">at lower ANI. A hybrid rule was therefore evaluated: report the raw gated</w:t>
+      </w:r>
+      <w:r>
+        <w:t xml:space="preserve"> </w:t>
+      </w:r>
+      <w:r>
+        <w:t xml:space="preserve">estimate when it exceeds a threshold</w:t>
+      </w:r>
+      <w:r>
+        <w:t xml:space="preserve"> </w:t>
+      </w:r>
+      <w:r>
+        <w:rPr>
+          <w:rStyle w:val="VerbatimChar"/>
+        </w:rPr>
+        <w:t xml:space="preserve">t</w:t>
+      </w:r>
+      <w:r>
+        <w:t xml:space="preserve">, otherwise report the calibrated</w:t>
+      </w:r>
+      <w:r>
+        <w:t xml:space="preserve"> </w:t>
+      </w:r>
+      <w:r>
+        <w:t xml:space="preserve">estimate. The threshold was chosen by overall MAE on the unified 80–100% ANIm</w:t>
+      </w:r>
+      <w:r>
+        <w:t xml:space="preserve"> </w:t>
+      </w:r>
+      <w:r>
+        <w:t xml:space="preserve">benchmark (43,334 held-out GTDB-R207 pairs plus 727 high-ANI test pairs,</w:t>
+      </w:r>
+      <w:r>
+        <w:t xml:space="preserve"> </w:t>
+      </w:r>
+      <w:r>
+        <w:t xml:space="preserve">n = 40,629 pairs with non-missing raw and calibrated values):</w:t>
+      </w:r>
+    </w:p>
+    <w:tbl>
+      <w:tblPr>
+        <w:tblStyle w:val="Table"/>
+        <w:tblW w:type="auto" w:w="0"/>
+        <w:tblLook w:firstRow="1" w:lastRow="0" w:firstColumn="0" w:lastColumn="0" w:noHBand="0" w:noVBand="0" w:val="0020"/>
+      </w:tblPr>
+      <w:tblGrid>
+        <w:gridCol w:w="1980"/>
+        <w:gridCol w:w="1980"/>
+        <w:gridCol w:w="1980"/>
+        <w:gridCol w:w="1980"/>
+      </w:tblGrid>
+      <w:tr>
+        <w:trPr>
+          <w:tblHeader w:val="on"/>
+        </w:trPr>
+        <w:tc>
+          <w:tcPr/>
+          <w:p>
+            <w:pPr>
+              <w:pStyle w:val="Compact"/>
+            </w:pPr>
+            <w:r>
+              <w:t xml:space="preserve">Threshold</w:t>
+            </w:r>
+            <w:r>
+              <w:t xml:space="preserve"> </w:t>
+            </w:r>
+            <w:r>
+              <w:rPr>
+                <w:rStyle w:val="VerbatimChar"/>
+              </w:rPr>
+              <w:t xml:space="preserve">t</w:t>
+            </w:r>
+            <w:r>
+              <w:t xml:space="preserve"> </w:t>
+            </w:r>
+            <w:r>
+              <w:t xml:space="preserve">(%)</w:t>
+            </w:r>
+          </w:p>
+        </w:tc>
+        <w:tc>
+          <w:tcPr/>
+          <w:p>
+            <w:pPr>
+              <w:pStyle w:val="Compact"/>
+              <w:jc w:val="right"/>
+            </w:pPr>
+            <w:r>
+              <w:t xml:space="preserve">n</w:t>
+            </w:r>
+          </w:p>
+        </w:tc>
+        <w:tc>
+          <w:tcPr/>
+          <w:p>
+            <w:pPr>
+              <w:pStyle w:val="Compact"/>
+              <w:jc w:val="right"/>
+            </w:pPr>
+            <w:r>
+              <w:t xml:space="preserve">MAE</w:t>
+            </w:r>
+          </w:p>
+        </w:tc>
+        <w:tc>
+          <w:tcPr/>
+          <w:p>
+            <w:pPr>
+              <w:pStyle w:val="Compact"/>
+              <w:jc w:val="right"/>
+            </w:pPr>
+            <w:r>
+              <w:t xml:space="preserve">Bias</w:t>
+            </w:r>
+          </w:p>
+        </w:tc>
+      </w:tr>
+      <w:tr>
+        <w:tc>
+          <w:tcPr/>
+          <w:p>
+            <w:pPr>
+              <w:pStyle w:val="Compact"/>
+            </w:pPr>
+            <w:r>
+              <w:t xml:space="preserve">95.0</w:t>
+            </w:r>
+          </w:p>
+        </w:tc>
+        <w:tc>
+          <w:tcPr/>
+          <w:p>
+            <w:pPr>
+              <w:pStyle w:val="Compact"/>
+              <w:jc w:val="right"/>
+            </w:pPr>
+            <w:r>
+              <w:t xml:space="preserve">40,629</w:t>
+            </w:r>
+          </w:p>
+        </w:tc>
+        <w:tc>
+          <w:tcPr/>
+          <w:p>
+            <w:pPr>
+              <w:pStyle w:val="Compact"/>
+              <w:jc w:val="right"/>
+            </w:pPr>
+            <w:r>
+              <w:t xml:space="preserve">0.7065</w:t>
+            </w:r>
+          </w:p>
+        </w:tc>
+        <w:tc>
+          <w:tcPr/>
+          <w:p>
+            <w:pPr>
+              <w:pStyle w:val="Compact"/>
+              <w:jc w:val="right"/>
+            </w:pPr>
+            <w:r>
+              <w:t xml:space="preserve">+0.0284</w:t>
+            </w:r>
+          </w:p>
+        </w:tc>
+      </w:tr>
+      <w:tr>
+        <w:tc>
+          <w:tcPr/>
+          <w:p>
+            <w:pPr>
+              <w:pStyle w:val="Compact"/>
+            </w:pPr>
+            <w:r>
+              <w:t xml:space="preserve">96.0</w:t>
+            </w:r>
+          </w:p>
+        </w:tc>
+        <w:tc>
+          <w:tcPr/>
+          <w:p>
+            <w:pPr>
+              <w:pStyle w:val="Compact"/>
+              <w:jc w:val="right"/>
+            </w:pPr>
+            <w:r>
+              <w:t xml:space="preserve">40,629</w:t>
+            </w:r>
+          </w:p>
+        </w:tc>
+        <w:tc>
+          <w:tcPr/>
+          <w:p>
+            <w:pPr>
+              <w:pStyle w:val="Compact"/>
+              <w:jc w:val="right"/>
+            </w:pPr>
+            <w:r>
+              <w:t xml:space="preserve">0.6443</w:t>
+            </w:r>
+          </w:p>
+        </w:tc>
+        <w:tc>
+          <w:tcPr/>
+          <w:p>
+            <w:pPr>
+              <w:pStyle w:val="Compact"/>
+              <w:jc w:val="right"/>
+            </w:pPr>
+            <w:r>
+              <w:t xml:space="preserve">−0.0699</w:t>
+            </w:r>
+          </w:p>
+        </w:tc>
+      </w:tr>
+      <w:tr>
+        <w:tc>
+          <w:tcPr/>
+          <w:p>
+            <w:pPr>
+              <w:pStyle w:val="Compact"/>
+            </w:pPr>
+            <w:r>
+              <w:t xml:space="preserve">97.0</w:t>
+            </w:r>
+          </w:p>
+        </w:tc>
+        <w:tc>
+          <w:tcPr/>
+          <w:p>
+            <w:pPr>
+              <w:pStyle w:val="Compact"/>
+              <w:jc w:val="right"/>
+            </w:pPr>
+            <w:r>
+              <w:t xml:space="preserve">40,629</w:t>
+            </w:r>
+          </w:p>
+        </w:tc>
+        <w:tc>
+          <w:tcPr/>
+          <w:p>
+            <w:pPr>
+              <w:pStyle w:val="Compact"/>
+              <w:jc w:val="right"/>
+            </w:pPr>
+            <w:r>
+              <w:t xml:space="preserve">0.6189</w:t>
+            </w:r>
+          </w:p>
+        </w:tc>
+        <w:tc>
+          <w:tcPr/>
+          <w:p>
+            <w:pPr>
+              <w:pStyle w:val="Compact"/>
+              <w:jc w:val="right"/>
+            </w:pPr>
+            <w:r>
+              <w:t xml:space="preserve">−0.1089</w:t>
+            </w:r>
+          </w:p>
+        </w:tc>
+      </w:tr>
+      <w:tr>
+        <w:tc>
+          <w:tcPr/>
+          <w:p>
+            <w:pPr>
+              <w:pStyle w:val="Compact"/>
+            </w:pPr>
+            <w:r>
+              <w:t xml:space="preserve">97.5</w:t>
+            </w:r>
+          </w:p>
+        </w:tc>
+        <w:tc>
+          <w:tcPr/>
+          <w:p>
+            <w:pPr>
+              <w:pStyle w:val="Compact"/>
+              <w:jc w:val="right"/>
+            </w:pPr>
+            <w:r>
+              <w:t xml:space="preserve">40,629</w:t>
+            </w:r>
+          </w:p>
+        </w:tc>
+        <w:tc>
+          <w:tcPr/>
+          <w:p>
+            <w:pPr>
+              <w:pStyle w:val="Compact"/>
+              <w:jc w:val="right"/>
+            </w:pPr>
+            <w:r>
+              <w:t xml:space="preserve">0.6161</w:t>
+            </w:r>
+          </w:p>
+        </w:tc>
+        <w:tc>
+          <w:tcPr/>
+          <w:p>
+            <w:pPr>
+              <w:pStyle w:val="Compact"/>
+              <w:jc w:val="right"/>
+            </w:pPr>
+            <w:r>
+              <w:t xml:space="preserve">−0.1133</w:t>
+            </w:r>
+          </w:p>
+        </w:tc>
+      </w:tr>
+      <w:tr>
+        <w:tc>
+          <w:tcPr/>
+          <w:p>
+            <w:pPr>
+              <w:pStyle w:val="Compact"/>
+            </w:pPr>
+            <w:r>
+              <w:t xml:space="preserve">98.0</w:t>
+            </w:r>
+          </w:p>
+        </w:tc>
+        <w:tc>
+          <w:tcPr/>
+          <w:p>
+            <w:pPr>
+              <w:pStyle w:val="Compact"/>
+              <w:jc w:val="right"/>
+            </w:pPr>
+            <w:r>
+              <w:t xml:space="preserve">40,629</w:t>
+            </w:r>
+          </w:p>
+        </w:tc>
+        <w:tc>
+          <w:tcPr/>
+          <w:p>
+            <w:pPr>
+              <w:pStyle w:val="Compact"/>
+              <w:jc w:val="right"/>
+            </w:pPr>
+            <w:r>
+              <w:t xml:space="preserve">0.6146</w:t>
+            </w:r>
+          </w:p>
+        </w:tc>
+        <w:tc>
+          <w:tcPr/>
+          <w:p>
+            <w:pPr>
+              <w:pStyle w:val="Compact"/>
+              <w:jc w:val="right"/>
+            </w:pPr>
+            <w:r>
+              <w:t xml:space="preserve">−0.1154</w:t>
+            </w:r>
+          </w:p>
+        </w:tc>
+      </w:tr>
+      <w:tr>
+        <w:tc>
+          <w:tcPr/>
+          <w:p>
+            <w:pPr>
+              <w:pStyle w:val="Compact"/>
+            </w:pPr>
+            <w:r>
+              <w:t xml:space="preserve">98.5</w:t>
+            </w:r>
+          </w:p>
+        </w:tc>
+        <w:tc>
+          <w:tcPr/>
+          <w:p>
+            <w:pPr>
+              <w:pStyle w:val="Compact"/>
+              <w:jc w:val="right"/>
+            </w:pPr>
+            <w:r>
+              <w:t xml:space="preserve">40,629</w:t>
+            </w:r>
+          </w:p>
+        </w:tc>
+        <w:tc>
+          <w:tcPr/>
+          <w:p>
+            <w:pPr>
+              <w:pStyle w:val="Compact"/>
+              <w:jc w:val="right"/>
+            </w:pPr>
+            <w:r>
+              <w:t xml:space="preserve">0.6144</w:t>
+            </w:r>
+          </w:p>
+        </w:tc>
+        <w:tc>
+          <w:tcPr/>
+          <w:p>
+            <w:pPr>
+              <w:pStyle w:val="Compact"/>
+              <w:jc w:val="right"/>
+            </w:pPr>
+            <w:r>
+              <w:t xml:space="preserve">−0.1169</w:t>
+            </w:r>
+          </w:p>
+        </w:tc>
+      </w:tr>
+      <w:tr>
+        <w:tc>
+          <w:tcPr/>
+          <w:p>
+            <w:pPr>
+              <w:pStyle w:val="Compact"/>
+            </w:pPr>
+            <w:r>
+              <w:t xml:space="preserve">99.0</w:t>
+            </w:r>
+          </w:p>
+        </w:tc>
+        <w:tc>
+          <w:tcPr/>
+          <w:p>
+            <w:pPr>
+              <w:pStyle w:val="Compact"/>
+              <w:jc w:val="right"/>
+            </w:pPr>
+            <w:r>
+              <w:t xml:space="preserve">40,629</w:t>
+            </w:r>
+          </w:p>
+        </w:tc>
+        <w:tc>
+          <w:tcPr/>
+          <w:p>
+            <w:pPr>
+              <w:pStyle w:val="Compact"/>
+              <w:jc w:val="right"/>
+            </w:pPr>
+            <w:r>
+              <w:t xml:space="preserve">0.6140</w:t>
+            </w:r>
+          </w:p>
+        </w:tc>
+        <w:tc>
+          <w:tcPr/>
+          <w:p>
+            <w:pPr>
+              <w:pStyle w:val="Compact"/>
+              <w:jc w:val="right"/>
+            </w:pPr>
+            <w:r>
+              <w:t xml:space="preserve">−0.1191</w:t>
+            </w:r>
+          </w:p>
+        </w:tc>
+      </w:tr>
+      <w:tr>
+        <w:tc>
+          <w:tcPr/>
+          <w:p>
+            <w:pPr>
+              <w:pStyle w:val="Compact"/>
+            </w:pPr>
+            <w:r>
+              <w:t xml:space="preserve">99.5</w:t>
+            </w:r>
+          </w:p>
+        </w:tc>
+        <w:tc>
+          <w:tcPr/>
+          <w:p>
+            <w:pPr>
+              <w:pStyle w:val="Compact"/>
+              <w:jc w:val="right"/>
+            </w:pPr>
+            <w:r>
+              <w:t xml:space="preserve">40,629</w:t>
+            </w:r>
+          </w:p>
+        </w:tc>
+        <w:tc>
+          <w:tcPr/>
+          <w:p>
+            <w:pPr>
+              <w:pStyle w:val="Compact"/>
+              <w:jc w:val="right"/>
+            </w:pPr>
+            <w:r>
+              <w:t xml:space="preserve">0.6145</w:t>
+            </w:r>
+          </w:p>
+        </w:tc>
+        <w:tc>
+          <w:tcPr/>
+          <w:p>
+            <w:pPr>
+              <w:pStyle w:val="Compact"/>
+              <w:jc w:val="right"/>
+            </w:pPr>
+            <w:r>
+              <w:t xml:space="preserve">−0.1211</w:t>
+            </w:r>
+          </w:p>
+        </w:tc>
+      </w:tr>
+    </w:tbl>
+    <w:p>
+      <w:pPr>
+        <w:pStyle w:val="BodyText"/>
+      </w:pPr>
+      <w:r>
+        <w:t xml:space="preserve">MAE decreases sharply from 95% to 97%, then plateaus; 98% was selected as the</w:t>
+      </w:r>
+      <w:r>
+        <w:t xml:space="preserve"> </w:t>
+      </w:r>
+      <w:r>
+        <w:t xml:space="preserve">operating threshold because it lies on the plateau while keeping the calibrated</w:t>
+      </w:r>
+      <w:r>
+        <w:t xml:space="preserve"> </w:t>
+      </w:r>
+      <w:r>
+        <w:t xml:space="preserve">estimate active for the broadest range of strain-level pairs. The hybrid rule is</w:t>
+      </w:r>
+      <w:r>
+        <w:t xml:space="preserve"> </w:t>
+      </w:r>
+      <w:r>
+        <w:t xml:space="preserve">not sensitive to the exact threshold in the 97–99% window.</w:t>
+      </w:r>
+    </w:p>
+    <w:bookmarkEnd w:id="30"/>
+    <w:bookmarkEnd w:id="31"/>
     <w:sectPr>
       <w:footnotePr>
         <w:numRestart w:val="eachSect"/>
@@ -2515,123 +4719,120 @@
       </w:pPr>
     </w:lvl>
   </w:abstractNum>
-  <w:abstractNum w:abstractNumId="99731">
-    <w:nsid w:val="00A99731"/>
+  <w:abstractNum w:abstractNumId="991">
+    <w:nsid w:val="0000A991"/>
     <w:multiLevelType w:val="multilevel"/>
     <w:lvl w:ilvl="0">
-      <w:start w:val="1"/>
-      <w:numFmt w:val="lowerLetter"/>
-      <w:lvlText w:val="(%1)"/>
+      <w:numFmt w:val="bullet"/>
+      <w:lvlText w:val=""/>
       <w:lvlJc w:val="left"/>
       <w:pPr>
         <w:ind w:left="720" w:hanging="360"/>
       </w:pPr>
+      <w:rPr>
+        <w:rFonts w:ascii="Symbol" w:hAnsi="Symbol" w:cs="Symbol" w:hint="default"/>
+      </w:rPr>
     </w:lvl>
     <w:lvl w:ilvl="1">
-      <w:start w:val="1"/>
-      <w:numFmt w:val="lowerLetter"/>
-      <w:lvlText w:val="(%2)"/>
+      <w:numFmt w:val="bullet"/>
+      <w:lvlText w:val="o"/>
       <w:lvlJc w:val="left"/>
       <w:pPr>
         <w:ind w:left="1440" w:hanging="360"/>
       </w:pPr>
+      <w:rPr>
+        <w:rFonts w:ascii="Courier New" w:hAnsi="Courier New" w:cs="Courier New" w:hint="default"/>
+      </w:rPr>
     </w:lvl>
     <w:lvl w:ilvl="2">
-      <w:start w:val="1"/>
-      <w:numFmt w:val="lowerLetter"/>
-      <w:lvlText w:val="(%3)"/>
+      <w:numFmt w:val="bullet"/>
+      <w:lvlText w:val=""/>
       <w:lvlJc w:val="left"/>
       <w:pPr>
         <w:ind w:left="2160" w:hanging="360"/>
       </w:pPr>
+      <w:rPr>
+        <w:rFonts w:ascii="Wingdings" w:hAnsi="Wingdings" w:cs="Wingdings" w:hint="default"/>
+      </w:rPr>
     </w:lvl>
     <w:lvl w:ilvl="3">
-      <w:start w:val="1"/>
-      <w:numFmt w:val="lowerLetter"/>
-      <w:lvlText w:val="(%4)"/>
+      <w:numFmt w:val="bullet"/>
+      <w:lvlText w:val=""/>
       <w:lvlJc w:val="left"/>
       <w:pPr>
         <w:ind w:left="2880" w:hanging="360"/>
       </w:pPr>
+      <w:rPr>
+        <w:rFonts w:ascii="Symbol" w:hAnsi="Symbol" w:cs="Symbol" w:hint="default"/>
+      </w:rPr>
     </w:lvl>
     <w:lvl w:ilvl="4">
-      <w:start w:val="1"/>
-      <w:numFmt w:val="lowerLetter"/>
-      <w:lvlText w:val="(%5)"/>
+      <w:numFmt w:val="bullet"/>
+      <w:lvlText w:val="o"/>
       <w:lvlJc w:val="left"/>
       <w:pPr>
         <w:ind w:left="3600" w:hanging="360"/>
       </w:pPr>
+      <w:rPr>
+        <w:rFonts w:ascii="Courier New" w:hAnsi="Courier New" w:cs="Courier New" w:hint="default"/>
+      </w:rPr>
     </w:lvl>
     <w:lvl w:ilvl="5">
-      <w:start w:val="1"/>
-      <w:numFmt w:val="lowerLetter"/>
-      <w:lvlText w:val="(%6)"/>
+      <w:numFmt w:val="bullet"/>
+      <w:lvlText w:val=""/>
       <w:lvlJc w:val="left"/>
       <w:pPr>
         <w:ind w:left="4320" w:hanging="360"/>
       </w:pPr>
+      <w:rPr>
+        <w:rFonts w:ascii="Wingdings" w:hAnsi="Wingdings" w:cs="Wingdings" w:hint="default"/>
+      </w:rPr>
     </w:lvl>
     <w:lvl w:ilvl="6">
-      <w:start w:val="1"/>
-      <w:numFmt w:val="lowerLetter"/>
-      <w:lvlText w:val="(%7)"/>
+      <w:numFmt w:val="bullet"/>
+      <w:lvlText w:val=""/>
       <w:lvlJc w:val="left"/>
       <w:pPr>
         <w:ind w:left="5040" w:hanging="360"/>
       </w:pPr>
+      <w:rPr>
+        <w:rFonts w:ascii="Symbol" w:hAnsi="Symbol" w:cs="Symbol" w:hint="default"/>
+      </w:rPr>
     </w:lvl>
     <w:lvl w:ilvl="7">
-      <w:start w:val="1"/>
-      <w:numFmt w:val="lowerLetter"/>
-      <w:lvlText w:val="(%8)"/>
+      <w:numFmt w:val="bullet"/>
+      <w:lvlText w:val="o"/>
       <w:lvlJc w:val="left"/>
       <w:pPr>
         <w:ind w:left="5760" w:hanging="360"/>
       </w:pPr>
+      <w:rPr>
+        <w:rFonts w:ascii="Courier New" w:hAnsi="Courier New" w:cs="Courier New" w:hint="default"/>
+      </w:rPr>
     </w:lvl>
     <w:lvl w:ilvl="8">
-      <w:start w:val="1"/>
-      <w:numFmt w:val="lowerLetter"/>
-      <w:lvlText w:val="(%9)"/>
+      <w:numFmt w:val="bullet"/>
+      <w:lvlText w:val=""/>
       <w:lvlJc w:val="left"/>
       <w:pPr>
         <w:ind w:left="6480" w:hanging="360"/>
       </w:pPr>
+      <w:rPr>
+        <w:rFonts w:ascii="Wingdings" w:hAnsi="Wingdings" w:cs="Wingdings" w:hint="default"/>
+      </w:rPr>
     </w:lvl>
   </w:abstractNum>
   <w:num w:numId="1000">
     <w:abstractNumId w:val="990"/>
   </w:num>
   <w:num w:numId="1001">
-    <w:abstractNumId w:val="99731"/>
-    <w:lvlOverride w:ilvl="0">
-      <w:startOverride w:val="1"/>
-    </w:lvlOverride>
-    <w:lvlOverride w:ilvl="1">
-      <w:startOverride w:val="1"/>
-    </w:lvlOverride>
-    <w:lvlOverride w:ilvl="2">
-      <w:startOverride w:val="1"/>
-    </w:lvlOverride>
-    <w:lvlOverride w:ilvl="3">
-      <w:startOverride w:val="1"/>
-    </w:lvlOverride>
-    <w:lvlOverride w:ilvl="4">
-      <w:startOverride w:val="1"/>
-    </w:lvlOverride>
-    <w:lvlOverride w:ilvl="5">
-      <w:startOverride w:val="1"/>
-    </w:lvlOverride>
-    <w:lvlOverride w:ilvl="6">
-      <w:startOverride w:val="1"/>
-    </w:lvlOverride>
-    <w:lvlOverride w:ilvl="7">
-      <w:startOverride w:val="1"/>
-    </w:lvlOverride>
-    <w:lvlOverride w:ilvl="8">
-      <w:startOverride w:val="1"/>
-    </w:lvlOverride>
+    <w:abstractNumId w:val="991"/>
+  </w:num>
+  <w:num w:numId="1002">
+    <w:abstractNumId w:val="991"/>
+  </w:num>
+  <w:num w:numId="1003">
+    <w:abstractNumId w:val="991"/>
   </w:num>
 </w:numbering>
 </file>

</xml_diff>

<commit_message>
Add cagA/vacA cross-validation, SV-macrolide association, and assembly-level discordant review to cagPAI case study
</commit_message>
<xml_diff>
--- a/paper/manuscript/SUPPLEMENTARY.docx
+++ b/paper/manuscript/SUPPLEMENTARY.docx
@@ -2,7 +2,7 @@
 <file path=word/document.xml><?xml version="1.0" encoding="utf-8"?>
 <w:document xmlns:w="http://schemas.openxmlformats.org/wordprocessingml/2006/main" xmlns:m="http://schemas.openxmlformats.org/officeDocument/2006/math" xmlns:r="http://schemas.openxmlformats.org/officeDocument/2006/relationships" xmlns:o="urn:schemas-microsoft-com:office:office" xmlns:v="urn:schemas-microsoft-com:vml" xmlns:w10="urn:schemas-microsoft-com:office:word" xmlns:a="http://schemas.openxmlformats.org/drawingml/2006/main" xmlns:pic="http://schemas.openxmlformats.org/drawingml/2006/picture" xmlns:wp="http://schemas.openxmlformats.org/drawingml/2006/wordprocessingDrawing">
   <w:body>
-    <w:bookmarkStart w:id="31" w:name="Xc3fcc6656da83e08d67075bda016bbdc5c3d5f9"/>
+    <w:bookmarkStart w:id="33" w:name="Xc3fcc6656da83e08d67075bda016bbdc5c3d5f9"/>
     <w:p>
       <w:pPr>
         <w:pStyle w:val="Heading1"/>
@@ -884,13 +884,13 @@
       </w:r>
     </w:p>
     <w:bookmarkEnd w:id="19"/>
-    <w:bookmarkStart w:id="20" w:name="Xc623022311fbb09c3c20527babe29df8a9f5177"/>
+    <w:bookmarkStart w:id="20" w:name="X036b523739c3c15f73a1dc39e49b0c2d1a11095"/>
     <w:p>
       <w:pPr>
         <w:pStyle w:val="Heading2"/>
       </w:pPr>
       <w:r>
-        <w:t xml:space="preserve">Supplementary Figure S12 — Circular-origin artifact filtering in</w:t>
+        <w:t xml:space="preserve">Supplementary Figure S12 — Circular-origin artifact filtering and sensitivity in</w:t>
       </w:r>
       <w:r>
         <w:t xml:space="preserve"> </w:t>
@@ -931,7 +931,7 @@
         <w:pStyle w:val="BodyText"/>
       </w:pPr>
       <w:r>
-        <w:t xml:space="preserve">Before and after counts of the four extended cagPAI states. Filtering</w:t>
+        <w:t xml:space="preserve">(a, b) Before and after counts of the four extended cagPAI states. Filtering</w:t>
       </w:r>
       <w:r>
         <w:t xml:space="preserve"> </w:t>
@@ -995,11 +995,161 @@
         <w:t xml:space="preserve"> </w:t>
       </w:r>
       <w:r>
-        <w:t xml:space="preserve">chromosome.</w:t>
+        <w:t xml:space="preserve">chromosome. (c) Number of</w:t>
+      </w:r>
+      <w:r>
+        <w:t xml:space="preserve"> </w:t>
+      </w:r>
+      <w:r>
+        <w:rPr>
+          <w:rStyle w:val="VerbatimChar"/>
+        </w:rPr>
+        <w:t xml:space="preserve">complete_rearranged</w:t>
+      </w:r>
+      <w:r>
+        <w:t xml:space="preserve"> </w:t>
+      </w:r>
+      <w:r>
+        <w:t xml:space="preserve">genomes</w:t>
+      </w:r>
+      <w:r>
+        <w:t xml:space="preserve"> </w:t>
+      </w:r>
+      <w:r>
+        <w:t xml:space="preserve">and number of excluded calls as a function of the artifact-span threshold.</w:t>
+      </w:r>
+      <w:r>
+        <w:t xml:space="preserve"> </w:t>
+      </w:r>
+      <w:r>
+        <w:t xml:space="preserve">(d) Crude association p-value for cagPAI rearrangement (GC vs NAG) across the</w:t>
+      </w:r>
+      <w:r>
+        <w:t xml:space="preserve"> </w:t>
+      </w:r>
+      <w:r>
+        <w:t xml:space="preserve">same threshold range; the association remains non-significant throughout.</w:t>
+      </w:r>
+      <w:r>
+        <w:t xml:space="preserve"> </w:t>
+      </w:r>
+      <w:r>
+        <w:t xml:space="preserve">Source data:</w:t>
+      </w:r>
+      <w:r>
+        <w:t xml:space="preserve"> </w:t>
+      </w:r>
+      <w:r>
+        <w:rPr>
+          <w:rStyle w:val="VerbatimChar"/>
+        </w:rPr>
+        <w:t xml:space="preserve">case_studies/h_pylori_cagpai/results/cagpai_artifact_threshold_sensitivity.tsv</w:t>
+      </w:r>
+      <w:r>
+        <w:t xml:space="preserve">.</w:t>
       </w:r>
     </w:p>
     <w:bookmarkEnd w:id="20"/>
-    <w:bookmarkStart w:id="21" w:name="Xb79c9bf020a903d02af45c43b651fa33d5c8e03"/>
+    <w:bookmarkStart w:id="21" w:name="X9bcd9681cf91de330db65b00bbd2ec37b4121ea"/>
+    <w:p>
+      <w:pPr>
+        <w:pStyle w:val="Heading2"/>
+      </w:pPr>
+      <w:r>
+        <w:t xml:space="preserve">Supplementary Figure S13 — Lineage-stratified association forest plot for</w:t>
+      </w:r>
+      <w:r>
+        <w:t xml:space="preserve"> </w:t>
+      </w:r>
+      <w:r>
+        <w:rPr>
+          <w:i/>
+          <w:iCs/>
+        </w:rPr>
+        <w:t xml:space="preserve">H. pylori</w:t>
+      </w:r>
+      <w:r>
+        <w:t xml:space="preserve"> </w:t>
+      </w:r>
+      <w:r>
+        <w:t xml:space="preserve">metadata tests</w:t>
+      </w:r>
+    </w:p>
+    <w:p>
+      <w:pPr>
+        <w:pStyle w:val="FirstParagraph"/>
+      </w:pPr>
+      <w:r>
+        <w:t xml:space="preserve">(</w:t>
+      </w:r>
+      <w:r>
+        <w:rPr>
+          <w:rStyle w:val="VerbatimChar"/>
+        </w:rPr>
+        <w:t xml:space="preserve">case_studies/h_pylori_cagpai/results/metadata_assoc/fig_forest_stratified.png</w:t>
+      </w:r>
+      <w:r>
+        <w:t xml:space="preserve">)</w:t>
+      </w:r>
+    </w:p>
+    <w:p>
+      <w:pPr>
+        <w:pStyle w:val="BodyText"/>
+      </w:pPr>
+      <w:r>
+        <w:t xml:space="preserve">Crude (circle) and FastBAPS-lineage-stratified Mantel–Haenszel (triangle) odds</w:t>
+      </w:r>
+      <w:r>
+        <w:t xml:space="preserve"> </w:t>
+      </w:r>
+      <w:r>
+        <w:t xml:space="preserve">ratios with 95% CIs for the headline association tests: cagPAI presence vs cagA</w:t>
+      </w:r>
+      <w:r>
+        <w:t xml:space="preserve"> </w:t>
+      </w:r>
+      <w:r>
+        <w:t xml:space="preserve">detection and vacA s1/i1/m1 (top, strong and lineage-robust), and SV burden vs</w:t>
+      </w:r>
+      <w:r>
+        <w:t xml:space="preserve"> </w:t>
+      </w:r>
+      <w:r>
+        <w:t xml:space="preserve">macrolide resistance (bottom, crude OR ≈ 2.8 collapsing to ≈ 1.3 after</w:t>
+      </w:r>
+      <w:r>
+        <w:t xml:space="preserve"> </w:t>
+      </w:r>
+      <w:r>
+        <w:t xml:space="preserve">stratification). The macrolide rows straddle OR = 1, visually demonstrating the</w:t>
+      </w:r>
+      <w:r>
+        <w:t xml:space="preserve"> </w:t>
+      </w:r>
+      <w:r>
+        <w:t xml:space="preserve">lineage confounding described in the main text.</w:t>
+      </w:r>
+      <w:r>
+        <w:t xml:space="preserve"> </w:t>
+      </w:r>
+      <w:r>
+        <w:t xml:space="preserve">Source data:</w:t>
+      </w:r>
+      <w:r>
+        <w:t xml:space="preserve"> </w:t>
+      </w:r>
+      <w:r>
+        <w:rPr>
+          <w:rStyle w:val="VerbatimChar"/>
+        </w:rPr>
+        <w:t xml:space="preserve">case_studies/h_pylori_cagpai/results/metadata_assoc/association_tests.tsv</w:t>
+      </w:r>
+      <w:r>
+        <w:t xml:space="preserve">.</w:t>
+      </w:r>
+    </w:p>
+    <w:bookmarkEnd w:id="21"/>
+    <w:bookmarkStart w:id="22" w:name="Xb79c9bf020a903d02af45c43b651fa33d5c8e03"/>
     <w:p>
       <w:pPr>
         <w:pStyle w:val="Heading2"/>
@@ -1325,8 +1475,8 @@
         </w:tc>
       </w:tr>
     </w:tbl>
-    <w:bookmarkEnd w:id="21"/>
-    <w:bookmarkStart w:id="22" w:name="X1d1a5b89358b225a547ea735bc71b43678427f8"/>
+    <w:bookmarkEnd w:id="22"/>
+    <w:bookmarkStart w:id="23" w:name="X1d1a5b89358b225a547ea735bc71b43678427f8"/>
     <w:p>
       <w:pPr>
         <w:pStyle w:val="Heading2"/>
@@ -1640,8 +1790,8 @@
         </w:tc>
       </w:tr>
     </w:tbl>
-    <w:bookmarkEnd w:id="22"/>
-    <w:bookmarkStart w:id="23" w:name="X791b5905c3cbd3b80da6a27b4633a9dc2eda705"/>
+    <w:bookmarkEnd w:id="23"/>
+    <w:bookmarkStart w:id="24" w:name="X791b5905c3cbd3b80da6a27b4633a9dc2eda705"/>
     <w:p>
       <w:pPr>
         <w:pStyle w:val="Heading2"/>
@@ -1850,14 +2000,14 @@
         </w:tc>
       </w:tr>
     </w:tbl>
-    <w:bookmarkEnd w:id="23"/>
-    <w:bookmarkStart w:id="24" w:name="X4c50bc026c5465e49f035988aa0fe4463cd86fc"/>
+    <w:bookmarkEnd w:id="24"/>
+    <w:bookmarkStart w:id="25" w:name="X71ce6833d789d49d6251da69c06300f4d632d80"/>
     <w:p>
       <w:pPr>
         <w:pStyle w:val="Heading2"/>
       </w:pPr>
       <w:r>
-        <w:t xml:space="preserve">Supplementary Table S4 — Lineage-stratified cagPAI–disease associations</w:t>
+        <w:t xml:space="preserve">Supplementary Table S4 — Crude and lineage-stratified cagPAI–disease associations</w:t>
       </w:r>
     </w:p>
     <w:p>
@@ -1905,13 +2055,25 @@
         <w:t xml:space="preserve"> </w:t>
       </w:r>
       <w:r>
-        <w:t xml:space="preserve">but the association is confounded by FastBAPS lineage. Cochran–Mantel–Haenszel</w:t>
-      </w:r>
-      <w:r>
-        <w:t xml:space="preserve"> </w:t>
-      </w:r>
-      <w:r>
-        <w:t xml:space="preserve">statistics stratified by FastBAPS lineage:</w:t>
+        <w:t xml:space="preserve">but the association is confounded by FastBAPS lineage. The table below reports</w:t>
+      </w:r>
+      <w:r>
+        <w:t xml:space="preserve"> </w:t>
+      </w:r>
+      <w:r>
+        <w:t xml:space="preserve">crude odds ratios (Woolf 95% CI), χ² p-values, Cochran–Mantel–Haenszel (CMH)</w:t>
+      </w:r>
+      <w:r>
+        <w:t xml:space="preserve"> </w:t>
+      </w:r>
+      <w:r>
+        <w:t xml:space="preserve">p-values and Mantel–Haenszel odds ratios, and Breslow–Day tests of homogeneity</w:t>
+      </w:r>
+      <w:r>
+        <w:t xml:space="preserve"> </w:t>
+      </w:r>
+      <w:r>
+        <w:t xml:space="preserve">across FastBAPS strata.</w:t>
       </w:r>
     </w:p>
     <w:tbl>
@@ -1922,13 +2084,18 @@
         <w:tblLook w:firstRow="1" w:lastRow="0" w:firstColumn="0" w:lastColumn="0" w:noHBand="0" w:noVBand="0" w:val="0020"/>
       </w:tblPr>
       <w:tblGrid>
-        <w:gridCol w:w="990"/>
-        <w:gridCol w:w="990"/>
-        <w:gridCol w:w="990"/>
-        <w:gridCol w:w="990"/>
-        <w:gridCol w:w="1320"/>
-        <w:gridCol w:w="1320"/>
-        <w:gridCol w:w="1320"/>
+        <w:gridCol w:w="552"/>
+        <w:gridCol w:w="736"/>
+        <w:gridCol w:w="552"/>
+        <w:gridCol w:w="552"/>
+        <w:gridCol w:w="552"/>
+        <w:gridCol w:w="552"/>
+        <w:gridCol w:w="736"/>
+        <w:gridCol w:w="736"/>
+        <w:gridCol w:w="736"/>
+        <w:gridCol w:w="736"/>
+        <w:gridCol w:w="736"/>
+        <w:gridCol w:w="736"/>
       </w:tblGrid>
       <w:tr>
         <w:trPr>
@@ -1950,6 +2117,18 @@
           <w:p>
             <w:pPr>
               <w:pStyle w:val="Compact"/>
+              <w:jc w:val="right"/>
+            </w:pPr>
+            <w:r>
+              <w:t xml:space="preserve">n</w:t>
+            </w:r>
+          </w:p>
+        </w:tc>
+        <w:tc>
+          <w:tcPr/>
+          <w:p>
+            <w:pPr>
+              <w:pStyle w:val="Compact"/>
             </w:pPr>
             <w:r>
               <w:t xml:space="preserve">Case</w:t>
@@ -1983,9 +2162,32 @@
           <w:p>
             <w:pPr>
               <w:pStyle w:val="Compact"/>
+            </w:pPr>
+            <w:r>
+              <w:t xml:space="preserve">crude OR (95% CI)</w:t>
+            </w:r>
+          </w:p>
+        </w:tc>
+        <w:tc>
+          <w:tcPr/>
+          <w:p>
+            <w:pPr>
+              <w:pStyle w:val="Compact"/>
               <w:jc w:val="right"/>
             </w:pPr>
             <w:r>
+              <w:t xml:space="preserve">crude p</w:t>
+            </w:r>
+          </w:p>
+        </w:tc>
+        <w:tc>
+          <w:tcPr/>
+          <w:p>
+            <w:pPr>
+              <w:pStyle w:val="Compact"/>
+              <w:jc w:val="right"/>
+            </w:pPr>
+            <w:r>
               <w:t xml:space="preserve">CMH χ²</w:t>
             </w:r>
           </w:p>
@@ -1998,7 +2200,7 @@
               <w:jc w:val="right"/>
             </w:pPr>
             <w:r>
-              <w:t xml:space="preserve">p</w:t>
+              <w:t xml:space="preserve">CMH p</w:t>
             </w:r>
           </w:p>
         </w:tc>
@@ -2012,6 +2214,26 @@
             <w:r>
               <w:t xml:space="preserve">OR_MH</w:t>
             </w:r>
+          </w:p>
+        </w:tc>
+        <w:tc>
+          <w:tcPr/>
+          <w:p>
+            <w:pPr>
+              <w:pStyle w:val="Compact"/>
+              <w:jc w:val="right"/>
+            </w:pPr>
+            <w:r>
+              <w:t xml:space="preserve">Breslow–Day p</w:t>
+            </w:r>
+          </w:p>
+        </w:tc>
+        <w:tc>
+          <w:tcPr/>
+          <w:p>
+            <w:pPr>
+              <w:pStyle w:val="Compact"/>
+            </w:pPr>
           </w:p>
         </w:tc>
       </w:tr>
@@ -2032,6 +2254,18 @@
           <w:p>
             <w:pPr>
               <w:pStyle w:val="Compact"/>
+              <w:jc w:val="right"/>
+            </w:pPr>
+            <w:r>
+              <w:t xml:space="preserve">285</w:t>
+            </w:r>
+          </w:p>
+        </w:tc>
+        <w:tc>
+          <w:tcPr/>
+          <w:p>
+            <w:pPr>
+              <w:pStyle w:val="Compact"/>
             </w:pPr>
             <w:r>
               <w:t xml:space="preserve">GC</w:t>
@@ -2065,10 +2299,21 @@
           <w:p>
             <w:pPr>
               <w:pStyle w:val="Compact"/>
+            </w:pPr>
+            <w:r>
+              <w:t xml:space="preserve">2.16 (1.13–4.13)</w:t>
+            </w:r>
+          </w:p>
+        </w:tc>
+        <w:tc>
+          <w:tcPr/>
+          <w:p>
+            <w:pPr>
+              <w:pStyle w:val="Compact"/>
               <w:jc w:val="right"/>
             </w:pPr>
             <w:r>
-              <w:t xml:space="preserve">1.4019</w:t>
+              <w:t xml:space="preserve">0.018</w:t>
             </w:r>
           </w:p>
         </w:tc>
@@ -2080,7 +2325,7 @@
               <w:jc w:val="right"/>
             </w:pPr>
             <w:r>
-              <w:t xml:space="preserve">0.2364</w:t>
+              <w:t xml:space="preserve">2.406</w:t>
             </w:r>
           </w:p>
         </w:tc>
@@ -2092,8 +2337,40 @@
               <w:jc w:val="right"/>
             </w:pPr>
             <w:r>
-              <w:t xml:space="preserve">1.599</w:t>
-            </w:r>
+              <w:t xml:space="preserve">0.121</w:t>
+            </w:r>
+          </w:p>
+        </w:tc>
+        <w:tc>
+          <w:tcPr/>
+          <w:p>
+            <w:pPr>
+              <w:pStyle w:val="Compact"/>
+              <w:jc w:val="right"/>
+            </w:pPr>
+            <w:r>
+              <w:t xml:space="preserve">1.70</w:t>
+            </w:r>
+          </w:p>
+        </w:tc>
+        <w:tc>
+          <w:tcPr/>
+          <w:p>
+            <w:pPr>
+              <w:pStyle w:val="Compact"/>
+              <w:jc w:val="right"/>
+            </w:pPr>
+            <w:r>
+              <w:t xml:space="preserve">0.005</w:t>
+            </w:r>
+          </w:p>
+        </w:tc>
+        <w:tc>
+          <w:tcPr/>
+          <w:p>
+            <w:pPr>
+              <w:pStyle w:val="Compact"/>
+            </w:pPr>
           </w:p>
         </w:tc>
       </w:tr>
@@ -2114,6 +2391,18 @@
           <w:p>
             <w:pPr>
               <w:pStyle w:val="Compact"/>
+              <w:jc w:val="right"/>
+            </w:pPr>
+            <w:r>
+              <w:t xml:space="preserve">230</w:t>
+            </w:r>
+          </w:p>
+        </w:tc>
+        <w:tc>
+          <w:tcPr/>
+          <w:p>
+            <w:pPr>
+              <w:pStyle w:val="Compact"/>
             </w:pPr>
             <w:r>
               <w:t xml:space="preserve">GC</w:t>
@@ -2147,10 +2436,21 @@
           <w:p>
             <w:pPr>
               <w:pStyle w:val="Compact"/>
+            </w:pPr>
+            <w:r>
+              <w:t xml:space="preserve">1.11 (0.64–1.93)</w:t>
+            </w:r>
+          </w:p>
+        </w:tc>
+        <w:tc>
+          <w:tcPr/>
+          <w:p>
+            <w:pPr>
+              <w:pStyle w:val="Compact"/>
               <w:jc w:val="right"/>
             </w:pPr>
             <w:r>
-              <w:t xml:space="preserve">0.8028</w:t>
+              <w:t xml:space="preserve">0.700</w:t>
             </w:r>
           </w:p>
         </w:tc>
@@ -2162,7 +2462,7 @@
               <w:jc w:val="right"/>
             </w:pPr>
             <w:r>
-              <w:t xml:space="preserve">0.3703</w:t>
+              <w:t xml:space="preserve">0.315</w:t>
             </w:r>
           </w:p>
         </w:tc>
@@ -2174,8 +2474,40 @@
               <w:jc w:val="right"/>
             </w:pPr>
             <w:r>
-              <w:t xml:space="preserve">1.294</w:t>
-            </w:r>
+              <w:t xml:space="preserve">0.574</w:t>
+            </w:r>
+          </w:p>
+        </w:tc>
+        <w:tc>
+          <w:tcPr/>
+          <w:p>
+            <w:pPr>
+              <w:pStyle w:val="Compact"/>
+              <w:jc w:val="right"/>
+            </w:pPr>
+            <w:r>
+              <w:t xml:space="preserve">1.17</w:t>
+            </w:r>
+          </w:p>
+        </w:tc>
+        <w:tc>
+          <w:tcPr/>
+          <w:p>
+            <w:pPr>
+              <w:pStyle w:val="Compact"/>
+              <w:jc w:val="right"/>
+            </w:pPr>
+            <w:r>
+              <w:t xml:space="preserve">0.153</w:t>
+            </w:r>
+          </w:p>
+        </w:tc>
+        <w:tc>
+          <w:tcPr/>
+          <w:p>
+            <w:pPr>
+              <w:pStyle w:val="Compact"/>
+            </w:pPr>
           </w:p>
         </w:tc>
       </w:tr>
@@ -2196,6 +2528,18 @@
           <w:p>
             <w:pPr>
               <w:pStyle w:val="Compact"/>
+              <w:jc w:val="right"/>
+            </w:pPr>
+            <w:r>
+              <w:t xml:space="preserve">528</w:t>
+            </w:r>
+          </w:p>
+        </w:tc>
+        <w:tc>
+          <w:tcPr/>
+          <w:p>
+            <w:pPr>
+              <w:pStyle w:val="Compact"/>
             </w:pPr>
             <w:r>
               <w:t xml:space="preserve">GC/IM</w:t>
@@ -2229,10 +2573,21 @@
           <w:p>
             <w:pPr>
               <w:pStyle w:val="Compact"/>
+            </w:pPr>
+            <w:r>
+              <w:t xml:space="preserve">1.14 (0.73–1.78)</w:t>
+            </w:r>
+          </w:p>
+        </w:tc>
+        <w:tc>
+          <w:tcPr/>
+          <w:p>
+            <w:pPr>
+              <w:pStyle w:val="Compact"/>
               <w:jc w:val="right"/>
             </w:pPr>
             <w:r>
-              <w:t xml:space="preserve">1.5539</w:t>
+              <w:t xml:space="preserve">0.576</w:t>
             </w:r>
           </w:p>
         </w:tc>
@@ -2244,7 +2599,7 @@
               <w:jc w:val="right"/>
             </w:pPr>
             <w:r>
-              <w:t xml:space="preserve">0.2126</w:t>
+              <w:t xml:space="preserve">1.864</w:t>
             </w:r>
           </w:p>
         </w:tc>
@@ -2256,8 +2611,40 @@
               <w:jc w:val="right"/>
             </w:pPr>
             <w:r>
-              <w:t xml:space="preserve">1.389</w:t>
-            </w:r>
+              <w:t xml:space="preserve">0.172</w:t>
+            </w:r>
+          </w:p>
+        </w:tc>
+        <w:tc>
+          <w:tcPr/>
+          <w:p>
+            <w:pPr>
+              <w:pStyle w:val="Compact"/>
+              <w:jc w:val="right"/>
+            </w:pPr>
+            <w:r>
+              <w:t xml:space="preserve">1.39</w:t>
+            </w:r>
+          </w:p>
+        </w:tc>
+        <w:tc>
+          <w:tcPr/>
+          <w:p>
+            <w:pPr>
+              <w:pStyle w:val="Compact"/>
+              <w:jc w:val="right"/>
+            </w:pPr>
+            <w:r>
+              <w:t xml:space="preserve">0.021</w:t>
+            </w:r>
+          </w:p>
+        </w:tc>
+        <w:tc>
+          <w:tcPr/>
+          <w:p>
+            <w:pPr>
+              <w:pStyle w:val="Compact"/>
+            </w:pPr>
           </w:p>
         </w:tc>
       </w:tr>
@@ -2278,6 +2665,18 @@
           <w:p>
             <w:pPr>
               <w:pStyle w:val="Compact"/>
+              <w:jc w:val="right"/>
+            </w:pPr>
+            <w:r>
+              <w:t xml:space="preserve">432</w:t>
+            </w:r>
+          </w:p>
+        </w:tc>
+        <w:tc>
+          <w:tcPr/>
+          <w:p>
+            <w:pPr>
+              <w:pStyle w:val="Compact"/>
             </w:pPr>
             <w:r>
               <w:t xml:space="preserve">GC/IM</w:t>
@@ -2311,10 +2710,21 @@
           <w:p>
             <w:pPr>
               <w:pStyle w:val="Compact"/>
+            </w:pPr>
+            <w:r>
+              <w:t xml:space="preserve">1.02 (0.68–1.52)</w:t>
+            </w:r>
+          </w:p>
+        </w:tc>
+        <w:tc>
+          <w:tcPr/>
+          <w:p>
+            <w:pPr>
+              <w:pStyle w:val="Compact"/>
               <w:jc w:val="right"/>
             </w:pPr>
             <w:r>
-              <w:t xml:space="preserve">0.4664</w:t>
+              <w:t xml:space="preserve">0.928</w:t>
             </w:r>
           </w:p>
         </w:tc>
@@ -2326,7 +2736,7 @@
               <w:jc w:val="right"/>
             </w:pPr>
             <w:r>
-              <w:t xml:space="preserve">0.4946</w:t>
+              <w:t xml:space="preserve">0.004</w:t>
             </w:r>
           </w:p>
         </w:tc>
@@ -2338,8 +2748,40 @@
               <w:jc w:val="right"/>
             </w:pPr>
             <w:r>
-              <w:t xml:space="preserve">1.152</w:t>
-            </w:r>
+              <w:t xml:space="preserve">0.951</w:t>
+            </w:r>
+          </w:p>
+        </w:tc>
+        <w:tc>
+          <w:tcPr/>
+          <w:p>
+            <w:pPr>
+              <w:pStyle w:val="Compact"/>
+              <w:jc w:val="right"/>
+            </w:pPr>
+            <w:r>
+              <w:t xml:space="preserve">1.01</w:t>
+            </w:r>
+          </w:p>
+        </w:tc>
+        <w:tc>
+          <w:tcPr/>
+          <w:p>
+            <w:pPr>
+              <w:pStyle w:val="Compact"/>
+              <w:jc w:val="right"/>
+            </w:pPr>
+            <w:r>
+              <w:t xml:space="preserve">0.780</w:t>
+            </w:r>
+          </w:p>
+        </w:tc>
+        <w:tc>
+          <w:tcPr/>
+          <w:p>
+            <w:pPr>
+              <w:pStyle w:val="Compact"/>
+            </w:pPr>
           </w:p>
         </w:tc>
       </w:tr>
@@ -2349,34 +2791,1085 @@
         <w:pStyle w:val="BodyText"/>
       </w:pPr>
       <w:r>
-        <w:t xml:space="preserve">None of the lineage-stratified associations is significant. Full per-stratum</w:t>
-      </w:r>
-      <w:r>
-        <w:t xml:space="preserve"> </w:t>
-      </w:r>
-      <w:r>
-        <w:t xml:space="preserve">counts:</w:t>
-      </w:r>
-      <w:r>
-        <w:t xml:space="preserve"> </w:t>
-      </w:r>
-      <w:r>
-        <w:rPr>
-          <w:rStyle w:val="VerbatimChar"/>
-        </w:rPr>
-        <w:t xml:space="preserve">case_studies/h_pylori_cagpai/results/cagpai_association_stratified.tsv</w:t>
+        <w:t xml:space="preserve">Only the first contrast (presence, GC vs NAG) showed a nominally significant</w:t>
+      </w:r>
+      <w:r>
+        <w:t xml:space="preserve"> </w:t>
+      </w:r>
+      <w:r>
+        <w:t xml:space="preserve">crude association. After FastBAPS stratification the CMH p-value is 0.12 and the</w:t>
+      </w:r>
+      <w:r>
+        <w:t xml:space="preserve"> </w:t>
+      </w:r>
+      <w:r>
+        <w:t xml:space="preserve">Mantel–Haenszel OR is 1.70. The Breslow–Day test is significant (p = 0.005),</w:t>
+      </w:r>
+      <w:r>
+        <w:t xml:space="preserve"> </w:t>
+      </w:r>
+      <w:r>
+        <w:t xml:space="preserve">indicating that the OR is heterogeneous across lineages. The other three</w:t>
+      </w:r>
+      <w:r>
+        <w:t xml:space="preserve"> </w:t>
+      </w:r>
+      <w:r>
+        <w:t xml:space="preserve">contrasts were not significant even in the crude analysis. Discordant-cell</w:t>
+      </w:r>
+      <w:r>
+        <w:t xml:space="preserve"> </w:t>
+      </w:r>
+      <w:r>
+        <w:t xml:space="preserve">counts are small: only 15 cagPAI-negative gastric-cancer genomes exist across</w:t>
+      </w:r>
+      <w:r>
+        <w:t xml:space="preserve"> </w:t>
+      </w:r>
+      <w:r>
+        <w:t xml:space="preserve">the whole cohort, distributed as 4 / 9 / 1 / 1 / 0 across FastBAPS L2–L6. Thus</w:t>
+      </w:r>
+      <w:r>
+        <w:t xml:space="preserve"> </w:t>
+      </w:r>
+      <w:r>
+        <w:t xml:space="preserve">the presence association is attenuated but not abolished by lineage</w:t>
+      </w:r>
+      <w:r>
+        <w:t xml:space="preserve"> </w:t>
+      </w:r>
+      <w:r>
+        <w:t xml:space="preserve">stratification, and the current design is under-powered to resolve it.</w:t>
+      </w:r>
+    </w:p>
+    <w:p>
+      <w:pPr>
+        <w:pStyle w:val="BodyText"/>
+      </w:pPr>
+      <w:r>
+        <w:t xml:space="preserve">Rearrangement-state associations were also evaluated across artifact-span</w:t>
+      </w:r>
+      <w:r>
+        <w:t xml:space="preserve"> </w:t>
+      </w:r>
+      <w:r>
+        <w:t xml:space="preserve">thresholds from 0.20 to 0.50; p-values remained non-significant throughout</w:t>
+      </w:r>
+      <w:r>
+        <w:t xml:space="preserve"> </w:t>
+      </w:r>
+      <w:r>
+        <w:t xml:space="preserve">(</w:t>
+      </w:r>
+      <w:r>
+        <w:rPr>
+          <w:rStyle w:val="VerbatimChar"/>
+        </w:rPr>
+        <w:t xml:space="preserve">case_studies/h_pylori_cagpai/results/cagpai_artifact_threshold_sensitivity.tsv</w:t>
+      </w:r>
+      <w:r>
+        <w:t xml:space="preserve">).</w:t>
+      </w:r>
+      <w:r>
+        <w:t xml:space="preserve"> </w:t>
+      </w:r>
+      <w:r>
+        <w:t xml:space="preserve">Full per-stratum counts and CMH diagnostics:</w:t>
+      </w:r>
+      <w:r>
+        <w:t xml:space="preserve"> </w:t>
+      </w:r>
+      <w:r>
+        <w:rPr>
+          <w:rStyle w:val="VerbatimChar"/>
+        </w:rPr>
+        <w:t xml:space="preserve">case_studies/h_pylori_cagpai/results/cagpai_association_crude_and_stratified.tsv</w:t>
       </w:r>
       <w:r>
         <w:t xml:space="preserve">.</w:t>
       </w:r>
     </w:p>
-    <w:bookmarkEnd w:id="24"/>
-    <w:bookmarkStart w:id="25" w:name="Xe280e63292e65e7cc12ffc5dad24d6a06d19d0f"/>
+    <w:bookmarkEnd w:id="25"/>
+    <w:bookmarkStart w:id="26" w:name="X0ddedd77d100d0b74814f89ea378e8d5927a82e"/>
     <w:p>
       <w:pPr>
         <w:pStyle w:val="Heading2"/>
       </w:pPr>
       <w:r>
+        <w:t xml:space="preserve">Supplementary Table S5 — cagPAI cross-validation against independent cagA/vacA typing and SV–resistance associations</w:t>
+      </w:r>
+    </w:p>
+    <w:p>
+      <w:pPr>
+        <w:pStyle w:val="FirstParagraph"/>
+      </w:pPr>
+      <w:r>
+        <w:t xml:space="preserve">Five hundred and twenty-eight isolates were merged with collaborator-generated</w:t>
+      </w:r>
+      <w:r>
+        <w:t xml:space="preserve"> </w:t>
+      </w:r>
+      <w:r>
+        <w:t xml:space="preserve">metadata (cagA detection with EPIYA genotyping and genome-level rescue, vacA</w:t>
+      </w:r>
+      <w:r>
+        <w:t xml:space="preserve"> </w:t>
+      </w:r>
+      <w:r>
+        <w:t xml:space="preserve">s/i/m typing, CARD resistance hits; merge losses: none). Crude odds ratios</w:t>
+      </w:r>
+      <w:r>
+        <w:t xml:space="preserve"> </w:t>
+      </w:r>
+      <w:r>
+        <w:t xml:space="preserve">(Woolf 95% CI), Fisher p, Cochran–Mantel–Haenszel (CMH) stratified OR and</w:t>
+      </w:r>
+      <w:r>
+        <w:t xml:space="preserve"> </w:t>
+      </w:r>
+      <w:r>
+        <w:t xml:space="preserve">p, Breslow–Day homogeneity (B–D p), and Benjamini–Hochberg q across the</w:t>
+      </w:r>
+      <w:r>
+        <w:t xml:space="preserve"> </w:t>
+      </w:r>
+      <w:r>
+        <w:t xml:space="preserve">executed test family are shown; q ≈ 0 denotes underflow.</w:t>
+      </w:r>
+    </w:p>
+    <w:tbl>
+      <w:tblPr>
+        <w:tblStyle w:val="Table"/>
+        <w:tblW w:type="pct" w:w="5000"/>
+        <w:tblLayout w:type="fixed"/>
+        <w:tblLook w:firstRow="1" w:lastRow="0" w:firstColumn="0" w:lastColumn="0" w:noHBand="0" w:noVBand="0" w:val="0020"/>
+      </w:tblPr>
+      <w:tblGrid>
+        <w:gridCol w:w="792"/>
+        <w:gridCol w:w="1056"/>
+        <w:gridCol w:w="792"/>
+        <w:gridCol w:w="792"/>
+        <w:gridCol w:w="792"/>
+        <w:gridCol w:w="792"/>
+        <w:gridCol w:w="792"/>
+        <w:gridCol w:w="1056"/>
+        <w:gridCol w:w="1056"/>
+      </w:tblGrid>
+      <w:tr>
+        <w:trPr>
+          <w:tblHeader w:val="on"/>
+        </w:trPr>
+        <w:tc>
+          <w:tcPr/>
+          <w:p>
+            <w:pPr>
+              <w:pStyle w:val="Compact"/>
+            </w:pPr>
+            <w:r>
+              <w:t xml:space="preserve">Test</w:t>
+            </w:r>
+          </w:p>
+        </w:tc>
+        <w:tc>
+          <w:tcPr/>
+          <w:p>
+            <w:pPr>
+              <w:pStyle w:val="Compact"/>
+              <w:jc w:val="right"/>
+            </w:pPr>
+            <w:r>
+              <w:t xml:space="preserve">n</w:t>
+            </w:r>
+          </w:p>
+        </w:tc>
+        <w:tc>
+          <w:tcPr/>
+          <w:p>
+            <w:pPr>
+              <w:pStyle w:val="Compact"/>
+            </w:pPr>
+            <w:r>
+              <w:t xml:space="preserve">crude OR (95% CI)</w:t>
+            </w:r>
+          </w:p>
+        </w:tc>
+        <w:tc>
+          <w:tcPr/>
+          <w:p>
+            <w:pPr>
+              <w:pStyle w:val="Compact"/>
+            </w:pPr>
+            <w:r>
+              <w:t xml:space="preserve">crude p</w:t>
+            </w:r>
+          </w:p>
+        </w:tc>
+        <w:tc>
+          <w:tcPr/>
+          <w:p>
+            <w:pPr>
+              <w:pStyle w:val="Compact"/>
+            </w:pPr>
+            <w:r>
+              <w:t xml:space="preserve">stratified OR (95% CI)</w:t>
+            </w:r>
+          </w:p>
+        </w:tc>
+        <w:tc>
+          <w:tcPr/>
+          <w:p>
+            <w:pPr>
+              <w:pStyle w:val="Compact"/>
+            </w:pPr>
+            <w:r>
+              <w:t xml:space="preserve">CMH p</w:t>
+            </w:r>
+          </w:p>
+        </w:tc>
+        <w:tc>
+          <w:tcPr/>
+          <w:p>
+            <w:pPr>
+              <w:pStyle w:val="Compact"/>
+            </w:pPr>
+            <w:r>
+              <w:t xml:space="preserve">B–D p</w:t>
+            </w:r>
+          </w:p>
+        </w:tc>
+        <w:tc>
+          <w:tcPr/>
+          <w:p>
+            <w:pPr>
+              <w:pStyle w:val="Compact"/>
+              <w:jc w:val="right"/>
+            </w:pPr>
+            <w:r>
+              <w:t xml:space="preserve">q</w:t>
+            </w:r>
+          </w:p>
+        </w:tc>
+        <w:tc>
+          <w:tcPr/>
+          <w:p>
+            <w:pPr>
+              <w:pStyle w:val="Compact"/>
+            </w:pPr>
+          </w:p>
+        </w:tc>
+      </w:tr>
+      <w:tr>
+        <w:tc>
+          <w:tcPr/>
+          <w:p>
+            <w:pPr>
+              <w:pStyle w:val="Compact"/>
+            </w:pPr>
+            <w:r>
+              <w:t xml:space="preserve">cagPAI complete vs cagA detected</w:t>
+            </w:r>
+          </w:p>
+        </w:tc>
+        <w:tc>
+          <w:tcPr/>
+          <w:p>
+            <w:pPr>
+              <w:pStyle w:val="Compact"/>
+              <w:jc w:val="right"/>
+            </w:pPr>
+            <w:r>
+              <w:t xml:space="preserve">524</w:t>
+            </w:r>
+          </w:p>
+        </w:tc>
+        <w:tc>
+          <w:tcPr/>
+          <w:p>
+            <w:pPr>
+              <w:pStyle w:val="Compact"/>
+            </w:pPr>
+            <w:r>
+              <w:t xml:space="preserve">782.9 (179.2–3420.8)</w:t>
+            </w:r>
+          </w:p>
+        </w:tc>
+        <w:tc>
+          <w:tcPr/>
+          <w:p>
+            <w:pPr>
+              <w:pStyle w:val="Compact"/>
+            </w:pPr>
+            <w:r>
+              <w:t xml:space="preserve">7.2 × 10⁻⁶⁸</w:t>
+            </w:r>
+          </w:p>
+        </w:tc>
+        <w:tc>
+          <w:tcPr/>
+          <w:p>
+            <w:pPr>
+              <w:pStyle w:val="Compact"/>
+            </w:pPr>
+            <w:r>
+              <w:t xml:space="preserve">3986 (263.3–60342.6)</w:t>
+            </w:r>
+          </w:p>
+        </w:tc>
+        <w:tc>
+          <w:tcPr/>
+          <w:p>
+            <w:pPr>
+              <w:pStyle w:val="Compact"/>
+            </w:pPr>
+            <w:r>
+              <w:t xml:space="preserve">&lt; 10⁻¹⁶</w:t>
+            </w:r>
+          </w:p>
+        </w:tc>
+        <w:tc>
+          <w:tcPr/>
+          <w:p>
+            <w:pPr>
+              <w:pStyle w:val="Compact"/>
+            </w:pPr>
+            <w:r>
+              <w:t xml:space="preserve">0.956</w:t>
+            </w:r>
+          </w:p>
+        </w:tc>
+        <w:tc>
+          <w:tcPr/>
+          <w:p>
+            <w:pPr>
+              <w:pStyle w:val="Compact"/>
+              <w:jc w:val="right"/>
+            </w:pPr>
+            <w:r>
+              <w:t xml:space="preserve">≈ 0</w:t>
+            </w:r>
+          </w:p>
+        </w:tc>
+        <w:tc>
+          <w:tcPr/>
+          <w:p>
+            <w:pPr>
+              <w:pStyle w:val="Compact"/>
+            </w:pPr>
+          </w:p>
+        </w:tc>
+      </w:tr>
+      <w:tr>
+        <w:tc>
+          <w:tcPr/>
+          <w:p>
+            <w:pPr>
+              <w:pStyle w:val="Compact"/>
+            </w:pPr>
+            <w:r>
+              <w:t xml:space="preserve">cagPAI complete vs cagA EPIYA genotype (4-level)</w:t>
+            </w:r>
+          </w:p>
+        </w:tc>
+        <w:tc>
+          <w:tcPr/>
+          <w:p>
+            <w:pPr>
+              <w:pStyle w:val="Compact"/>
+              <w:jc w:val="right"/>
+            </w:pPr>
+            <w:r>
+              <w:t xml:space="preserve">450</w:t>
+            </w:r>
+          </w:p>
+        </w:tc>
+        <w:tc>
+          <w:tcPr/>
+          <w:p>
+            <w:pPr>
+              <w:pStyle w:val="Compact"/>
+            </w:pPr>
+            <w:r>
+              <w:t xml:space="preserve">—</w:t>
+            </w:r>
+          </w:p>
+        </w:tc>
+        <w:tc>
+          <w:tcPr/>
+          <w:p>
+            <w:pPr>
+              <w:pStyle w:val="Compact"/>
+            </w:pPr>
+            <w:r>
+              <w:t xml:space="preserve">0.515 (χ²)</w:t>
+            </w:r>
+          </w:p>
+        </w:tc>
+        <w:tc>
+          <w:tcPr/>
+          <w:p>
+            <w:pPr>
+              <w:pStyle w:val="Compact"/>
+            </w:pPr>
+            <w:r>
+              <w:t xml:space="preserve">—</w:t>
+            </w:r>
+          </w:p>
+        </w:tc>
+        <w:tc>
+          <w:tcPr/>
+          <w:p>
+            <w:pPr>
+              <w:pStyle w:val="Compact"/>
+            </w:pPr>
+            <w:r>
+              <w:t xml:space="preserve">—</w:t>
+            </w:r>
+          </w:p>
+        </w:tc>
+        <w:tc>
+          <w:tcPr/>
+          <w:p>
+            <w:pPr>
+              <w:pStyle w:val="Compact"/>
+            </w:pPr>
+            <w:r>
+              <w:t xml:space="preserve">—</w:t>
+            </w:r>
+          </w:p>
+        </w:tc>
+        <w:tc>
+          <w:tcPr/>
+          <w:p>
+            <w:pPr>
+              <w:pStyle w:val="Compact"/>
+              <w:jc w:val="right"/>
+            </w:pPr>
+            <w:r>
+              <w:t xml:space="preserve">0.57</w:t>
+            </w:r>
+          </w:p>
+        </w:tc>
+        <w:tc>
+          <w:tcPr/>
+          <w:p>
+            <w:pPr>
+              <w:pStyle w:val="Compact"/>
+            </w:pPr>
+          </w:p>
+        </w:tc>
+      </w:tr>
+      <w:tr>
+        <w:tc>
+          <w:tcPr/>
+          <w:p>
+            <w:pPr>
+              <w:pStyle w:val="Compact"/>
+            </w:pPr>
+            <w:r>
+              <w:t xml:space="preserve">cagPAI complete vs vacA s1</w:t>
+            </w:r>
+          </w:p>
+        </w:tc>
+        <w:tc>
+          <w:tcPr/>
+          <w:p>
+            <w:pPr>
+              <w:pStyle w:val="Compact"/>
+              <w:jc w:val="right"/>
+            </w:pPr>
+            <w:r>
+              <w:t xml:space="preserve">462</w:t>
+            </w:r>
+          </w:p>
+        </w:tc>
+        <w:tc>
+          <w:tcPr/>
+          <w:p>
+            <w:pPr>
+              <w:pStyle w:val="Compact"/>
+            </w:pPr>
+            <w:r>
+              <w:t xml:space="preserve">556.1 (74.0–4180.4)</w:t>
+            </w:r>
+          </w:p>
+        </w:tc>
+        <w:tc>
+          <w:tcPr/>
+          <w:p>
+            <w:pPr>
+              <w:pStyle w:val="Compact"/>
+            </w:pPr>
+            <w:r>
+              <w:t xml:space="preserve">1.4 × 10⁻³⁹</w:t>
+            </w:r>
+          </w:p>
+        </w:tc>
+        <w:tc>
+          <w:tcPr/>
+          <w:p>
+            <w:pPr>
+              <w:pStyle w:val="Compact"/>
+            </w:pPr>
+            <w:r>
+              <w:t xml:space="preserve">510.9 (74.1–3520.8)</w:t>
+            </w:r>
+          </w:p>
+        </w:tc>
+        <w:tc>
+          <w:tcPr/>
+          <w:p>
+            <w:pPr>
+              <w:pStyle w:val="Compact"/>
+            </w:pPr>
+            <w:r>
+              <w:t xml:space="preserve">&lt; 10⁻¹⁶</w:t>
+            </w:r>
+          </w:p>
+        </w:tc>
+        <w:tc>
+          <w:tcPr/>
+          <w:p>
+            <w:pPr>
+              <w:pStyle w:val="Compact"/>
+            </w:pPr>
+            <w:r>
+              <w:t xml:space="preserve">1 × 10⁻⁶</w:t>
+            </w:r>
+          </w:p>
+        </w:tc>
+        <w:tc>
+          <w:tcPr/>
+          <w:p>
+            <w:pPr>
+              <w:pStyle w:val="Compact"/>
+              <w:jc w:val="right"/>
+            </w:pPr>
+            <w:r>
+              <w:t xml:space="preserve">≈ 0</w:t>
+            </w:r>
+          </w:p>
+        </w:tc>
+        <w:tc>
+          <w:tcPr/>
+          <w:p>
+            <w:pPr>
+              <w:pStyle w:val="Compact"/>
+            </w:pPr>
+          </w:p>
+        </w:tc>
+      </w:tr>
+      <w:tr>
+        <w:tc>
+          <w:tcPr/>
+          <w:p>
+            <w:pPr>
+              <w:pStyle w:val="Compact"/>
+            </w:pPr>
+            <w:r>
+              <w:t xml:space="preserve">cagPAI complete vs vacA i1</w:t>
+            </w:r>
+          </w:p>
+        </w:tc>
+        <w:tc>
+          <w:tcPr/>
+          <w:p>
+            <w:pPr>
+              <w:pStyle w:val="Compact"/>
+              <w:jc w:val="right"/>
+            </w:pPr>
+            <w:r>
+              <w:t xml:space="preserve">477</w:t>
+            </w:r>
+          </w:p>
+        </w:tc>
+        <w:tc>
+          <w:tcPr/>
+          <w:p>
+            <w:pPr>
+              <w:pStyle w:val="Compact"/>
+            </w:pPr>
+            <w:r>
+              <w:t xml:space="preserve">38.0 (19.6–73.7)</w:t>
+            </w:r>
+          </w:p>
+        </w:tc>
+        <w:tc>
+          <w:tcPr/>
+          <w:p>
+            <w:pPr>
+              <w:pStyle w:val="Compact"/>
+            </w:pPr>
+            <w:r>
+              <w:t xml:space="preserve">4.6 × 10⁻³²</w:t>
+            </w:r>
+          </w:p>
+        </w:tc>
+        <w:tc>
+          <w:tcPr/>
+          <w:p>
+            <w:pPr>
+              <w:pStyle w:val="Compact"/>
+            </w:pPr>
+            <w:r>
+              <w:t xml:space="preserve">27.0 (13.6–53.8)</w:t>
+            </w:r>
+          </w:p>
+        </w:tc>
+        <w:tc>
+          <w:tcPr/>
+          <w:p>
+            <w:pPr>
+              <w:pStyle w:val="Compact"/>
+            </w:pPr>
+            <w:r>
+              <w:t xml:space="preserve">&lt; 10⁻¹⁶</w:t>
+            </w:r>
+          </w:p>
+        </w:tc>
+        <w:tc>
+          <w:tcPr/>
+          <w:p>
+            <w:pPr>
+              <w:pStyle w:val="Compact"/>
+            </w:pPr>
+            <w:r>
+              <w:t xml:space="preserve">0.77</w:t>
+            </w:r>
+          </w:p>
+        </w:tc>
+        <w:tc>
+          <w:tcPr/>
+          <w:p>
+            <w:pPr>
+              <w:pStyle w:val="Compact"/>
+              <w:jc w:val="right"/>
+            </w:pPr>
+            <w:r>
+              <w:t xml:space="preserve">≈ 0</w:t>
+            </w:r>
+          </w:p>
+        </w:tc>
+        <w:tc>
+          <w:tcPr/>
+          <w:p>
+            <w:pPr>
+              <w:pStyle w:val="Compact"/>
+            </w:pPr>
+          </w:p>
+        </w:tc>
+      </w:tr>
+      <w:tr>
+        <w:tc>
+          <w:tcPr/>
+          <w:p>
+            <w:pPr>
+              <w:pStyle w:val="Compact"/>
+            </w:pPr>
+            <w:r>
+              <w:t xml:space="preserve">cagPAI complete vs vacA m1</w:t>
+            </w:r>
+          </w:p>
+        </w:tc>
+        <w:tc>
+          <w:tcPr/>
+          <w:p>
+            <w:pPr>
+              <w:pStyle w:val="Compact"/>
+              <w:jc w:val="right"/>
+            </w:pPr>
+            <w:r>
+              <w:t xml:space="preserve">519</w:t>
+            </w:r>
+          </w:p>
+        </w:tc>
+        <w:tc>
+          <w:tcPr/>
+          <w:p>
+            <w:pPr>
+              <w:pStyle w:val="Compact"/>
+            </w:pPr>
+            <w:r>
+              <w:t xml:space="preserve">11.8 (6.6–21.4)</w:t>
+            </w:r>
+          </w:p>
+        </w:tc>
+        <w:tc>
+          <w:tcPr/>
+          <w:p>
+            <w:pPr>
+              <w:pStyle w:val="Compact"/>
+            </w:pPr>
+            <w:r>
+              <w:t xml:space="preserve">1.4 × 10⁻²¹</w:t>
+            </w:r>
+          </w:p>
+        </w:tc>
+        <w:tc>
+          <w:tcPr/>
+          <w:p>
+            <w:pPr>
+              <w:pStyle w:val="Compact"/>
+            </w:pPr>
+            <w:r>
+              <w:t xml:space="preserve">11.4 (6.4–20.4)</w:t>
+            </w:r>
+          </w:p>
+        </w:tc>
+        <w:tc>
+          <w:tcPr/>
+          <w:p>
+            <w:pPr>
+              <w:pStyle w:val="Compact"/>
+            </w:pPr>
+            <w:r>
+              <w:t xml:space="preserve">&lt; 10⁻¹⁶</w:t>
+            </w:r>
+          </w:p>
+        </w:tc>
+        <w:tc>
+          <w:tcPr/>
+          <w:p>
+            <w:pPr>
+              <w:pStyle w:val="Compact"/>
+            </w:pPr>
+            <w:r>
+              <w:t xml:space="preserve">0.018</w:t>
+            </w:r>
+          </w:p>
+        </w:tc>
+        <w:tc>
+          <w:tcPr/>
+          <w:p>
+            <w:pPr>
+              <w:pStyle w:val="Compact"/>
+              <w:jc w:val="right"/>
+            </w:pPr>
+            <w:r>
+              <w:t xml:space="preserve">≈ 0</w:t>
+            </w:r>
+          </w:p>
+        </w:tc>
+        <w:tc>
+          <w:tcPr/>
+          <w:p>
+            <w:pPr>
+              <w:pStyle w:val="Compact"/>
+            </w:pPr>
+          </w:p>
+        </w:tc>
+      </w:tr>
+      <w:tr>
+        <w:tc>
+          <w:tcPr/>
+          <w:p>
+            <w:pPr>
+              <w:pStyle w:val="Compact"/>
+            </w:pPr>
+            <w:r>
+              <w:t xml:space="preserve">SV burden (median split) vs macrolide resistance</w:t>
+            </w:r>
+          </w:p>
+        </w:tc>
+        <w:tc>
+          <w:tcPr/>
+          <w:p>
+            <w:pPr>
+              <w:pStyle w:val="Compact"/>
+              <w:jc w:val="right"/>
+            </w:pPr>
+            <w:r>
+              <w:t xml:space="preserve">528</w:t>
+            </w:r>
+          </w:p>
+        </w:tc>
+        <w:tc>
+          <w:tcPr/>
+          <w:p>
+            <w:pPr>
+              <w:pStyle w:val="Compact"/>
+            </w:pPr>
+            <w:r>
+              <w:t xml:space="preserve">2.81 (1.71–4.62)</w:t>
+            </w:r>
+          </w:p>
+        </w:tc>
+        <w:tc>
+          <w:tcPr/>
+          <w:p>
+            <w:pPr>
+              <w:pStyle w:val="Compact"/>
+            </w:pPr>
+            <w:r>
+              <w:t xml:space="preserve">3.0 × 10⁻⁵</w:t>
+            </w:r>
+          </w:p>
+        </w:tc>
+        <w:tc>
+          <w:tcPr/>
+          <w:p>
+            <w:pPr>
+              <w:pStyle w:val="Compact"/>
+            </w:pPr>
+            <w:r>
+              <w:t xml:space="preserve">1.33 (0.73–2.40)</w:t>
+            </w:r>
+          </w:p>
+        </w:tc>
+        <w:tc>
+          <w:tcPr/>
+          <w:p>
+            <w:pPr>
+              <w:pStyle w:val="Compact"/>
+            </w:pPr>
+            <w:r>
+              <w:t xml:space="preserve">0.35</w:t>
+            </w:r>
+          </w:p>
+        </w:tc>
+        <w:tc>
+          <w:tcPr/>
+          <w:p>
+            <w:pPr>
+              <w:pStyle w:val="Compact"/>
+            </w:pPr>
+            <w:r>
+              <w:t xml:space="preserve">0.90</w:t>
+            </w:r>
+          </w:p>
+        </w:tc>
+        <w:tc>
+          <w:tcPr/>
+          <w:p>
+            <w:pPr>
+              <w:pStyle w:val="Compact"/>
+              <w:jc w:val="right"/>
+            </w:pPr>
+            <w:r>
+              <w:t xml:space="preserve">8.5 × 10⁻⁵</w:t>
+            </w:r>
+          </w:p>
+        </w:tc>
+        <w:tc>
+          <w:tcPr/>
+          <w:p>
+            <w:pPr>
+              <w:pStyle w:val="Compact"/>
+            </w:pPr>
+          </w:p>
+        </w:tc>
+      </w:tr>
+      <w:tr>
+        <w:tc>
+          <w:tcPr/>
+          <w:p>
+            <w:pPr>
+              <w:pStyle w:val="Compact"/>
+            </w:pPr>
+            <w:r>
+              <w:t xml:space="preserve">cagPAI complete vs GC (vs NAG)</w:t>
+            </w:r>
+          </w:p>
+        </w:tc>
+        <w:tc>
+          <w:tcPr/>
+          <w:p>
+            <w:pPr>
+              <w:pStyle w:val="Compact"/>
+              <w:jc w:val="right"/>
+            </w:pPr>
+            <w:r>
+              <w:t xml:space="preserve">285</w:t>
+            </w:r>
+          </w:p>
+        </w:tc>
+        <w:tc>
+          <w:tcPr/>
+          <w:p>
+            <w:pPr>
+              <w:pStyle w:val="Compact"/>
+            </w:pPr>
+            <w:r>
+              <w:t xml:space="preserve">2.16 (1.13–4.13)</w:t>
+            </w:r>
+          </w:p>
+        </w:tc>
+        <w:tc>
+          <w:tcPr/>
+          <w:p>
+            <w:pPr>
+              <w:pStyle w:val="Compact"/>
+            </w:pPr>
+            <w:r>
+              <w:t xml:space="preserve">0.022</w:t>
+            </w:r>
+          </w:p>
+        </w:tc>
+        <w:tc>
+          <w:tcPr/>
+          <w:p>
+            <w:pPr>
+              <w:pStyle w:val="Compact"/>
+            </w:pPr>
+            <w:r>
+              <w:t xml:space="preserve">1.70 (0.87–3.32)</w:t>
+            </w:r>
+          </w:p>
+        </w:tc>
+        <w:tc>
+          <w:tcPr/>
+          <w:p>
+            <w:pPr>
+              <w:pStyle w:val="Compact"/>
+            </w:pPr>
+            <w:r>
+              <w:t xml:space="preserve">0.121</w:t>
+            </w:r>
+          </w:p>
+        </w:tc>
+        <w:tc>
+          <w:tcPr/>
+          <w:p>
+            <w:pPr>
+              <w:pStyle w:val="Compact"/>
+            </w:pPr>
+            <w:r>
+              <w:t xml:space="preserve">0.005</w:t>
+            </w:r>
+          </w:p>
+        </w:tc>
+        <w:tc>
+          <w:tcPr/>
+          <w:p>
+            <w:pPr>
+              <w:pStyle w:val="Compact"/>
+              <w:jc w:val="right"/>
+            </w:pPr>
+            <w:r>
+              <w:t xml:space="preserve">0.044</w:t>
+            </w:r>
+          </w:p>
+        </w:tc>
+        <w:tc>
+          <w:tcPr/>
+          <w:p>
+            <w:pPr>
+              <w:pStyle w:val="Compact"/>
+            </w:pPr>
+          </w:p>
+        </w:tc>
+      </w:tr>
+    </w:tbl>
+    <w:p>
+      <w:pPr>
+        <w:pStyle w:val="BodyText"/>
+      </w:pPr>
+      <w:r>
+        <w:t xml:space="preserve">Contingency for the headline test: cagPAI-complete → 429/431 cagA-positive;</w:t>
+      </w:r>
+      <w:r>
+        <w:t xml:space="preserve"> </w:t>
+      </w:r>
+      <w:r>
+        <w:t xml:space="preserve">partial → 10/11; empty → 10/82. Fluoroquinolone, tetracycline, and</w:t>
+      </w:r>
+      <w:r>
+        <w:t xml:space="preserve"> </w:t>
+      </w:r>
+      <w:r>
+        <w:t xml:space="preserve">nitroimidazole classes were excluded pre-test (intrinsic hp1181 efflux pump at</w:t>
+      </w:r>
+      <w:r>
+        <w:t xml:space="preserve"> </w:t>
+      </w:r>
+      <w:r>
+        <w:t xml:space="preserve">99.8% prevalence); beta-lactam was excluded (0.6% prevalence). The 26 genomes</w:t>
+      </w:r>
+      <w:r>
+        <w:t xml:space="preserve"> </w:t>
+      </w:r>
+      <w:r>
+        <w:t xml:space="preserve">discordant between marker state and cagA typing were reviewed at assembly level:</w:t>
+      </w:r>
+      <w:r>
+        <w:t xml:space="preserve"> </w:t>
+      </w:r>
+      <w:r>
+        <w:t xml:space="preserve">17 showed loss of the island backbone with cagA sequence retained at the</w:t>
+      </w:r>
+      <w:r>
+        <w:t xml:space="preserve"> </w:t>
+      </w:r>
+      <w:r>
+        <w:t xml:space="preserve">evacuated site (8 near full-length, 9 fragmentary), 2 carried a precise cagA</w:t>
+      </w:r>
+      <w:r>
+        <w:t xml:space="preserve"> </w:t>
+      </w:r>
+      <w:r>
+        <w:t xml:space="preserve">excision on an otherwise intact island (both FastBAPS L3, Latin America), 5</w:t>
+      </w:r>
+      <w:r>
+        <w:t xml:space="preserve"> </w:t>
+      </w:r>
+      <w:r>
+        <w:t xml:space="preserve">were threshold-level partial calls in high-divergence backgrounds, and 2 were</w:t>
+      </w:r>
+      <w:r>
+        <w:t xml:space="preserve"> </w:t>
+      </w:r>
+      <w:r>
+        <w:t xml:space="preserve">clean fully assembled island deletions; none was attributable to assembly</w:t>
+      </w:r>
+      <w:r>
+        <w:t xml:space="preserve"> </w:t>
+      </w:r>
+      <w:r>
+        <w:t xml:space="preserve">incompleteness.</w:t>
+      </w:r>
+      <w:r>
+        <w:t xml:space="preserve"> </w:t>
+      </w:r>
+      <w:r>
+        <w:t xml:space="preserve">Source data:</w:t>
+      </w:r>
+      <w:r>
+        <w:t xml:space="preserve"> </w:t>
+      </w:r>
+      <w:r>
+        <w:rPr>
+          <w:rStyle w:val="VerbatimChar"/>
+        </w:rPr>
+        <w:t xml:space="preserve">case_studies/h_pylori_cagpai/results/metadata_assoc/association_tests.tsv</w:t>
+      </w:r>
+      <w:r>
+        <w:t xml:space="preserve">;</w:t>
+      </w:r>
+      <w:r>
+        <w:t xml:space="preserve"> </w:t>
+      </w:r>
+      <w:r>
+        <w:t xml:space="preserve">assembly-level review:</w:t>
+      </w:r>
+      <w:r>
+        <w:t xml:space="preserve"> </w:t>
+      </w:r>
+      <w:r>
+        <w:rPr>
+          <w:rStyle w:val="VerbatimChar"/>
+        </w:rPr>
+        <w:t xml:space="preserve">case_studies/h_pylori_cagpai/results/metadata_assoc/discordant_review/</w:t>
+      </w:r>
+      <w:r>
+        <w:t xml:space="preserve">.</w:t>
+      </w:r>
+    </w:p>
+    <w:bookmarkEnd w:id="26"/>
+    <w:bookmarkStart w:id="27" w:name="Xe280e63292e65e7cc12ffc5dad24d6a06d19d0f"/>
+    <w:p>
+      <w:pPr>
+        <w:pStyle w:val="Heading2"/>
+      </w:pPr>
+      <w:r>
         <w:t xml:space="preserve">Supplementary Note 1 — Calibration is input-regime-specific (MAG test)</w:t>
       </w:r>
     </w:p>
@@ -2469,8 +3962,8 @@
         <w:t xml:space="preserve">.</w:t>
       </w:r>
     </w:p>
-    <w:bookmarkEnd w:id="25"/>
-    <w:bookmarkStart w:id="26" w:name="Xd013ccaae7d4dde06816ab37078854f863f6c97"/>
+    <w:bookmarkEnd w:id="27"/>
+    <w:bookmarkStart w:id="28" w:name="Xd013ccaae7d4dde06816ab37078854f863f6c97"/>
     <w:p>
       <w:pPr>
         <w:pStyle w:val="Heading2"/>
@@ -2641,8 +4134,8 @@
         <w:t xml:space="preserve">further is not expected to improve it (main text, Methods 4.6).</w:t>
       </w:r>
     </w:p>
-    <w:bookmarkEnd w:id="26"/>
-    <w:bookmarkStart w:id="27" w:name="X335171f238bd89d569aec4e4b5b6643057b0b49"/>
+    <w:bookmarkEnd w:id="28"/>
+    <w:bookmarkStart w:id="29" w:name="X335171f238bd89d569aec4e4b5b6643057b0b49"/>
     <w:p>
       <w:pPr>
         <w:pStyle w:val="Heading2"/>
@@ -2743,8 +4236,8 @@
         <w:t xml:space="preserve">.</w:t>
       </w:r>
     </w:p>
-    <w:bookmarkEnd w:id="27"/>
-    <w:bookmarkStart w:id="28" w:name="Xfd6529be4a0d1bbd51b24452f2b6f26ebe262a9"/>
+    <w:bookmarkEnd w:id="29"/>
+    <w:bookmarkStart w:id="30" w:name="Xfd6529be4a0d1bbd51b24452f2b6f26ebe262a9"/>
     <w:p>
       <w:pPr>
         <w:pStyle w:val="Heading2"/>
@@ -3520,8 +5013,8 @@
         <w:t xml:space="preserve">mid-ANI 0.343 vs 1.113), at a disclosed cost in near-clonal sensitivity.</w:t>
       </w:r>
     </w:p>
-    <w:bookmarkEnd w:id="28"/>
-    <w:bookmarkStart w:id="29" w:name="X39919e213b71580968f061584f61586905cff88"/>
+    <w:bookmarkEnd w:id="30"/>
+    <w:bookmarkStart w:id="31" w:name="X39919e213b71580968f061584f61586905cff88"/>
     <w:p>
       <w:pPr>
         <w:pStyle w:val="Heading2"/>
@@ -3650,8 +5143,8 @@
         <w:t xml:space="preserve">the real-genome correction layer.</w:t>
       </w:r>
     </w:p>
-    <w:bookmarkEnd w:id="29"/>
-    <w:bookmarkStart w:id="30" w:name="Xb1eb0d0077db50146ab5cb7a6cc963413c0d2d3"/>
+    <w:bookmarkEnd w:id="31"/>
+    <w:bookmarkStart w:id="32" w:name="Xb1eb0d0077db50146ab5cb7a6cc963413c0d2d3"/>
     <w:p>
       <w:pPr>
         <w:pStyle w:val="Heading2"/>
@@ -4607,8 +6100,8 @@
         <w:t xml:space="preserve">not sensitive to the exact threshold in the 97–99% window.</w:t>
       </w:r>
     </w:p>
-    <w:bookmarkEnd w:id="30"/>
-    <w:bookmarkEnd w:id="31"/>
+    <w:bookmarkEnd w:id="32"/>
+    <w:bookmarkEnd w:id="33"/>
     <w:sectPr>
       <w:footnotePr>
         <w:numRestart w:val="eachSect"/>

</xml_diff>

<commit_message>
Add Supplementary Fig. S14 (closed-genome orientation artifact and correction); fix corrected-q90 typo in diagnostic report
</commit_message>
<xml_diff>
--- a/paper/manuscript/SUPPLEMENTARY.docx
+++ b/paper/manuscript/SUPPLEMENTARY.docx
@@ -2,7 +2,7 @@
 <file path=word/document.xml><?xml version="1.0" encoding="utf-8"?>
 <w:document xmlns:w="http://schemas.openxmlformats.org/wordprocessingml/2006/main" xmlns:m="http://schemas.openxmlformats.org/officeDocument/2006/math" xmlns:r="http://schemas.openxmlformats.org/officeDocument/2006/relationships" xmlns:o="urn:schemas-microsoft-com:office:office" xmlns:v="urn:schemas-microsoft-com:vml" xmlns:w10="urn:schemas-microsoft-com:office:word" xmlns:a="http://schemas.openxmlformats.org/drawingml/2006/main" xmlns:pic="http://schemas.openxmlformats.org/drawingml/2006/picture" xmlns:wp="http://schemas.openxmlformats.org/drawingml/2006/wordprocessingDrawing">
   <w:body>
-    <w:bookmarkStart w:id="33" w:name="Xc3fcc6656da83e08d67075bda016bbdc5c3d5f9"/>
+    <w:bookmarkStart w:id="36" w:name="Xc3fcc6656da83e08d67075bda016bbdc5c3d5f9"/>
     <w:p>
       <w:pPr>
         <w:pStyle w:val="Heading1"/>
@@ -1149,7 +1149,172 @@
       </w:r>
     </w:p>
     <w:bookmarkEnd w:id="21"/>
-    <w:bookmarkStart w:id="22" w:name="Xb79c9bf020a903d02af45c43b651fa33d5c8e03"/>
+    <w:bookmarkStart w:id="22" w:name="Xf729203a1f7ffd593b851fb59401cac653d2b5a"/>
+    <w:p>
+      <w:pPr>
+        <w:pStyle w:val="Heading2"/>
+      </w:pPr>
+      <w:r>
+        <w:t xml:space="preserve">Supplementary Figure S14 — Orientation artifact in undirected all-vs-all inversion calling and its correction</w:t>
+      </w:r>
+    </w:p>
+    <w:p>
+      <w:pPr>
+        <w:pStyle w:val="FirstParagraph"/>
+      </w:pPr>
+      <w:r>
+        <w:t xml:space="preserve">(</w:t>
+      </w:r>
+      <w:r>
+        <w:rPr>
+          <w:rStyle w:val="VerbatimChar"/>
+        </w:rPr>
+        <w:t xml:space="preserve">paper/figures/supplementary/fig_s14_closed_genome_inversion.png</w:t>
+      </w:r>
+      <w:r>
+        <w:t xml:space="preserve">)</w:t>
+      </w:r>
+    </w:p>
+    <w:p>
+      <w:pPr>
+        <w:pStyle w:val="Compact"/>
+        <w:numPr>
+          <w:ilvl w:val="0"/>
+          <w:numId w:val="1001"/>
+        </w:numPr>
+      </w:pPr>
+      <w:r>
+        <w:t xml:space="preserve">Distribution of the reference-oriented raw inverted fraction (computed with</w:t>
+      </w:r>
+      <w:r>
+        <w:t xml:space="preserve"> </w:t>
+      </w:r>
+      <w:r>
+        <w:t xml:space="preserve">the companion Syn2b implementation of the same length-weighted orientation</w:t>
+      </w:r>
+      <w:r>
+        <w:t xml:space="preserve"> </w:t>
+      </w:r>
+      <w:r>
+        <w:t xml:space="preserve">ratio) across 61,537</w:t>
+      </w:r>
+      <w:r>
+        <w:t xml:space="preserve"> </w:t>
+      </w:r>
+      <w:r>
+        <w:t xml:space="preserve">same-species genome pairs from 701 near-complete GTDB-R207 genomes; the median</w:t>
+      </w:r>
+      <w:r>
+        <w:t xml:space="preserve"> </w:t>
+      </w:r>
+      <w:r>
+        <w:t xml:space="preserve">of 0.3595 and q90 of 0.9291 are biologically implausible, and 38.9% of pairs</w:t>
+      </w:r>
+      <w:r>
+        <w:t xml:space="preserve"> </w:t>
+      </w:r>
+      <w:r>
+        <w:t xml:space="preserve">have raw &gt; 0.5 (shaded region) because the two assemblies are arbitrarily</w:t>
+      </w:r>
+      <w:r>
+        <w:t xml:space="preserve"> </w:t>
+      </w:r>
+      <w:r>
+        <w:t xml:space="preserve">oriented with respect to each other, scoring entire chromosomes as inverted.</w:t>
+      </w:r>
+    </w:p>
+    <w:p>
+      <w:pPr>
+        <w:pStyle w:val="Compact"/>
+        <w:numPr>
+          <w:ilvl w:val="0"/>
+          <w:numId w:val="1001"/>
+        </w:numPr>
+      </w:pPr>
+      <w:r>
+        <w:t xml:space="preserve">The corrected metric, defined as min(raw, 1 − raw), is bounded at 0.5 with a</w:t>
+      </w:r>
+      <w:r>
+        <w:t xml:space="preserve"> </w:t>
+      </w:r>
+      <w:r>
+        <w:t xml:space="preserve">median of 0.1837. (c) Corrected versus raw values for all pairs: 61.1% of pairs</w:t>
+      </w:r>
+      <w:r>
+        <w:t xml:space="preserve"> </w:t>
+      </w:r>
+      <w:r>
+        <w:t xml:space="preserve">lie on the identity arm (corrected = raw) and 38.9% on the mirror arm</w:t>
+      </w:r>
+      <w:r>
+        <w:t xml:space="preserve"> </w:t>
+      </w:r>
+      <w:r>
+        <w:t xml:space="preserve">(corrected = 1 − raw). The raw column is meaningful in fixed-reference mode,</w:t>
+      </w:r>
+      <w:r>
+        <w:t xml:space="preserve"> </w:t>
+      </w:r>
+      <w:r>
+        <w:t xml:space="preserve">where it corresponds directly to the dnadiff inverted-alignment fraction;</w:t>
+      </w:r>
+      <w:r>
+        <w:t xml:space="preserve"> </w:t>
+      </w:r>
+      <w:r>
+        <w:t xml:space="preserve">undirected all-vs-all analyses should use the corrected column, and circular</w:t>
+      </w:r>
+      <w:r>
+        <w:t xml:space="preserve"> </w:t>
+      </w:r>
+      <w:r>
+        <w:t xml:space="preserve">chromosomes should additionally be normalized to a common origin before</w:t>
+      </w:r>
+      <w:r>
+        <w:t xml:space="preserve"> </w:t>
+      </w:r>
+      <w:r>
+        <w:t xml:space="preserve">comparison.</w:t>
+      </w:r>
+      <w:r>
+        <w:t xml:space="preserve"> </w:t>
+      </w:r>
+      <w:r>
+        <w:t xml:space="preserve">Source data:</w:t>
+      </w:r>
+      <w:r>
+        <w:t xml:space="preserve"> </w:t>
+      </w:r>
+      <w:r>
+        <w:rPr>
+          <w:rStyle w:val="VerbatimChar"/>
+        </w:rPr>
+        <w:t xml:space="preserve">results/gtdb50k/syn2b_inverted_fraction_closed.tsv</w:t>
+      </w:r>
+      <w:r>
+        <w:t xml:space="preserve">; diagnostic</w:t>
+      </w:r>
+      <w:r>
+        <w:t xml:space="preserve"> </w:t>
+      </w:r>
+      <w:r>
+        <w:t xml:space="preserve">report:</w:t>
+      </w:r>
+      <w:r>
+        <w:t xml:space="preserve"> </w:t>
+      </w:r>
+      <w:r>
+        <w:rPr>
+          <w:rStyle w:val="VerbatimChar"/>
+        </w:rPr>
+        <w:t xml:space="preserve">results/gtdb50k/CLOSED_INVERSION_DIAGNOSTIC_REPORT.md</w:t>
+      </w:r>
+      <w:r>
+        <w:t xml:space="preserve">.</w:t>
+      </w:r>
+    </w:p>
+    <w:bookmarkEnd w:id="22"/>
+    <w:bookmarkStart w:id="23" w:name="Xb79c9bf020a903d02af45c43b651fa33d5c8e03"/>
     <w:p>
       <w:pPr>
         <w:pStyle w:val="Heading2"/>
@@ -1475,8 +1640,8 @@
         </w:tc>
       </w:tr>
     </w:tbl>
-    <w:bookmarkEnd w:id="22"/>
-    <w:bookmarkStart w:id="23" w:name="X1d1a5b89358b225a547ea735bc71b43678427f8"/>
+    <w:bookmarkEnd w:id="23"/>
+    <w:bookmarkStart w:id="24" w:name="X1d1a5b89358b225a547ea735bc71b43678427f8"/>
     <w:p>
       <w:pPr>
         <w:pStyle w:val="Heading2"/>
@@ -1790,8 +1955,8 @@
         </w:tc>
       </w:tr>
     </w:tbl>
-    <w:bookmarkEnd w:id="23"/>
-    <w:bookmarkStart w:id="24" w:name="X791b5905c3cbd3b80da6a27b4633a9dc2eda705"/>
+    <w:bookmarkEnd w:id="24"/>
+    <w:bookmarkStart w:id="25" w:name="X791b5905c3cbd3b80da6a27b4633a9dc2eda705"/>
     <w:p>
       <w:pPr>
         <w:pStyle w:val="Heading2"/>
@@ -2000,8 +2165,8 @@
         </w:tc>
       </w:tr>
     </w:tbl>
-    <w:bookmarkEnd w:id="24"/>
-    <w:bookmarkStart w:id="25" w:name="X71ce6833d789d49d6251da69c06300f4d632d80"/>
+    <w:bookmarkEnd w:id="25"/>
+    <w:bookmarkStart w:id="26" w:name="X71ce6833d789d49d6251da69c06300f4d632d80"/>
     <w:p>
       <w:pPr>
         <w:pStyle w:val="Heading2"/>
@@ -2889,8 +3054,8 @@
         <w:t xml:space="preserve">.</w:t>
       </w:r>
     </w:p>
-    <w:bookmarkEnd w:id="25"/>
-    <w:bookmarkStart w:id="26" w:name="X0ddedd77d100d0b74814f89ea378e8d5927a82e"/>
+    <w:bookmarkEnd w:id="26"/>
+    <w:bookmarkStart w:id="27" w:name="X0ddedd77d100d0b74814f89ea378e8d5927a82e"/>
     <w:p>
       <w:pPr>
         <w:pStyle w:val="Heading2"/>
@@ -3863,13 +4028,786 @@
         <w:t xml:space="preserve">.</w:t>
       </w:r>
     </w:p>
-    <w:bookmarkEnd w:id="26"/>
-    <w:bookmarkStart w:id="27" w:name="Xe280e63292e65e7cc12ffc5dad24d6a06d19d0f"/>
+    <w:bookmarkEnd w:id="27"/>
+    <w:bookmarkStart w:id="28" w:name="X2ff3ab002bfcdc4c8ad1f9a43f54a269f3dbba3"/>
     <w:p>
       <w:pPr>
         <w:pStyle w:val="Heading2"/>
       </w:pPr>
       <w:r>
+        <w:t xml:space="preserve">Supplementary Table S6 — Stage-level runtime decomposition and Stage-1 screen recall</w:t>
+      </w:r>
+    </w:p>
+    <w:p>
+      <w:pPr>
+        <w:pStyle w:val="FirstParagraph"/>
+      </w:pPr>
+      <w:r>
+        <w:rPr>
+          <w:b/>
+          <w:bCs/>
+        </w:rPr>
+        <w:t xml:space="preserve">Stage decomposition (n = 22-genome panel, 484 ordered pairs, median of 3</w:t>
+      </w:r>
+      <w:r>
+        <w:rPr>
+          <w:b/>
+          <w:bCs/>
+        </w:rPr>
+        <w:t xml:space="preserve"> </w:t>
+      </w:r>
+      <w:r>
+        <w:rPr>
+          <w:b/>
+          <w:bCs/>
+        </w:rPr>
+        <w:t xml:space="preserve">replicates).</w:t>
+      </w:r>
+      <w:r>
+        <w:t xml:space="preserve"> </w:t>
+      </w:r>
+      <w:r>
+        <w:t xml:space="preserve">Syn2bANI does not emit per-stage timers; stages that are measured</w:t>
+      </w:r>
+      <w:r>
+        <w:t xml:space="preserve"> </w:t>
+      </w:r>
+      <w:r>
+        <w:t xml:space="preserve">only jointly are marked as such rather than apportioned arbitrarily. Full</w:t>
+      </w:r>
+      <w:r>
+        <w:t xml:space="preserve"> </w:t>
+      </w:r>
+      <w:r>
+        <w:t xml:space="preserve">machine-readable table:</w:t>
+      </w:r>
+      <w:r>
+        <w:t xml:space="preserve"> </w:t>
+      </w:r>
+      <w:r>
+        <w:rPr>
+          <w:rStyle w:val="VerbatimChar"/>
+        </w:rPr>
+        <w:t xml:space="preserve">results/efficiency_v8/stage_breakdown.tsv</w:t>
+      </w:r>
+      <w:r>
+        <w:t xml:space="preserve">.</w:t>
+      </w:r>
+    </w:p>
+    <w:tbl>
+      <w:tblPr>
+        <w:tblStyle w:val="Table"/>
+        <w:tblW w:type="pct" w:w="5000"/>
+        <w:tblLayout w:type="fixed"/>
+        <w:tblLook w:firstRow="1" w:lastRow="0" w:firstColumn="0" w:lastColumn="0" w:noHBand="0" w:noVBand="0" w:val="0020"/>
+      </w:tblPr>
+      <w:tblGrid>
+        <w:gridCol w:w="2640"/>
+        <w:gridCol w:w="2640"/>
+        <w:gridCol w:w="2640"/>
+      </w:tblGrid>
+      <w:tr>
+        <w:trPr>
+          <w:tblHeader w:val="on"/>
+        </w:trPr>
+        <w:tc>
+          <w:tcPr/>
+          <w:p>
+            <w:pPr>
+              <w:pStyle w:val="Compact"/>
+            </w:pPr>
+            <w:r>
+              <w:t xml:space="preserve">Stage</w:t>
+            </w:r>
+          </w:p>
+        </w:tc>
+        <w:tc>
+          <w:tcPr/>
+          <w:p>
+            <w:pPr>
+              <w:pStyle w:val="Compact"/>
+            </w:pPr>
+            <w:r>
+              <w:t xml:space="preserve">wall time</w:t>
+            </w:r>
+          </w:p>
+        </w:tc>
+        <w:tc>
+          <w:tcPr/>
+          <w:p>
+            <w:pPr>
+              <w:pStyle w:val="Compact"/>
+            </w:pPr>
+            <w:r>
+              <w:t xml:space="preserve">timing status</w:t>
+            </w:r>
+          </w:p>
+        </w:tc>
+      </w:tr>
+      <w:tr>
+        <w:tc>
+          <w:tcPr/>
+          <w:p>
+            <w:pPr>
+              <w:pStyle w:val="Compact"/>
+            </w:pPr>
+            <w:r>
+              <w:t xml:space="preserve">End-to-end, FASTA mode (digest + screen + chain + MLE)</w:t>
+            </w:r>
+          </w:p>
+        </w:tc>
+        <w:tc>
+          <w:tcPr/>
+          <w:p>
+            <w:pPr>
+              <w:pStyle w:val="Compact"/>
+            </w:pPr>
+            <w:r>
+              <w:t xml:space="preserve">3.73 s</w:t>
+            </w:r>
+          </w:p>
+        </w:tc>
+        <w:tc>
+          <w:tcPr/>
+          <w:p>
+            <w:pPr>
+              <w:pStyle w:val="Compact"/>
+            </w:pPr>
+            <w:r>
+              <w:t xml:space="preserve">measured</w:t>
+            </w:r>
+          </w:p>
+        </w:tc>
+      </w:tr>
+      <w:tr>
+        <w:tc>
+          <w:tcPr/>
+          <w:p>
+            <w:pPr>
+              <w:pStyle w:val="Compact"/>
+            </w:pPr>
+            <w:r>
+              <w:t xml:space="preserve">End-to-end, sketch mode (sketch load + screen + chain + MLE)</w:t>
+            </w:r>
+          </w:p>
+        </w:tc>
+        <w:tc>
+          <w:tcPr/>
+          <w:p>
+            <w:pPr>
+              <w:pStyle w:val="Compact"/>
+            </w:pPr>
+            <w:r>
+              <w:t xml:space="preserve">2.79 s</w:t>
+            </w:r>
+          </w:p>
+        </w:tc>
+        <w:tc>
+          <w:tcPr/>
+          <w:p>
+            <w:pPr>
+              <w:pStyle w:val="Compact"/>
+            </w:pPr>
+            <w:r>
+              <w:t xml:space="preserve">measured</w:t>
+            </w:r>
+          </w:p>
+        </w:tc>
+      </w:tr>
+      <w:tr>
+        <w:tc>
+          <w:tcPr/>
+          <w:p>
+            <w:pPr>
+              <w:pStyle w:val="Compact"/>
+            </w:pPr>
+            <w:r>
+              <w:rPr>
+                <w:rStyle w:val="VerbatimChar"/>
+              </w:rPr>
+              <w:t xml:space="preserve">sketch</w:t>
+            </w:r>
+            <w:r>
+              <w:t xml:space="preserve"> </w:t>
+            </w:r>
+            <w:r>
+              <w:t xml:space="preserve">command (digest + build + write)</w:t>
+            </w:r>
+          </w:p>
+        </w:tc>
+        <w:tc>
+          <w:tcPr/>
+          <w:p>
+            <w:pPr>
+              <w:pStyle w:val="Compact"/>
+            </w:pPr>
+            <w:r>
+              <w:t xml:space="preserve">0.50 s</w:t>
+            </w:r>
+          </w:p>
+        </w:tc>
+        <w:tc>
+          <w:tcPr/>
+          <w:p>
+            <w:pPr>
+              <w:pStyle w:val="Compact"/>
+            </w:pPr>
+            <w:r>
+              <w:t xml:space="preserve">measured; digestion vs build/write not separable from these data</w:t>
+            </w:r>
+          </w:p>
+        </w:tc>
+      </w:tr>
+      <w:tr>
+        <w:tc>
+          <w:tcPr/>
+          <w:p>
+            <w:pPr>
+              <w:pStyle w:val="Compact"/>
+            </w:pPr>
+            <w:r>
+              <w:t xml:space="preserve">In-silico digestion (in-memory)</w:t>
+            </w:r>
+          </w:p>
+        </w:tc>
+        <w:tc>
+          <w:tcPr/>
+          <w:p>
+            <w:pPr>
+              <w:pStyle w:val="Compact"/>
+            </w:pPr>
+            <w:r>
+              <w:t xml:space="preserve">≈0.9 s</w:t>
+            </w:r>
+          </w:p>
+        </w:tc>
+        <w:tc>
+          <w:tcPr/>
+          <w:p>
+            <w:pPr>
+              <w:pStyle w:val="Compact"/>
+            </w:pPr>
+            <w:r>
+              <w:t xml:space="preserve">derived upper bound (FASTA − sketch mode; sub-second I/O noise)</w:t>
+            </w:r>
+          </w:p>
+        </w:tc>
+      </w:tr>
+      <w:tr>
+        <w:tc>
+          <w:tcPr/>
+          <w:p>
+            <w:pPr>
+              <w:pStyle w:val="Compact"/>
+            </w:pPr>
+            <w:r>
+              <w:t xml:space="preserve">Screen (pass-1 index lookup)</w:t>
+            </w:r>
+          </w:p>
+        </w:tc>
+        <w:tc>
+          <w:tcPr/>
+          <w:p>
+            <w:pPr>
+              <w:pStyle w:val="Compact"/>
+            </w:pPr>
+            <w:r>
+              <w:t xml:space="preserve">—</w:t>
+            </w:r>
+          </w:p>
+        </w:tc>
+        <w:tc>
+          <w:tcPr/>
+          <w:p>
+            <w:pPr>
+              <w:pStyle w:val="Compact"/>
+            </w:pPr>
+            <w:r>
+              <w:t xml:space="preserve">not separately timed; 0 &lt; t &lt; 2.79 s</w:t>
+            </w:r>
+          </w:p>
+        </w:tc>
+      </w:tr>
+      <w:tr>
+        <w:tc>
+          <w:tcPr/>
+          <w:p>
+            <w:pPr>
+              <w:pStyle w:val="Compact"/>
+            </w:pPr>
+            <w:r>
+              <w:t xml:space="preserve">Chaining (anchor DP)</w:t>
+            </w:r>
+          </w:p>
+        </w:tc>
+        <w:tc>
+          <w:tcPr/>
+          <w:p>
+            <w:pPr>
+              <w:pStyle w:val="Compact"/>
+            </w:pPr>
+            <w:r>
+              <w:t xml:space="preserve">—</w:t>
+            </w:r>
+          </w:p>
+        </w:tc>
+        <w:tc>
+          <w:tcPr/>
+          <w:p>
+            <w:pPr>
+              <w:pStyle w:val="Compact"/>
+            </w:pPr>
+            <w:r>
+              <w:t xml:space="preserve">not separately timed (merged with screen + MLE)</w:t>
+            </w:r>
+          </w:p>
+        </w:tc>
+      </w:tr>
+      <w:tr>
+        <w:tc>
+          <w:tcPr/>
+          <w:p>
+            <w:pPr>
+              <w:pStyle w:val="Compact"/>
+            </w:pPr>
+            <w:r>
+              <w:t xml:space="preserve">MLE fit + calibration</w:t>
+            </w:r>
+          </w:p>
+        </w:tc>
+        <w:tc>
+          <w:tcPr/>
+          <w:p>
+            <w:pPr>
+              <w:pStyle w:val="Compact"/>
+            </w:pPr>
+            <w:r>
+              <w:t xml:space="preserve">—</w:t>
+            </w:r>
+          </w:p>
+        </w:tc>
+        <w:tc>
+          <w:tcPr/>
+          <w:p>
+            <w:pPr>
+              <w:pStyle w:val="Compact"/>
+            </w:pPr>
+            <w:r>
+              <w:t xml:space="preserve">not separately timed (calibration is a linear-model evaluation, sub-ms per pair)</w:t>
+            </w:r>
+          </w:p>
+        </w:tc>
+      </w:tr>
+      <w:tr>
+        <w:tc>
+          <w:tcPr/>
+          <w:p>
+            <w:pPr>
+              <w:pStyle w:val="Compact"/>
+            </w:pPr>
+            <w:r>
+              <w:t xml:space="preserve">Marginal cost of screen+chain+MLE</w:t>
+            </w:r>
+          </w:p>
+        </w:tc>
+        <w:tc>
+          <w:tcPr/>
+          <w:p>
+            <w:pPr>
+              <w:pStyle w:val="Compact"/>
+            </w:pPr>
+            <w:r>
+              <w:t xml:space="preserve">5.7 ms/pair</w:t>
+            </w:r>
+          </w:p>
+        </w:tc>
+        <w:tc>
+          <w:tcPr/>
+          <w:p>
+            <w:pPr>
+              <w:pStyle w:val="Compact"/>
+            </w:pPr>
+            <w:r>
+              <w:t xml:space="preserve">derived from sketch-mode scaling (n = 2 → 22)</w:t>
+            </w:r>
+          </w:p>
+        </w:tc>
+      </w:tr>
+      <w:tr>
+        <w:tc>
+          <w:tcPr/>
+          <w:p>
+            <w:pPr>
+              <w:pStyle w:val="Compact"/>
+            </w:pPr>
+            <w:r>
+              <w:rPr>
+                <w:rStyle w:val="VerbatimChar"/>
+              </w:rPr>
+              <w:t xml:space="preserve">syn2bani struct</w:t>
+            </w:r>
+            <w:r>
+              <w:t xml:space="preserve"> </w:t>
+            </w:r>
+            <w:r>
+              <w:t xml:space="preserve">(SV stage, 16-way process pool)</w:t>
+            </w:r>
+          </w:p>
+        </w:tc>
+        <w:tc>
+          <w:tcPr/>
+          <w:p>
+            <w:pPr>
+              <w:pStyle w:val="Compact"/>
+            </w:pPr>
+            <w:r>
+              <w:t xml:space="preserve">4.36 s</w:t>
+            </w:r>
+          </w:p>
+        </w:tc>
+        <w:tc>
+          <w:tcPr/>
+          <w:p>
+            <w:pPr>
+              <w:pStyle w:val="Compact"/>
+            </w:pPr>
+            <w:r>
+              <w:t xml:space="preserve">measured (includes process-spawn overhead)</w:t>
+            </w:r>
+          </w:p>
+        </w:tc>
+      </w:tr>
+    </w:tbl>
+    <w:p>
+      <w:pPr>
+        <w:pStyle w:val="BodyText"/>
+      </w:pPr>
+      <w:r>
+        <w:t xml:space="preserve">Cross-scale anchors (HPC, 32 threads, screen+refine combined, no finer split):</w:t>
+      </w:r>
+      <w:r>
+        <w:t xml:space="preserve"> </w:t>
+      </w:r>
+      <w:r>
+        <w:t xml:space="preserve">triangle n = 500 genomes (124,750 pairs) 8.5 s; n = 2,000 (1,999,000 pairs)</w:t>
+      </w:r>
+      <w:r>
+        <w:t xml:space="preserve"> </w:t>
+      </w:r>
+      <w:r>
+        <w:t xml:space="preserve">86.6 s; n = 5,000 (12,497,500 pairs) 406.7 s; search 100 × 5,000-genome DB 22.0 s.</w:t>
+      </w:r>
+    </w:p>
+    <w:p>
+      <w:pPr>
+        <w:pStyle w:val="BodyText"/>
+      </w:pPr>
+      <w:r>
+        <w:rPr>
+          <w:b/>
+          <w:bCs/>
+        </w:rPr>
+        <w:t xml:space="preserve">Stage-1 screen recall and pass rate.</w:t>
+      </w:r>
+      <w:r>
+        <w:t xml:space="preserve"> </w:t>
+      </w:r>
+      <w:r>
+        <w:t xml:space="preserve">Gate: window 18 bp, ≥3 shared keys AND</w:t>
+      </w:r>
+      <w:r>
+        <w:t xml:space="preserve"> </w:t>
+      </w:r>
+      <w:r>
+        <w:t xml:space="preserve">containment ≥ 0.001. Full machine-readable table:</w:t>
+      </w:r>
+      <w:r>
+        <w:t xml:space="preserve"> </w:t>
+      </w:r>
+      <w:r>
+        <w:rPr>
+          <w:rStyle w:val="VerbatimChar"/>
+        </w:rPr>
+        <w:t xml:space="preserve">results/efficiency_v8/screen_recall.tsv</w:t>
+      </w:r>
+      <w:r>
+        <w:t xml:space="preserve">.</w:t>
+      </w:r>
+    </w:p>
+    <w:tbl>
+      <w:tblPr>
+        <w:tblStyle w:val="Table"/>
+        <w:tblW w:type="pct" w:w="5000"/>
+        <w:tblLayout w:type="fixed"/>
+        <w:tblLook w:firstRow="1" w:lastRow="0" w:firstColumn="0" w:lastColumn="0" w:noHBand="0" w:noVBand="0" w:val="0020"/>
+      </w:tblPr>
+      <w:tblGrid>
+        <w:gridCol w:w="2376"/>
+        <w:gridCol w:w="2376"/>
+        <w:gridCol w:w="3168"/>
+      </w:tblGrid>
+      <w:tr>
+        <w:trPr>
+          <w:tblHeader w:val="on"/>
+        </w:trPr>
+        <w:tc>
+          <w:tcPr/>
+          <w:p>
+            <w:pPr>
+              <w:pStyle w:val="Compact"/>
+            </w:pPr>
+            <w:r>
+              <w:t xml:space="preserve">Metric</w:t>
+            </w:r>
+          </w:p>
+        </w:tc>
+        <w:tc>
+          <w:tcPr/>
+          <w:p>
+            <w:pPr>
+              <w:pStyle w:val="Compact"/>
+            </w:pPr>
+            <w:r>
+              <w:t xml:space="preserve">Scale</w:t>
+            </w:r>
+          </w:p>
+        </w:tc>
+        <w:tc>
+          <w:tcPr/>
+          <w:p>
+            <w:pPr>
+              <w:pStyle w:val="Compact"/>
+              <w:jc w:val="right"/>
+            </w:pPr>
+            <w:r>
+              <w:t xml:space="preserve">Value</w:t>
+            </w:r>
+          </w:p>
+        </w:tc>
+      </w:tr>
+      <w:tr>
+        <w:tc>
+          <w:tcPr/>
+          <w:p>
+            <w:pPr>
+              <w:pStyle w:val="Compact"/>
+            </w:pPr>
+            <w:r>
+              <w:t xml:space="preserve">Screen pass rate</w:t>
+            </w:r>
+          </w:p>
+        </w:tc>
+        <w:tc>
+          <w:tcPr/>
+          <w:p>
+            <w:pPr>
+              <w:pStyle w:val="Compact"/>
+            </w:pPr>
+            <w:r>
+              <w:t xml:space="preserve">all-vs-all triangle, n = 500 / 2,000 / 5,000</w:t>
+            </w:r>
+          </w:p>
+        </w:tc>
+        <w:tc>
+          <w:tcPr/>
+          <w:p>
+            <w:pPr>
+              <w:pStyle w:val="Compact"/>
+              <w:jc w:val="right"/>
+            </w:pPr>
+            <w:r>
+              <w:t xml:space="preserve">17.3% / 15.3% / 12.6%</w:t>
+            </w:r>
+          </w:p>
+        </w:tc>
+      </w:tr>
+      <w:tr>
+        <w:tc>
+          <w:tcPr/>
+          <w:p>
+            <w:pPr>
+              <w:pStyle w:val="Compact"/>
+            </w:pPr>
+            <w:r>
+              <w:t xml:space="preserve">False-reject rate on validated true pairs (ANIm 80–100)</w:t>
+            </w:r>
+          </w:p>
+        </w:tc>
+        <w:tc>
+          <w:tcPr/>
+          <w:p>
+            <w:pPr>
+              <w:pStyle w:val="Compact"/>
+            </w:pPr>
+            <w:r>
+              <w:t xml:space="preserve">500 true pairs</w:t>
+            </w:r>
+          </w:p>
+        </w:tc>
+        <w:tc>
+          <w:tcPr/>
+          <w:p>
+            <w:pPr>
+              <w:pStyle w:val="Compact"/>
+              <w:jc w:val="right"/>
+            </w:pPr>
+            <w:r>
+              <w:t xml:space="preserve">0 / 500 (0%)</w:t>
+            </w:r>
+          </w:p>
+        </w:tc>
+      </w:tr>
+      <w:tr>
+        <w:tc>
+          <w:tcPr/>
+          <w:p>
+            <w:pPr>
+              <w:pStyle w:val="Compact"/>
+            </w:pPr>
+            <w:r>
+              <w:t xml:space="preserve">False-reject rate, forced pass-all reconciliation</w:t>
+            </w:r>
+          </w:p>
+        </w:tc>
+        <w:tc>
+          <w:tcPr/>
+          <w:p>
+            <w:pPr>
+              <w:pStyle w:val="Compact"/>
+            </w:pPr>
+            <w:r>
+              <w:t xml:space="preserve">triangle n = 2,000</w:t>
+            </w:r>
+          </w:p>
+        </w:tc>
+        <w:tc>
+          <w:tcPr/>
+          <w:p>
+            <w:pPr>
+              <w:pStyle w:val="Compact"/>
+              <w:jc w:val="right"/>
+            </w:pPr>
+            <w:r>
+              <w:t xml:space="preserve">1 / 844 (0.12%; lost pair had af = 0)</w:t>
+            </w:r>
+          </w:p>
+        </w:tc>
+      </w:tr>
+      <w:tr>
+        <w:tc>
+          <w:tcPr/>
+          <w:p>
+            <w:pPr>
+              <w:pStyle w:val="Compact"/>
+            </w:pPr>
+            <w:r>
+              <w:t xml:space="preserve">Search recall vs skani hits</w:t>
+            </w:r>
+          </w:p>
+        </w:tc>
+        <w:tc>
+          <w:tcPr/>
+          <w:p>
+            <w:pPr>
+              <w:pStyle w:val="Compact"/>
+            </w:pPr>
+            <w:r>
+              <w:t xml:space="preserve">100 queries × 5,000-genome DB</w:t>
+            </w:r>
+          </w:p>
+        </w:tc>
+        <w:tc>
+          <w:tcPr/>
+          <w:p>
+            <w:pPr>
+              <w:pStyle w:val="Compact"/>
+              <w:jc w:val="right"/>
+            </w:pPr>
+            <w:r>
+              <w:t xml:space="preserve">12 / 12 (100%)</w:t>
+            </w:r>
+          </w:p>
+        </w:tc>
+      </w:tr>
+      <w:tr>
+        <w:tc>
+          <w:tcPr/>
+          <w:p>
+            <w:pPr>
+              <w:pStyle w:val="Compact"/>
+            </w:pPr>
+            <w:r>
+              <w:t xml:space="preserve">Legacy exact-tag screen (retired), same true pairs</w:t>
+            </w:r>
+          </w:p>
+        </w:tc>
+        <w:tc>
+          <w:tcPr/>
+          <w:p>
+            <w:pPr>
+              <w:pStyle w:val="Compact"/>
+            </w:pPr>
+            <w:r>
+              <w:t xml:space="preserve">500 true pairs</w:t>
+            </w:r>
+          </w:p>
+        </w:tc>
+        <w:tc>
+          <w:tcPr/>
+          <w:p>
+            <w:pPr>
+              <w:pStyle w:val="Compact"/>
+              <w:jc w:val="right"/>
+            </w:pPr>
+            <w:r>
+              <w:t xml:space="preserve">472 / 500 rejected (94.4%)</w:t>
+            </w:r>
+          </w:p>
+        </w:tc>
+      </w:tr>
+    </w:tbl>
+    <w:p>
+      <w:pPr>
+        <w:pStyle w:val="BodyText"/>
+      </w:pPr>
+      <w:r>
+        <w:t xml:space="preserve">Screen numbers at the full GTDB-R207 scale (65,703 genomes) do not exist: the</w:t>
+      </w:r>
+      <w:r>
+        <w:t xml:space="preserve"> </w:t>
+      </w:r>
+      <w:r>
+        <w:t xml:space="preserve">50k held-out benchmark ran</w:t>
+      </w:r>
+      <w:r>
+        <w:t xml:space="preserve"> </w:t>
+      </w:r>
+      <w:r>
+        <w:rPr>
+          <w:rStyle w:val="VerbatimChar"/>
+        </w:rPr>
+        <w:t xml:space="preserve">ani</w:t>
+      </w:r>
+      <w:r>
+        <w:t xml:space="preserve"> </w:t>
+      </w:r>
+      <w:r>
+        <w:t xml:space="preserve">on pre-selected pairs, so the largest scale at</w:t>
+      </w:r>
+      <w:r>
+        <w:t xml:space="preserve"> </w:t>
+      </w:r>
+      <w:r>
+        <w:t xml:space="preserve">which the screen was exercised is the n = 5,000 all-vs-all above.</w:t>
+      </w:r>
+    </w:p>
+    <w:bookmarkEnd w:id="28"/>
+    <w:bookmarkStart w:id="29" w:name="Xe280e63292e65e7cc12ffc5dad24d6a06d19d0f"/>
+    <w:p>
+      <w:pPr>
+        <w:pStyle w:val="Heading2"/>
+      </w:pPr>
+      <w:r>
         <w:t xml:space="preserve">Supplementary Note 1 — Calibration is input-regime-specific (MAG test)</w:t>
       </w:r>
     </w:p>
@@ -3962,8 +4900,8 @@
         <w:t xml:space="preserve">.</w:t>
       </w:r>
     </w:p>
-    <w:bookmarkEnd w:id="27"/>
-    <w:bookmarkStart w:id="28" w:name="Xd013ccaae7d4dde06816ab37078854f863f6c97"/>
+    <w:bookmarkEnd w:id="29"/>
+    <w:bookmarkStart w:id="30" w:name="Xd013ccaae7d4dde06816ab37078854f863f6c97"/>
     <w:p>
       <w:pPr>
         <w:pStyle w:val="Heading2"/>
@@ -4134,8 +5072,8 @@
         <w:t xml:space="preserve">further is not expected to improve it (main text, Methods 4.6).</w:t>
       </w:r>
     </w:p>
-    <w:bookmarkEnd w:id="28"/>
-    <w:bookmarkStart w:id="29" w:name="X335171f238bd89d569aec4e4b5b6643057b0b49"/>
+    <w:bookmarkEnd w:id="30"/>
+    <w:bookmarkStart w:id="31" w:name="X335171f238bd89d569aec4e4b5b6643057b0b49"/>
     <w:p>
       <w:pPr>
         <w:pStyle w:val="Heading2"/>
@@ -4236,8 +5174,8 @@
         <w:t xml:space="preserve">.</w:t>
       </w:r>
     </w:p>
-    <w:bookmarkEnd w:id="29"/>
-    <w:bookmarkStart w:id="30" w:name="Xfd6529be4a0d1bbd51b24452f2b6f26ebe262a9"/>
+    <w:bookmarkEnd w:id="31"/>
+    <w:bookmarkStart w:id="32" w:name="Xfd6529be4a0d1bbd51b24452f2b6f26ebe262a9"/>
     <w:p>
       <w:pPr>
         <w:pStyle w:val="Heading2"/>
@@ -4327,233 +5265,6 @@
       </w:r>
       <w:r>
         <w:t xml:space="preserve">are:</w:t>
-      </w:r>
-    </w:p>
-    <w:p>
-      <w:pPr>
-        <w:pStyle w:val="Compact"/>
-        <w:numPr>
-          <w:ilvl w:val="0"/>
-          <w:numId w:val="1001"/>
-        </w:numPr>
-      </w:pPr>
-      <w:r>
-        <w:rPr>
-          <w:b/>
-          <w:bCs/>
-        </w:rPr>
-        <w:t xml:space="preserve">Found with</w:t>
-      </w:r>
-      <w:r>
-        <w:rPr>
-          <w:b/>
-          <w:bCs/>
-        </w:rPr>
-        <w:t xml:space="preserve"> </w:t>
-      </w:r>
-      <w:r>
-        <w:rPr>
-          <w:rStyle w:val="VerbatimChar"/>
-          <w:b/>
-          <w:bCs/>
-        </w:rPr>
-        <w:t xml:space="preserve">m</w:t>
-      </w:r>
-      <w:r>
-        <w:rPr>
-          <w:b/>
-          <w:bCs/>
-        </w:rPr>
-        <w:t xml:space="preserve"> </w:t>
-      </w:r>
-      <w:r>
-        <w:rPr>
-          <w:b/>
-          <w:bCs/>
-        </w:rPr>
-        <w:t xml:space="preserve">body mismatches</w:t>
-      </w:r>
-      <w:r>
-        <w:t xml:space="preserve"> </w:t>
-      </w:r>
-      <w:r>
-        <w:t xml:space="preserve">(for</w:t>
-      </w:r>
-      <w:r>
-        <w:t xml:space="preserve"> </w:t>
-      </w:r>
-      <w:r>
-        <w:rPr>
-          <w:rStyle w:val="VerbatimChar"/>
-        </w:rPr>
-        <w:t xml:space="preserve">m ≤ tol</w:t>
-      </w:r>
-      <w:r>
-        <w:t xml:space="preserve">):</w:t>
-      </w:r>
-      <w:r>
-        <w:t xml:space="preserve"> </w:t>
-      </w:r>
-      <w:r>
-        <w:rPr>
-          <w:rStyle w:val="VerbatimChar"/>
-        </w:rPr>
-        <w:t xml:space="preserve">P_m(a) = C(b, m) · (1 − a)^m · a^(k−m)</w:t>
-      </w:r>
-      <w:r>
-        <w:t xml:space="preserve">.</w:t>
-      </w:r>
-    </w:p>
-    <w:p>
-      <w:pPr>
-        <w:pStyle w:val="Compact"/>
-        <w:numPr>
-          <w:ilvl w:val="0"/>
-          <w:numId w:val="1001"/>
-        </w:numPr>
-      </w:pPr>
-      <w:r>
-        <w:rPr>
-          <w:b/>
-          <w:bCs/>
-        </w:rPr>
-        <w:t xml:space="preserve">Not found</w:t>
-      </w:r>
-      <w:r>
-        <w:t xml:space="preserve"> </w:t>
-      </w:r>
-      <w:r>
-        <w:t xml:space="preserve">(miss):</w:t>
-      </w:r>
-      <w:r>
-        <w:t xml:space="preserve"> </w:t>
-      </w:r>
-      <w:r>
-        <w:rPr>
-          <w:rStyle w:val="VerbatimChar"/>
-        </w:rPr>
-        <w:t xml:space="preserve">P_miss(a) = 1 − Σ_{m=0}^{tol} P_m(a)</w:t>
-      </w:r>
-      <w:r>
-        <w:t xml:space="preserve">.</w:t>
-      </w:r>
-    </w:p>
-    <w:p>
-      <w:pPr>
-        <w:pStyle w:val="FirstParagraph"/>
-      </w:pPr>
-      <w:r>
-        <w:t xml:space="preserve">Mismatches are observable only in the mutable body — a mutation inside the</w:t>
-      </w:r>
-      <w:r>
-        <w:t xml:space="preserve"> </w:t>
-      </w:r>
-      <w:r>
-        <w:t xml:space="preserve">recognition site deletes the tag entirely — so the site contributes a factor</w:t>
-      </w:r>
-      <w:r>
-        <w:t xml:space="preserve"> </w:t>
-      </w:r>
-      <w:r>
-        <w:rPr>
-          <w:rStyle w:val="VerbatimChar"/>
-        </w:rPr>
-        <w:t xml:space="preserve">a^s</w:t>
-      </w:r>
-      <w:r>
-        <w:t xml:space="preserve"> </w:t>
-      </w:r>
-      <w:r>
-        <w:t xml:space="preserve">to</w:t>
-      </w:r>
-      <w:r>
-        <w:t xml:space="preserve"> </w:t>
-      </w:r>
-      <w:r>
-        <w:rPr>
-          <w:rStyle w:val="VerbatimChar"/>
-        </w:rPr>
-        <w:t xml:space="preserve">P_found</w:t>
-      </w:r>
-      <w:r>
-        <w:t xml:space="preserve"> </w:t>
-      </w:r>
-      <w:r>
-        <w:t xml:space="preserve">but never appears in the histogram. This also sets a hard</w:t>
-      </w:r>
-      <w:r>
-        <w:t xml:space="preserve"> </w:t>
-      </w:r>
-      <w:r>
-        <w:t xml:space="preserve">retention ceiling (for example, ~0.72 at 95% ANI and ~0.50 at 90% with the</w:t>
-      </w:r>
-      <w:r>
-        <w:t xml:space="preserve"> </w:t>
-      </w:r>
-      <w:r>
-        <w:t xml:space="preserve">default budget). The per-enzyme strata differ in</w:t>
-      </w:r>
-      <w:r>
-        <w:t xml:space="preserve"> </w:t>
-      </w:r>
-      <w:r>
-        <w:rPr>
-          <w:rStyle w:val="VerbatimChar"/>
-        </w:rPr>
-        <w:t xml:space="preserve">k</w:t>
-      </w:r>
-      <w:r>
-        <w:t xml:space="preserve"> </w:t>
-      </w:r>
-      <w:r>
-        <w:t xml:space="preserve">and</w:t>
-      </w:r>
-      <w:r>
-        <w:t xml:space="preserve"> </w:t>
-      </w:r>
-      <w:r>
-        <w:rPr>
-          <w:rStyle w:val="VerbatimChar"/>
-        </w:rPr>
-        <w:t xml:space="preserve">b</w:t>
-      </w:r>
-      <w:r>
-        <w:t xml:space="preserve">; the total</w:t>
-      </w:r>
-      <w:r>
-        <w:t xml:space="preserve"> </w:t>
-      </w:r>
-      <w:r>
-        <w:t xml:space="preserve">log-likelihood is the sum over strata and is maximized over the scalar</w:t>
-      </w:r>
-      <w:r>
-        <w:t xml:space="preserve"> </w:t>
-      </w:r>
-      <w:r>
-        <w:rPr>
-          <w:rStyle w:val="VerbatimChar"/>
-        </w:rPr>
-        <w:t xml:space="preserve">a</w:t>
-      </w:r>
-      <w:r>
-        <w:t xml:space="preserve"> </w:t>
-      </w:r>
-      <w:r>
-        <w:t xml:space="preserve">by</w:t>
-      </w:r>
-      <w:r>
-        <w:t xml:space="preserve"> </w:t>
-      </w:r>
-      <w:r>
-        <w:t xml:space="preserve">golden-section search.</w:t>
-      </w:r>
-    </w:p>
-    <w:p>
-      <w:pPr>
-        <w:pStyle w:val="BodyText"/>
-      </w:pPr>
-      <w:r>
-        <w:t xml:space="preserve">Two partial estimators are computed as diagnostics:</w:t>
       </w:r>
     </w:p>
     <w:p>
@@ -4566,30 +5277,69 @@
       </w:pPr>
       <w:r>
         <w:rPr>
-          <w:rStyle w:val="VerbatimChar"/>
-        </w:rPr>
-        <w:t xml:space="preserve">ani_from_loss</w:t>
-      </w:r>
-      <w:r>
-        <w:t xml:space="preserve"> </w:t>
-      </w:r>
-      <w:r>
-        <w:t xml:space="preserve">— uses</w:t>
-      </w:r>
-      <w:r>
-        <w:t xml:space="preserve"> </w:t>
-      </w:r>
-      <w:r>
-        <w:rPr>
-          <w:rStyle w:val="VerbatimChar"/>
-        </w:rPr>
-        <w:t xml:space="preserve">P_miss(a)</w:t>
-      </w:r>
-      <w:r>
-        <w:t xml:space="preserve"> </w:t>
-      </w:r>
-      <w:r>
-        <w:t xml:space="preserve">only (the miss-rate channel).</w:t>
+          <w:b/>
+          <w:bCs/>
+        </w:rPr>
+        <w:t xml:space="preserve">Found with</w:t>
+      </w:r>
+      <w:r>
+        <w:rPr>
+          <w:b/>
+          <w:bCs/>
+        </w:rPr>
+        <w:t xml:space="preserve"> </w:t>
+      </w:r>
+      <w:r>
+        <w:rPr>
+          <w:rStyle w:val="VerbatimChar"/>
+          <w:b/>
+          <w:bCs/>
+        </w:rPr>
+        <w:t xml:space="preserve">m</w:t>
+      </w:r>
+      <w:r>
+        <w:rPr>
+          <w:b/>
+          <w:bCs/>
+        </w:rPr>
+        <w:t xml:space="preserve"> </w:t>
+      </w:r>
+      <w:r>
+        <w:rPr>
+          <w:b/>
+          <w:bCs/>
+        </w:rPr>
+        <w:t xml:space="preserve">body mismatches</w:t>
+      </w:r>
+      <w:r>
+        <w:t xml:space="preserve"> </w:t>
+      </w:r>
+      <w:r>
+        <w:t xml:space="preserve">(for</w:t>
+      </w:r>
+      <w:r>
+        <w:t xml:space="preserve"> </w:t>
+      </w:r>
+      <w:r>
+        <w:rPr>
+          <w:rStyle w:val="VerbatimChar"/>
+        </w:rPr>
+        <w:t xml:space="preserve">m ≤ tol</w:t>
+      </w:r>
+      <w:r>
+        <w:t xml:space="preserve">):</w:t>
+      </w:r>
+      <w:r>
+        <w:t xml:space="preserve"> </w:t>
+      </w:r>
+      <w:r>
+        <w:rPr>
+          <w:rStyle w:val="VerbatimChar"/>
+        </w:rPr>
+        <w:t xml:space="preserve">P_m(a) = C(b, m) · (1 − a)^m · a^(k−m)</w:t>
+      </w:r>
+      <w:r>
+        <w:t xml:space="preserve">.</w:t>
       </w:r>
     </w:p>
     <w:p>
@@ -4602,194 +5352,25 @@
       </w:pPr>
       <w:r>
         <w:rPr>
-          <w:rStyle w:val="VerbatimChar"/>
-        </w:rPr>
-        <w:t xml:space="preserve">ani_from_hist</w:t>
-      </w:r>
-      <w:r>
-        <w:t xml:space="preserve"> </w:t>
-      </w:r>
-      <w:r>
-        <w:t xml:space="preserve">— uses the mismatch histogram renormalized by</w:t>
-      </w:r>
-      <w:r>
-        <w:t xml:space="preserve"> </w:t>
-      </w:r>
-      <w:r>
-        <w:rPr>
-          <w:rStyle w:val="VerbatimChar"/>
-        </w:rPr>
-        <w:t xml:space="preserve">P_found(a)</w:t>
-      </w:r>
-      <w:r>
-        <w:t xml:space="preserve">.</w:t>
-      </w:r>
-    </w:p>
-    <w:p>
-      <w:pPr>
-        <w:pStyle w:val="FirstParagraph"/>
-      </w:pPr>
-      <w:r>
-        <w:t xml:space="preserve">When the data are well behaved these two estimates agree; large divergence</w:t>
-      </w:r>
-      <w:r>
-        <w:t xml:space="preserve"> </w:t>
-      </w:r>
-      <w:r>
-        <w:t xml:space="preserve">signals either model misspecification or sparse data.</w:t>
-      </w:r>
-    </w:p>
-    <w:p>
-      <w:pPr>
-        <w:pStyle w:val="BodyText"/>
-      </w:pPr>
-      <w:r>
-        <w:rPr>
           <w:b/>
           <w:bCs/>
         </w:rPr>
-        <w:t xml:space="preserve">Heterogeneous (gamma) model.</w:t>
-      </w:r>
-      <w:r>
-        <w:t xml:space="preserve"> </w:t>
-      </w:r>
-      <w:r>
-        <w:t xml:space="preserve">To account for rate heterogeneity, each</w:t>
-      </w:r>
-      <w:r>
-        <w:t xml:space="preserve"> </w:t>
-      </w:r>
-      <w:r>
-        <w:t xml:space="preserve">chained region receives a per-region rate multiplier</w:t>
-      </w:r>
-      <w:r>
-        <w:t xml:space="preserve"> </w:t>
-      </w:r>
-      <w:r>
-        <w:rPr>
-          <w:rStyle w:val="VerbatimChar"/>
-        </w:rPr>
-        <w:t xml:space="preserve">r ~ Gamma(α, α)</w:t>
-      </w:r>
-      <w:r>
-        <w:t xml:space="preserve"> </w:t>
-      </w:r>
-      <w:r>
-        <w:t xml:space="preserve">(mean 1,</w:t>
-      </w:r>
-      <w:r>
-        <w:t xml:space="preserve"> </w:t>
-      </w:r>
-      <w:r>
-        <w:t xml:space="preserve">shape α). Because rate variation acts at kilobase scale while a tag is ~30 bp,</w:t>
-      </w:r>
-      <w:r>
-        <w:t xml:space="preserve"> </w:t>
-      </w:r>
-      <w:r>
-        <w:t xml:space="preserve">all sites within one tag share the same</w:t>
-      </w:r>
-      <w:r>
-        <w:t xml:space="preserve"> </w:t>
-      </w:r>
-      <w:r>
-        <w:rPr>
-          <w:rStyle w:val="VerbatimChar"/>
-        </w:rPr>
-        <w:t xml:space="preserve">r</w:t>
-      </w:r>
-      <w:r>
-        <w:t xml:space="preserve">. Integrating</w:t>
-      </w:r>
-      <w:r>
-        <w:t xml:space="preserve"> </w:t>
-      </w:r>
-      <w:r>
-        <w:rPr>
-          <w:rStyle w:val="VerbatimChar"/>
-        </w:rPr>
-        <w:t xml:space="preserve">r</w:t>
-      </w:r>
-      <w:r>
-        <w:t xml:space="preserve"> </w:t>
-      </w:r>
-      <w:r>
-        <w:t xml:space="preserve">out converts the</w:t>
-      </w:r>
-      <w:r>
-        <w:t xml:space="preserve"> </w:t>
-      </w:r>
-      <w:r>
-        <w:t xml:space="preserve">mismatch count distribution into a negative binomial with two parameters: mean</w:t>
-      </w:r>
-      <w:r>
-        <w:t xml:space="preserve"> </w:t>
-      </w:r>
-      <w:r>
-        <w:t xml:space="preserve">divergence</w:t>
-      </w:r>
-      <w:r>
-        <w:t xml:space="preserve"> </w:t>
-      </w:r>
-      <w:r>
-        <w:rPr>
-          <w:rStyle w:val="VerbatimChar"/>
-        </w:rPr>
-        <w:t xml:space="preserve">d</w:t>
-      </w:r>
-      <w:r>
-        <w:t xml:space="preserve"> </w:t>
-      </w:r>
-      <w:r>
-        <w:t xml:space="preserve">and shape</w:t>
-      </w:r>
-      <w:r>
-        <w:t xml:space="preserve"> </w:t>
-      </w:r>
-      <w:r>
-        <w:rPr>
-          <w:rStyle w:val="VerbatimChar"/>
-        </w:rPr>
-        <w:t xml:space="preserve">α</w:t>
-      </w:r>
-      <w:r>
-        <w:t xml:space="preserve">. These are identifiable from the three histogram</w:t>
-      </w:r>
-      <w:r>
-        <w:t xml:space="preserve"> </w:t>
-      </w:r>
-      <w:r>
-        <w:t xml:space="preserve">degrees of freedom plus the miss count. Two guardrails are applied: the second</w:t>
-      </w:r>
-      <w:r>
-        <w:t xml:space="preserve"> </w:t>
-      </w:r>
-      <w:r>
-        <w:t xml:space="preserve">parameter is used only when the likelihood-ratio statistic exceeds 3.841, and</w:t>
-      </w:r>
-      <w:r>
-        <w:t xml:space="preserve"> </w:t>
-      </w:r>
-      <w:r>
-        <w:rPr>
-          <w:rStyle w:val="VerbatimChar"/>
-        </w:rPr>
-        <w:t xml:space="preserve">α</w:t>
-      </w:r>
-      <w:r>
-        <w:t xml:space="preserve"> </w:t>
-      </w:r>
-      <w:r>
-        <w:t xml:space="preserve">is clamped to</w:t>
-      </w:r>
-      <w:r>
-        <w:t xml:space="preserve"> </w:t>
-      </w:r>
-      <w:r>
-        <w:rPr>
-          <w:rStyle w:val="VerbatimChar"/>
-        </w:rPr>
-        <w:t xml:space="preserve">[0.1, 200]</w:t>
+        <w:t xml:space="preserve">Not found</w:t>
+      </w:r>
+      <w:r>
+        <w:t xml:space="preserve"> </w:t>
+      </w:r>
+      <w:r>
+        <w:t xml:space="preserve">(miss):</w:t>
+      </w:r>
+      <w:r>
+        <w:t xml:space="preserve"> </w:t>
+      </w:r>
+      <w:r>
+        <w:rPr>
+          <w:rStyle w:val="VerbatimChar"/>
+        </w:rPr>
+        <w:t xml:space="preserve">P_miss(a) = 1 − Σ_{m=0}^{tol} P_m(a)</w:t>
       </w:r>
       <w:r>
         <w:t xml:space="preserve">.</w:t>
@@ -4797,125 +5378,120 @@
     </w:p>
     <w:p>
       <w:pPr>
+        <w:pStyle w:val="FirstParagraph"/>
+      </w:pPr>
+      <w:r>
+        <w:t xml:space="preserve">Mismatches are observable only in the mutable body — a mutation inside the</w:t>
+      </w:r>
+      <w:r>
+        <w:t xml:space="preserve"> </w:t>
+      </w:r>
+      <w:r>
+        <w:t xml:space="preserve">recognition site deletes the tag entirely — so the site contributes a factor</w:t>
+      </w:r>
+      <w:r>
+        <w:t xml:space="preserve"> </w:t>
+      </w:r>
+      <w:r>
+        <w:rPr>
+          <w:rStyle w:val="VerbatimChar"/>
+        </w:rPr>
+        <w:t xml:space="preserve">a^s</w:t>
+      </w:r>
+      <w:r>
+        <w:t xml:space="preserve"> </w:t>
+      </w:r>
+      <w:r>
+        <w:t xml:space="preserve">to</w:t>
+      </w:r>
+      <w:r>
+        <w:t xml:space="preserve"> </w:t>
+      </w:r>
+      <w:r>
+        <w:rPr>
+          <w:rStyle w:val="VerbatimChar"/>
+        </w:rPr>
+        <w:t xml:space="preserve">P_found</w:t>
+      </w:r>
+      <w:r>
+        <w:t xml:space="preserve"> </w:t>
+      </w:r>
+      <w:r>
+        <w:t xml:space="preserve">but never appears in the histogram. This also sets a hard</w:t>
+      </w:r>
+      <w:r>
+        <w:t xml:space="preserve"> </w:t>
+      </w:r>
+      <w:r>
+        <w:t xml:space="preserve">retention ceiling (for example, ~0.72 at 95% ANI and ~0.50 at 90% with the</w:t>
+      </w:r>
+      <w:r>
+        <w:t xml:space="preserve"> </w:t>
+      </w:r>
+      <w:r>
+        <w:t xml:space="preserve">default budget). The per-enzyme strata differ in</w:t>
+      </w:r>
+      <w:r>
+        <w:t xml:space="preserve"> </w:t>
+      </w:r>
+      <w:r>
+        <w:rPr>
+          <w:rStyle w:val="VerbatimChar"/>
+        </w:rPr>
+        <w:t xml:space="preserve">k</w:t>
+      </w:r>
+      <w:r>
+        <w:t xml:space="preserve"> </w:t>
+      </w:r>
+      <w:r>
+        <w:t xml:space="preserve">and</w:t>
+      </w:r>
+      <w:r>
+        <w:t xml:space="preserve"> </w:t>
+      </w:r>
+      <w:r>
+        <w:rPr>
+          <w:rStyle w:val="VerbatimChar"/>
+        </w:rPr>
+        <w:t xml:space="preserve">b</w:t>
+      </w:r>
+      <w:r>
+        <w:t xml:space="preserve">; the total</w:t>
+      </w:r>
+      <w:r>
+        <w:t xml:space="preserve"> </w:t>
+      </w:r>
+      <w:r>
+        <w:t xml:space="preserve">log-likelihood is the sum over strata and is maximized over the scalar</w:t>
+      </w:r>
+      <w:r>
+        <w:t xml:space="preserve"> </w:t>
+      </w:r>
+      <w:r>
+        <w:rPr>
+          <w:rStyle w:val="VerbatimChar"/>
+        </w:rPr>
+        <w:t xml:space="preserve">a</w:t>
+      </w:r>
+      <w:r>
+        <w:t xml:space="preserve"> </w:t>
+      </w:r>
+      <w:r>
+        <w:t xml:space="preserve">by</w:t>
+      </w:r>
+      <w:r>
+        <w:t xml:space="preserve"> </w:t>
+      </w:r>
+      <w:r>
+        <w:t xml:space="preserve">golden-section search.</w:t>
+      </w:r>
+    </w:p>
+    <w:p>
+      <w:pPr>
         <w:pStyle w:val="BodyText"/>
       </w:pPr>
       <w:r>
-        <w:t xml:space="preserve">At the identifiability boundary with few surviving tags, the gamma shape and</w:t>
-      </w:r>
-      <w:r>
-        <w:t xml:space="preserve"> </w:t>
-      </w:r>
-      <w:r>
-        <w:t xml:space="preserve">mean couple and can overshoot by 4–10 ANI points in the mid-ANI range. The</w:t>
-      </w:r>
-      <w:r>
-        <w:t xml:space="preserve"> </w:t>
-      </w:r>
-      <w:r>
-        <w:t xml:space="preserve">shipped point estimate is therefore</w:t>
-      </w:r>
-      <w:r>
-        <w:t xml:space="preserve"> </w:t>
-      </w:r>
-      <w:r>
-        <w:rPr>
-          <w:b/>
-          <w:bCs/>
-        </w:rPr>
-        <w:t xml:space="preserve">gated</w:t>
-      </w:r>
-      <w:r>
-        <w:t xml:space="preserve">: report the homogeneous (uniform)</w:t>
-      </w:r>
-      <w:r>
-        <w:t xml:space="preserve"> </w:t>
-      </w:r>
-      <w:r>
-        <w:t xml:space="preserve">fit when</w:t>
-      </w:r>
-      <w:r>
-        <w:t xml:space="preserve"> </w:t>
-      </w:r>
-      <w:r>
-        <w:rPr>
-          <w:rStyle w:val="VerbatimChar"/>
-        </w:rPr>
-        <w:t xml:space="preserve">|ani_from_loss − ani_from_hist| &gt; 5</w:t>
-      </w:r>
-      <w:r>
-        <w:t xml:space="preserve"> </w:t>
-      </w:r>
-      <w:r>
-        <w:t xml:space="preserve">ANI points, otherwise report the</w:t>
-      </w:r>
-      <w:r>
-        <w:t xml:space="preserve"> </w:t>
-      </w:r>
-      <w:r>
-        <w:t xml:space="preserve">gamma fit. The threshold is an effect size, not a significance level; threshold</w:t>
-      </w:r>
-      <w:r>
-        <w:t xml:space="preserve"> </w:t>
-      </w:r>
-      <w:r>
-        <w:t xml:space="preserve">sweeps on the GTDB-ANIm training matrix show a flat optimum between 4.5 and 6</w:t>
-      </w:r>
-      <w:r>
-        <w:t xml:space="preserve"> </w:t>
-      </w:r>
-      <w:r>
-        <w:t xml:space="preserve">points. The gate fires on 5.5% of GTDB pairs, on all 15 mid-ANI pairs (where it</w:t>
-      </w:r>
-      <w:r>
-        <w:t xml:space="preserve"> </w:t>
-      </w:r>
-      <w:r>
-        <w:t xml:space="preserve">reduces gamma MAE from 4.48 to 1.42), and never on uniform-rate simulations,</w:t>
-      </w:r>
-      <w:r>
-        <w:t xml:space="preserve"> </w:t>
-      </w:r>
-      <w:r>
-        <w:t xml:space="preserve">mosaic simulations, or oral/gut same-species pairs, preserving gamma’s advantage</w:t>
-      </w:r>
-      <w:r>
-        <w:t xml:space="preserve"> </w:t>
-      </w:r>
-      <w:r>
-        <w:t xml:space="preserve">exactly where it is real.</w:t>
-      </w:r>
-    </w:p>
-    <w:p>
-      <w:pPr>
-        <w:pStyle w:val="BodyText"/>
-      </w:pPr>
-      <w:r>
-        <w:rPr>
-          <w:b/>
-          <w:bCs/>
-        </w:rPr>
-        <w:t xml:space="preserve">Flags.</w:t>
-      </w:r>
-      <w:r>
-        <w:t xml:space="preserve"> </w:t>
-      </w:r>
-      <w:r>
-        <w:t xml:space="preserve">The</w:t>
-      </w:r>
-      <w:r>
-        <w:t xml:space="preserve"> </w:t>
-      </w:r>
-      <w:r>
-        <w:rPr>
-          <w:rStyle w:val="VerbatimChar"/>
-        </w:rPr>
-        <w:t xml:space="preserve">flag</w:t>
-      </w:r>
-      <w:r>
-        <w:t xml:space="preserve"> </w:t>
-      </w:r>
-      <w:r>
-        <w:t xml:space="preserve">column is hierarchical:</w:t>
+        <w:t xml:space="preserve">Two partial estimators are computed as diagnostics:</w:t>
       </w:r>
     </w:p>
     <w:p>
@@ -4930,13 +5506,28 @@
         <w:rPr>
           <w:rStyle w:val="VerbatimChar"/>
         </w:rPr>
-        <w:t xml:space="preserve">BELOW_DETECTION</w:t>
-      </w:r>
-      <w:r>
-        <w:t xml:space="preserve"> </w:t>
-      </w:r>
-      <w:r>
-        <w:t xml:space="preserve">— expected retention &lt; 0.20 (takes precedence).</w:t>
+        <w:t xml:space="preserve">ani_from_loss</w:t>
+      </w:r>
+      <w:r>
+        <w:t xml:space="preserve"> </w:t>
+      </w:r>
+      <w:r>
+        <w:t xml:space="preserve">— uses</w:t>
+      </w:r>
+      <w:r>
+        <w:t xml:space="preserve"> </w:t>
+      </w:r>
+      <w:r>
+        <w:rPr>
+          <w:rStyle w:val="VerbatimChar"/>
+        </w:rPr>
+        <w:t xml:space="preserve">P_miss(a)</w:t>
+      </w:r>
+      <w:r>
+        <w:t xml:space="preserve"> </w:t>
+      </w:r>
+      <w:r>
+        <w:t xml:space="preserve">only (the miss-rate channel).</w:t>
       </w:r>
     </w:p>
     <w:p>
@@ -4951,25 +5542,318 @@
         <w:rPr>
           <w:rStyle w:val="VerbatimChar"/>
         </w:rPr>
-        <w:t xml:space="preserve">INCONSISTENT</w:t>
-      </w:r>
-      <w:r>
-        <w:t xml:space="preserve"> </w:t>
-      </w:r>
-      <w:r>
-        <w:t xml:space="preserve">— the gate fell back to the uniform model, or the chains carry</w:t>
-      </w:r>
-      <w:r>
-        <w:t xml:space="preserve"> </w:t>
-      </w:r>
-      <w:r>
-        <w:t xml:space="preserve">&gt; 0.5 rearrangement breakpoints per anchor (a structural statistic independent</w:t>
-      </w:r>
-      <w:r>
-        <w:t xml:space="preserve"> </w:t>
-      </w:r>
-      <w:r>
-        <w:t xml:space="preserve">of the chain-restricted likelihood denominator).</w:t>
+        <w:t xml:space="preserve">ani_from_hist</w:t>
+      </w:r>
+      <w:r>
+        <w:t xml:space="preserve"> </w:t>
+      </w:r>
+      <w:r>
+        <w:t xml:space="preserve">— uses the mismatch histogram renormalized by</w:t>
+      </w:r>
+      <w:r>
+        <w:t xml:space="preserve"> </w:t>
+      </w:r>
+      <w:r>
+        <w:rPr>
+          <w:rStyle w:val="VerbatimChar"/>
+        </w:rPr>
+        <w:t xml:space="preserve">P_found(a)</w:t>
+      </w:r>
+      <w:r>
+        <w:t xml:space="preserve">.</w:t>
+      </w:r>
+    </w:p>
+    <w:p>
+      <w:pPr>
+        <w:pStyle w:val="FirstParagraph"/>
+      </w:pPr>
+      <w:r>
+        <w:t xml:space="preserve">When the data are well behaved these two estimates agree; large divergence</w:t>
+      </w:r>
+      <w:r>
+        <w:t xml:space="preserve"> </w:t>
+      </w:r>
+      <w:r>
+        <w:t xml:space="preserve">signals either model misspecification or sparse data.</w:t>
+      </w:r>
+    </w:p>
+    <w:p>
+      <w:pPr>
+        <w:pStyle w:val="BodyText"/>
+      </w:pPr>
+      <w:r>
+        <w:rPr>
+          <w:b/>
+          <w:bCs/>
+        </w:rPr>
+        <w:t xml:space="preserve">Heterogeneous (gamma) model.</w:t>
+      </w:r>
+      <w:r>
+        <w:t xml:space="preserve"> </w:t>
+      </w:r>
+      <w:r>
+        <w:t xml:space="preserve">To account for rate heterogeneity, each</w:t>
+      </w:r>
+      <w:r>
+        <w:t xml:space="preserve"> </w:t>
+      </w:r>
+      <w:r>
+        <w:t xml:space="preserve">chained region receives a per-region rate multiplier</w:t>
+      </w:r>
+      <w:r>
+        <w:t xml:space="preserve"> </w:t>
+      </w:r>
+      <w:r>
+        <w:rPr>
+          <w:rStyle w:val="VerbatimChar"/>
+        </w:rPr>
+        <w:t xml:space="preserve">r ~ Gamma(α, α)</w:t>
+      </w:r>
+      <w:r>
+        <w:t xml:space="preserve"> </w:t>
+      </w:r>
+      <w:r>
+        <w:t xml:space="preserve">(mean 1,</w:t>
+      </w:r>
+      <w:r>
+        <w:t xml:space="preserve"> </w:t>
+      </w:r>
+      <w:r>
+        <w:t xml:space="preserve">shape α). Because rate variation acts at kilobase scale while a tag is ~30 bp,</w:t>
+      </w:r>
+      <w:r>
+        <w:t xml:space="preserve"> </w:t>
+      </w:r>
+      <w:r>
+        <w:t xml:space="preserve">all sites within one tag share the same</w:t>
+      </w:r>
+      <w:r>
+        <w:t xml:space="preserve"> </w:t>
+      </w:r>
+      <w:r>
+        <w:rPr>
+          <w:rStyle w:val="VerbatimChar"/>
+        </w:rPr>
+        <w:t xml:space="preserve">r</w:t>
+      </w:r>
+      <w:r>
+        <w:t xml:space="preserve">. Integrating</w:t>
+      </w:r>
+      <w:r>
+        <w:t xml:space="preserve"> </w:t>
+      </w:r>
+      <w:r>
+        <w:rPr>
+          <w:rStyle w:val="VerbatimChar"/>
+        </w:rPr>
+        <w:t xml:space="preserve">r</w:t>
+      </w:r>
+      <w:r>
+        <w:t xml:space="preserve"> </w:t>
+      </w:r>
+      <w:r>
+        <w:t xml:space="preserve">out converts the</w:t>
+      </w:r>
+      <w:r>
+        <w:t xml:space="preserve"> </w:t>
+      </w:r>
+      <w:r>
+        <w:t xml:space="preserve">mismatch count distribution into a negative binomial with two parameters: mean</w:t>
+      </w:r>
+      <w:r>
+        <w:t xml:space="preserve"> </w:t>
+      </w:r>
+      <w:r>
+        <w:t xml:space="preserve">divergence</w:t>
+      </w:r>
+      <w:r>
+        <w:t xml:space="preserve"> </w:t>
+      </w:r>
+      <w:r>
+        <w:rPr>
+          <w:rStyle w:val="VerbatimChar"/>
+        </w:rPr>
+        <w:t xml:space="preserve">d</w:t>
+      </w:r>
+      <w:r>
+        <w:t xml:space="preserve"> </w:t>
+      </w:r>
+      <w:r>
+        <w:t xml:space="preserve">and shape</w:t>
+      </w:r>
+      <w:r>
+        <w:t xml:space="preserve"> </w:t>
+      </w:r>
+      <w:r>
+        <w:rPr>
+          <w:rStyle w:val="VerbatimChar"/>
+        </w:rPr>
+        <w:t xml:space="preserve">α</w:t>
+      </w:r>
+      <w:r>
+        <w:t xml:space="preserve">. These are identifiable from the three histogram</w:t>
+      </w:r>
+      <w:r>
+        <w:t xml:space="preserve"> </w:t>
+      </w:r>
+      <w:r>
+        <w:t xml:space="preserve">degrees of freedom plus the miss count. Two guardrails are applied: the second</w:t>
+      </w:r>
+      <w:r>
+        <w:t xml:space="preserve"> </w:t>
+      </w:r>
+      <w:r>
+        <w:t xml:space="preserve">parameter is used only when the likelihood-ratio statistic exceeds 3.841, and</w:t>
+      </w:r>
+      <w:r>
+        <w:t xml:space="preserve"> </w:t>
+      </w:r>
+      <w:r>
+        <w:rPr>
+          <w:rStyle w:val="VerbatimChar"/>
+        </w:rPr>
+        <w:t xml:space="preserve">α</w:t>
+      </w:r>
+      <w:r>
+        <w:t xml:space="preserve"> </w:t>
+      </w:r>
+      <w:r>
+        <w:t xml:space="preserve">is clamped to</w:t>
+      </w:r>
+      <w:r>
+        <w:t xml:space="preserve"> </w:t>
+      </w:r>
+      <w:r>
+        <w:rPr>
+          <w:rStyle w:val="VerbatimChar"/>
+        </w:rPr>
+        <w:t xml:space="preserve">[0.1, 200]</w:t>
+      </w:r>
+      <w:r>
+        <w:t xml:space="preserve">.</w:t>
+      </w:r>
+    </w:p>
+    <w:p>
+      <w:pPr>
+        <w:pStyle w:val="BodyText"/>
+      </w:pPr>
+      <w:r>
+        <w:t xml:space="preserve">At the identifiability boundary with few surviving tags, the gamma shape and</w:t>
+      </w:r>
+      <w:r>
+        <w:t xml:space="preserve"> </w:t>
+      </w:r>
+      <w:r>
+        <w:t xml:space="preserve">mean couple and can overshoot by 4–10 ANI points in the mid-ANI range. The</w:t>
+      </w:r>
+      <w:r>
+        <w:t xml:space="preserve"> </w:t>
+      </w:r>
+      <w:r>
+        <w:t xml:space="preserve">shipped point estimate is therefore</w:t>
+      </w:r>
+      <w:r>
+        <w:t xml:space="preserve"> </w:t>
+      </w:r>
+      <w:r>
+        <w:rPr>
+          <w:b/>
+          <w:bCs/>
+        </w:rPr>
+        <w:t xml:space="preserve">gated</w:t>
+      </w:r>
+      <w:r>
+        <w:t xml:space="preserve">: report the homogeneous (uniform)</w:t>
+      </w:r>
+      <w:r>
+        <w:t xml:space="preserve"> </w:t>
+      </w:r>
+      <w:r>
+        <w:t xml:space="preserve">fit when</w:t>
+      </w:r>
+      <w:r>
+        <w:t xml:space="preserve"> </w:t>
+      </w:r>
+      <w:r>
+        <w:rPr>
+          <w:rStyle w:val="VerbatimChar"/>
+        </w:rPr>
+        <w:t xml:space="preserve">|ani_from_loss − ani_from_hist| &gt; 5</w:t>
+      </w:r>
+      <w:r>
+        <w:t xml:space="preserve"> </w:t>
+      </w:r>
+      <w:r>
+        <w:t xml:space="preserve">ANI points, otherwise report the</w:t>
+      </w:r>
+      <w:r>
+        <w:t xml:space="preserve"> </w:t>
+      </w:r>
+      <w:r>
+        <w:t xml:space="preserve">gamma fit. The threshold is an effect size, not a significance level; threshold</w:t>
+      </w:r>
+      <w:r>
+        <w:t xml:space="preserve"> </w:t>
+      </w:r>
+      <w:r>
+        <w:t xml:space="preserve">sweeps on the GTDB-ANIm training matrix show a flat optimum between 4.5 and 6</w:t>
+      </w:r>
+      <w:r>
+        <w:t xml:space="preserve"> </w:t>
+      </w:r>
+      <w:r>
+        <w:t xml:space="preserve">points. The gate fires on 5.5% of GTDB pairs, on all 15 mid-ANI pairs (where it</w:t>
+      </w:r>
+      <w:r>
+        <w:t xml:space="preserve"> </w:t>
+      </w:r>
+      <w:r>
+        <w:t xml:space="preserve">reduces gamma MAE from 4.48 to 1.42), and never on uniform-rate simulations,</w:t>
+      </w:r>
+      <w:r>
+        <w:t xml:space="preserve"> </w:t>
+      </w:r>
+      <w:r>
+        <w:t xml:space="preserve">mosaic simulations, or oral/gut same-species pairs, preserving gamma’s advantage</w:t>
+      </w:r>
+      <w:r>
+        <w:t xml:space="preserve"> </w:t>
+      </w:r>
+      <w:r>
+        <w:t xml:space="preserve">exactly where it is real.</w:t>
+      </w:r>
+    </w:p>
+    <w:p>
+      <w:pPr>
+        <w:pStyle w:val="BodyText"/>
+      </w:pPr>
+      <w:r>
+        <w:rPr>
+          <w:b/>
+          <w:bCs/>
+        </w:rPr>
+        <w:t xml:space="preserve">Flags.</w:t>
+      </w:r>
+      <w:r>
+        <w:t xml:space="preserve"> </w:t>
+      </w:r>
+      <w:r>
+        <w:t xml:space="preserve">The</w:t>
+      </w:r>
+      <w:r>
+        <w:t xml:space="preserve"> </w:t>
+      </w:r>
+      <w:r>
+        <w:rPr>
+          <w:rStyle w:val="VerbatimChar"/>
+        </w:rPr>
+        <w:t xml:space="preserve">flag</w:t>
+      </w:r>
+      <w:r>
+        <w:t xml:space="preserve"> </w:t>
+      </w:r>
+      <w:r>
+        <w:t xml:space="preserve">column is hierarchical:</w:t>
       </w:r>
     </w:p>
     <w:p>
@@ -4977,13 +5861,67 @@
         <w:pStyle w:val="Compact"/>
         <w:numPr>
           <w:ilvl w:val="0"/>
-          <w:numId w:val="1003"/>
+          <w:numId w:val="1004"/>
         </w:numPr>
       </w:pPr>
       <w:r>
         <w:rPr>
           <w:rStyle w:val="VerbatimChar"/>
         </w:rPr>
+        <w:t xml:space="preserve">BELOW_DETECTION</w:t>
+      </w:r>
+      <w:r>
+        <w:t xml:space="preserve"> </w:t>
+      </w:r>
+      <w:r>
+        <w:t xml:space="preserve">— expected retention &lt; 0.20 (takes precedence).</w:t>
+      </w:r>
+    </w:p>
+    <w:p>
+      <w:pPr>
+        <w:pStyle w:val="Compact"/>
+        <w:numPr>
+          <w:ilvl w:val="0"/>
+          <w:numId w:val="1004"/>
+        </w:numPr>
+      </w:pPr>
+      <w:r>
+        <w:rPr>
+          <w:rStyle w:val="VerbatimChar"/>
+        </w:rPr>
+        <w:t xml:space="preserve">INCONSISTENT</w:t>
+      </w:r>
+      <w:r>
+        <w:t xml:space="preserve"> </w:t>
+      </w:r>
+      <w:r>
+        <w:t xml:space="preserve">— the gate fell back to the uniform model, or the chains carry</w:t>
+      </w:r>
+      <w:r>
+        <w:t xml:space="preserve"> </w:t>
+      </w:r>
+      <w:r>
+        <w:t xml:space="preserve">&gt; 0.5 rearrangement breakpoints per anchor (a structural statistic independent</w:t>
+      </w:r>
+      <w:r>
+        <w:t xml:space="preserve"> </w:t>
+      </w:r>
+      <w:r>
+        <w:t xml:space="preserve">of the chain-restricted likelihood denominator).</w:t>
+      </w:r>
+    </w:p>
+    <w:p>
+      <w:pPr>
+        <w:pStyle w:val="Compact"/>
+        <w:numPr>
+          <w:ilvl w:val="0"/>
+          <w:numId w:val="1004"/>
+        </w:numPr>
+      </w:pPr>
+      <w:r>
+        <w:rPr>
+          <w:rStyle w:val="VerbatimChar"/>
+        </w:rPr>
         <w:t xml:space="preserve">ok</w:t>
       </w:r>
       <w:r>
@@ -5013,8 +5951,8 @@
         <w:t xml:space="preserve">mid-ANI 0.343 vs 1.113), at a disclosed cost in near-clonal sensitivity.</w:t>
       </w:r>
     </w:p>
-    <w:bookmarkEnd w:id="30"/>
-    <w:bookmarkStart w:id="31" w:name="X39919e213b71580968f061584f61586905cff88"/>
+    <w:bookmarkEnd w:id="32"/>
+    <w:bookmarkStart w:id="33" w:name="X39919e213b71580968f061584f61586905cff88"/>
     <w:p>
       <w:pPr>
         <w:pStyle w:val="Heading2"/>
@@ -5143,8 +6081,8 @@
         <w:t xml:space="preserve">the real-genome correction layer.</w:t>
       </w:r>
     </w:p>
-    <w:bookmarkEnd w:id="31"/>
-    <w:bookmarkStart w:id="32" w:name="Xb1eb0d0077db50146ab5cb7a6cc963413c0d2d3"/>
+    <w:bookmarkEnd w:id="33"/>
+    <w:bookmarkStart w:id="34" w:name="Xb1eb0d0077db50146ab5cb7a6cc963413c0d2d3"/>
     <w:p>
       <w:pPr>
         <w:pStyle w:val="Heading2"/>
@@ -6100,8 +7038,674 @@
         <w:t xml:space="preserve">not sensitive to the exact threshold in the 97–99% window.</w:t>
       </w:r>
     </w:p>
-    <w:bookmarkEnd w:id="32"/>
-    <w:bookmarkEnd w:id="33"/>
+    <w:bookmarkEnd w:id="34"/>
+    <w:bookmarkStart w:id="35" w:name="X59d740001b6791abdcf4dea327c946dcfbb2e56"/>
+    <w:p>
+      <w:pPr>
+        <w:pStyle w:val="Heading2"/>
+      </w:pPr>
+      <w:r>
+        <w:t xml:space="preserve">Supplementary Note 7 — Count-based versus ratio-based structural metrics under assembly fragmentation</w:t>
+      </w:r>
+    </w:p>
+    <w:p>
+      <w:pPr>
+        <w:pStyle w:val="FirstParagraph"/>
+      </w:pPr>
+      <w:r>
+        <w:t xml:space="preserve">The choice of structural metric is not arbitrary: under assembly fragmentation,</w:t>
+      </w:r>
+      <w:r>
+        <w:t xml:space="preserve"> </w:t>
+      </w:r>
+      <w:r>
+        <w:t xml:space="preserve">count-based and length-weighted ratio-based statistics fail in</w:t>
+      </w:r>
+      <w:r>
+        <w:t xml:space="preserve"> </w:t>
+      </w:r>
+      <w:r>
+        <w:rPr>
+          <w:i/>
+          <w:iCs/>
+        </w:rPr>
+        <w:t xml:space="preserve">different</w:t>
+      </w:r>
+      <w:r>
+        <w:t xml:space="preserve">, closed</w:t>
+      </w:r>
+      <w:r>
+        <w:t xml:space="preserve"> </w:t>
+      </w:r>
+      <w:r>
+        <w:t xml:space="preserve">ways. This note summarizes the general result (derived in full, with proofs and</w:t>
+      </w:r>
+      <w:r>
+        <w:t xml:space="preserve"> </w:t>
+      </w:r>
+      <w:r>
+        <w:t xml:space="preserve">additional measurements, in the companion Syn2b repository,</w:t>
+      </w:r>
+      <w:r>
+        <w:t xml:space="preserve"> </w:t>
+      </w:r>
+      <w:r>
+        <w:rPr>
+          <w:rStyle w:val="VerbatimChar"/>
+        </w:rPr>
+        <w:t xml:space="preserve">docs/MATH_REVIEW.md</w:t>
+      </w:r>
+      <w:r>
+        <w:t xml:space="preserve">, https://github.com/HuangShiLab/Syn2b).</w:t>
+      </w:r>
+    </w:p>
+    <w:p>
+      <w:pPr>
+        <w:pStyle w:val="BodyText"/>
+      </w:pPr>
+      <w:r>
+        <w:rPr>
+          <w:b/>
+          <w:bCs/>
+        </w:rPr>
+        <w:t xml:space="preserve">Setup.</w:t>
+      </w:r>
+      <w:r>
+        <w:t xml:space="preserve"> </w:t>
+      </w:r>
+      <w:r>
+        <w:t xml:space="preserve">Every observation process partitions a genome into contiguous observed</w:t>
+      </w:r>
+      <w:r>
+        <w:t xml:space="preserve"> </w:t>
+      </w:r>
+      <w:r>
+        <w:t xml:space="preserve">segments: contigs (assembly), 1-to-1 blocks (nucmer), or anchor chains (Syn2bANI).</w:t>
+      </w:r>
+      <w:r>
+        <w:t xml:space="preserve"> </w:t>
+      </w:r>
+      <w:r>
+        <w:t xml:space="preserve">A genome carrying</w:t>
+      </w:r>
+      <w:r>
+        <w:t xml:space="preserve"> </w:t>
+      </w:r>
+      <w:r>
+        <w:rPr>
+          <w:rStyle w:val="VerbatimChar"/>
+        </w:rPr>
+        <w:t xml:space="preserve">S</w:t>
+      </w:r>
+      <w:r>
+        <w:t xml:space="preserve"> </w:t>
+      </w:r>
+      <w:r>
+        <w:t xml:space="preserve">landmarks, cut into</w:t>
+      </w:r>
+      <w:r>
+        <w:t xml:space="preserve"> </w:t>
+      </w:r>
+      <w:r>
+        <w:rPr>
+          <w:rStyle w:val="VerbatimChar"/>
+        </w:rPr>
+        <w:t xml:space="preserve">K</w:t>
+      </w:r>
+      <w:r>
+        <w:t xml:space="preserve"> </w:t>
+      </w:r>
+      <w:r>
+        <w:t xml:space="preserve">segments, has</w:t>
+      </w:r>
+      <w:r>
+        <w:t xml:space="preserve"> </w:t>
+      </w:r>
+      <w:r>
+        <w:rPr>
+          <w:rStyle w:val="VerbatimChar"/>
+        </w:rPr>
+        <w:t xml:space="preserve">K − 1</w:t>
+      </w:r>
+      <w:r>
+        <w:t xml:space="preserve"> </w:t>
+      </w:r>
+      <w:r>
+        <w:t xml:space="preserve">internal</w:t>
+      </w:r>
+      <w:r>
+        <w:t xml:space="preserve"> </w:t>
+      </w:r>
+      <w:r>
+        <w:t xml:space="preserve">boundaries at which adjacency information is absent — not contradicted.</w:t>
+      </w:r>
+    </w:p>
+    <w:p>
+      <w:pPr>
+        <w:pStyle w:val="BodyText"/>
+      </w:pPr>
+      <w:r>
+        <w:rPr>
+          <w:b/>
+          <w:bCs/>
+        </w:rPr>
+        <w:t xml:space="preserve">Transition counts acquire a term linear in K.</w:t>
+      </w:r>
+      <w:r>
+        <w:t xml:space="preserve"> </w:t>
+      </w:r>
+      <w:r>
+        <w:t xml:space="preserve">Observable adjacencies drop</w:t>
+      </w:r>
+      <w:r>
+        <w:t xml:space="preserve"> </w:t>
+      </w:r>
+      <w:r>
+        <w:t xml:space="preserve">from</w:t>
+      </w:r>
+      <w:r>
+        <w:t xml:space="preserve"> </w:t>
+      </w:r>
+      <w:r>
+        <w:rPr>
+          <w:rStyle w:val="VerbatimChar"/>
+        </w:rPr>
+        <w:t xml:space="preserve">S</w:t>
+      </w:r>
+      <w:r>
+        <w:t xml:space="preserve"> </w:t>
+      </w:r>
+      <w:r>
+        <w:t xml:space="preserve">(circular) to</w:t>
+      </w:r>
+      <w:r>
+        <w:t xml:space="preserve"> </w:t>
+      </w:r>
+      <w:r>
+        <w:rPr>
+          <w:rStyle w:val="VerbatimChar"/>
+        </w:rPr>
+        <w:t xml:space="preserve">S − K</w:t>
+      </w:r>
+      <w:r>
+        <w:t xml:space="preserve">, so any statistic that counts transitions —</w:t>
+      </w:r>
+      <w:r>
+        <w:t xml:space="preserve"> </w:t>
+      </w:r>
+      <w:r>
+        <w:t xml:space="preserve">junctions, breakpoints, blocks, chain ends — has</w:t>
+      </w:r>
+    </w:p>
+    <w:p>
+      <w:pPr>
+        <w:pStyle w:val="SourceCode"/>
+      </w:pPr>
+      <w:r>
+        <w:rPr>
+          <w:rStyle w:val="VerbatimChar"/>
+        </w:rPr>
+        <w:t xml:space="preserve">E[T] = T_true + c·(K − 1) + …</w:t>
+      </w:r>
+    </w:p>
+    <w:p>
+      <w:pPr>
+        <w:pStyle w:val="FirstParagraph"/>
+      </w:pPr>
+      <w:r>
+        <w:t xml:space="preserve">where the constant</w:t>
+      </w:r>
+      <w:r>
+        <w:t xml:space="preserve"> </w:t>
+      </w:r>
+      <w:r>
+        <w:rPr>
+          <w:rStyle w:val="VerbatimChar"/>
+        </w:rPr>
+        <w:t xml:space="preserve">c</w:t>
+      </w:r>
+      <w:r>
+        <w:t xml:space="preserve"> </w:t>
+      </w:r>
+      <w:r>
+        <w:t xml:space="preserve">is decided by one design choice: is an absent adjacency</w:t>
+      </w:r>
+      <w:r>
+        <w:t xml:space="preserve"> </w:t>
+      </w:r>
+      <w:r>
+        <w:t xml:space="preserve">counted as a contradicted one? Measured values of</w:t>
+      </w:r>
+      <w:r>
+        <w:t xml:space="preserve"> </w:t>
+      </w:r>
+      <w:r>
+        <w:rPr>
+          <w:rStyle w:val="VerbatimChar"/>
+        </w:rPr>
+        <w:t xml:space="preserve">c</w:t>
+      </w:r>
+      <w:r>
+        <w:t xml:space="preserve">: counting absence as a</w:t>
+      </w:r>
+      <w:r>
+        <w:t xml:space="preserve"> </w:t>
+      </w:r>
+      <w:r>
+        <w:t xml:space="preserve">junction gives</w:t>
+      </w:r>
+      <w:r>
+        <w:t xml:space="preserve"> </w:t>
+      </w:r>
+      <w:r>
+        <w:rPr>
+          <w:rStyle w:val="VerbatimChar"/>
+        </w:rPr>
+        <w:t xml:space="preserve">c = 1</w:t>
+      </w:r>
+      <w:r>
+        <w:t xml:space="preserve"> </w:t>
+      </w:r>
+      <w:r>
+        <w:t xml:space="preserve">(119 false junctions on a 120-contig assembly of a genome</w:t>
+      </w:r>
+      <w:r>
+        <w:t xml:space="preserve"> </w:t>
+      </w:r>
+      <w:r>
+        <w:t xml:space="preserve">against itself); dnadiff</w:t>
+      </w:r>
+      <w:r>
+        <w:t xml:space="preserve"> </w:t>
+      </w:r>
+      <w:r>
+        <w:rPr>
+          <w:rStyle w:val="VerbatimChar"/>
+        </w:rPr>
+        <w:t xml:space="preserve">Breakpoints</w:t>
+      </w:r>
+      <w:r>
+        <w:t xml:space="preserve"> </w:t>
+      </w:r>
+      <w:r>
+        <w:t xml:space="preserve">has</w:t>
+      </w:r>
+      <w:r>
+        <w:t xml:space="preserve"> </w:t>
+      </w:r>
+      <w:r>
+        <w:rPr>
+          <w:rStyle w:val="VerbatimChar"/>
+        </w:rPr>
+        <w:t xml:space="preserve">c = 1</w:t>
+      </w:r>
+      <w:r>
+        <w:t xml:space="preserve"> </w:t>
+      </w:r>
+      <w:r>
+        <w:t xml:space="preserve">by construction (intercept 290</w:t>
+      </w:r>
+      <w:r>
+        <w:t xml:space="preserve"> </w:t>
+      </w:r>
+      <w:r>
+        <w:t xml:space="preserve">in</w:t>
+      </w:r>
+      <w:r>
+        <w:t xml:space="preserve"> </w:t>
+      </w:r>
+      <w:r>
+        <w:rPr>
+          <w:rStyle w:val="VerbatimChar"/>
+        </w:rPr>
+        <w:t xml:space="preserve">dnadiff_breakpoints = 5.35·breakpoint_count + 290</w:t>
+      </w:r>
+      <w:r>
+        <w:t xml:space="preserve">, with median 92 where</w:t>
+      </w:r>
+      <w:r>
+        <w:t xml:space="preserve"> </w:t>
+      </w:r>
+      <w:r>
+        <w:t xml:space="preserve">Syn2bANI reports zero); requiring a positive contradiction before counting a</w:t>
+      </w:r>
+      <w:r>
+        <w:t xml:space="preserve"> </w:t>
+      </w:r>
+      <w:r>
+        <w:t xml:space="preserve">junction gives</w:t>
+      </w:r>
+      <w:r>
+        <w:t xml:space="preserve"> </w:t>
+      </w:r>
+      <w:r>
+        <w:rPr>
+          <w:rStyle w:val="VerbatimChar"/>
+        </w:rPr>
+        <w:t xml:space="preserve">c = 0</w:t>
+      </w:r>
+      <w:r>
+        <w:t xml:space="preserve"> </w:t>
+      </w:r>
+      <w:r>
+        <w:t xml:space="preserve">(zero false junctions up to K = 1,000). The term is</w:t>
+      </w:r>
+      <w:r>
+        <w:t xml:space="preserve"> </w:t>
+      </w:r>
+      <w:r>
+        <w:t xml:space="preserve">therefore removable in principle, not merely reducible.</w:t>
+      </w:r>
+    </w:p>
+    <w:p>
+      <w:pPr>
+        <w:pStyle w:val="BodyText"/>
+      </w:pPr>
+      <w:r>
+        <w:rPr>
+          <w:b/>
+          <w:bCs/>
+        </w:rPr>
+        <w:t xml:space="preserve">Length-weighted ratios are invariant to K.</w:t>
+      </w:r>
+      <w:r>
+        <w:t xml:space="preserve"> </w:t>
+      </w:r>
+      <w:r>
+        <w:t xml:space="preserve">Define</w:t>
+      </w:r>
+      <w:r>
+        <w:t xml:space="preserve"> </w:t>
+      </w:r>
+      <w:r>
+        <w:rPr>
+          <w:rStyle w:val="VerbatimChar"/>
+        </w:rPr>
+        <w:t xml:space="preserve">F = Σ_{i∈P} ℓ_i / Σ_i ℓ_i</w:t>
+      </w:r>
+      <w:r>
+        <w:t xml:space="preserve">, where</w:t>
+      </w:r>
+      <w:r>
+        <w:t xml:space="preserve"> </w:t>
+      </w:r>
+      <w:r>
+        <w:rPr>
+          <w:rStyle w:val="VerbatimChar"/>
+        </w:rPr>
+        <w:t xml:space="preserve">P</w:t>
+      </w:r>
+      <w:r>
+        <w:t xml:space="preserve"> </w:t>
+      </w:r>
+      <w:r>
+        <w:t xml:space="preserve">is a property that splitting preserves</w:t>
+      </w:r>
+      <w:r>
+        <w:t xml:space="preserve"> </w:t>
+      </w:r>
+      <w:r>
+        <w:t xml:space="preserve">(</w:t>
+      </w:r>
+      <w:r>
+        <w:t xml:space="preserve">“this segment is inverted relative to the other genome”</w:t>
+      </w:r>
+      <w:r>
+        <w:t xml:space="preserve"> </w:t>
+      </w:r>
+      <w:r>
+        <w:t xml:space="preserve">is one). Splitting a</w:t>
+      </w:r>
+      <w:r>
+        <w:t xml:space="preserve"> </w:t>
+      </w:r>
+      <w:r>
+        <w:t xml:space="preserve">segment leaves both sums unchanged, so</w:t>
+      </w:r>
+      <w:r>
+        <w:t xml:space="preserve"> </w:t>
+      </w:r>
+      <w:r>
+        <w:rPr>
+          <w:rStyle w:val="VerbatimChar"/>
+        </w:rPr>
+        <w:t xml:space="preserve">F</w:t>
+      </w:r>
+      <w:r>
+        <w:t xml:space="preserve"> </w:t>
+      </w:r>
+      <w:r>
+        <w:t xml:space="preserve">does not depend on</w:t>
+      </w:r>
+      <w:r>
+        <w:t xml:space="preserve"> </w:t>
+      </w:r>
+      <w:r>
+        <w:rPr>
+          <w:rStyle w:val="VerbatimChar"/>
+        </w:rPr>
+        <w:t xml:space="preserve">K</w:t>
+      </w:r>
+      <w:r>
+        <w:t xml:space="preserve"> </w:t>
+      </w:r>
+      <w:r>
+        <w:t xml:space="preserve">at all — no</w:t>
+      </w:r>
+      <w:r>
+        <w:t xml:space="preserve"> </w:t>
+      </w:r>
+      <w:r>
+        <w:t xml:space="preserve">correction term exists to get wrong. Measured:</w:t>
+      </w:r>
+      <w:r>
+        <w:t xml:space="preserve"> </w:t>
+      </w:r>
+      <w:r>
+        <w:rPr>
+          <w:rStyle w:val="VerbatimChar"/>
+        </w:rPr>
+        <w:t xml:space="preserve">inverted_fraction</w:t>
+      </w:r>
+      <w:r>
+        <w:t xml:space="preserve"> </w:t>
+      </w:r>
+      <w:r>
+        <w:t xml:space="preserve">reads 0.000 on</w:t>
+      </w:r>
+      <w:r>
+        <w:t xml:space="preserve"> </w:t>
+      </w:r>
+      <w:r>
+        <w:t xml:space="preserve">a 120-contig self-assembly and regresses on the true inverted base-pair fraction</w:t>
+      </w:r>
+      <w:r>
+        <w:t xml:space="preserve"> </w:t>
+      </w:r>
+      <w:r>
+        <w:t xml:space="preserve">at slope 0.97, R² = 0.999 across a 512-fold range of event lengths and 0–5%</w:t>
+      </w:r>
+      <w:r>
+        <w:t xml:space="preserve"> </w:t>
+      </w:r>
+      <w:r>
+        <w:t xml:space="preserve">divergence. The price is that a ratio carries no event count and saturates past</w:t>
+      </w:r>
+      <w:r>
+        <w:t xml:space="preserve"> </w:t>
+      </w:r>
+      <w:r>
+        <w:t xml:space="preserve">50% inverted. Counts and ratios are therefore complementary with disjoint failure</w:t>
+      </w:r>
+      <w:r>
+        <w:t xml:space="preserve"> </w:t>
+      </w:r>
+      <w:r>
+        <w:t xml:space="preserve">modes: counts localize events but are fragile to fragmentation; ratios are</w:t>
+      </w:r>
+      <w:r>
+        <w:t xml:space="preserve"> </w:t>
+      </w:r>
+      <w:r>
+        <w:t xml:space="preserve">fragmentation-invariant but blind to event number. Syn2bANI reports both and does</w:t>
+      </w:r>
+      <w:r>
+        <w:t xml:space="preserve"> </w:t>
+      </w:r>
+      <w:r>
+        <w:t xml:space="preserve">not derive one from the other. For comparison with a fixed-reference alignment</w:t>
+      </w:r>
+      <w:r>
+        <w:t xml:space="preserve"> </w:t>
+      </w:r>
+      <w:r>
+        <w:t xml:space="preserve">method, the reference-oriented</w:t>
+      </w:r>
+      <w:r>
+        <w:t xml:space="preserve"> </w:t>
+      </w:r>
+      <w:r>
+        <w:rPr>
+          <w:rStyle w:val="VerbatimChar"/>
+        </w:rPr>
+        <w:t xml:space="preserve">raw_inverted_fraction</w:t>
+      </w:r>
+      <w:r>
+        <w:t xml:space="preserve"> </w:t>
+      </w:r>
+      <w:r>
+        <w:t xml:space="preserve">(range [0, 1], the direct</w:t>
+      </w:r>
+      <w:r>
+        <w:t xml:space="preserve"> </w:t>
+      </w:r>
+      <w:r>
+        <w:t xml:space="preserve">analog of the alignment-based inverted aligned fraction) is used; for undirected</w:t>
+      </w:r>
+      <w:r>
+        <w:t xml:space="preserve"> </w:t>
+      </w:r>
+      <w:r>
+        <w:t xml:space="preserve">all-vs-all screens the mirror-corrected</w:t>
+      </w:r>
+      <w:r>
+        <w:t xml:space="preserve"> </w:t>
+      </w:r>
+      <w:r>
+        <w:rPr>
+          <w:rStyle w:val="VerbatimChar"/>
+        </w:rPr>
+        <w:t xml:space="preserve">min(raw, 1 − raw)</w:t>
+      </w:r>
+      <w:r>
+        <w:t xml:space="preserve"> </w:t>
+      </w:r>
+      <w:r>
+        <w:t xml:space="preserve">is appropriate</w:t>
+      </w:r>
+      <w:r>
+        <w:t xml:space="preserve"> </w:t>
+      </w:r>
+      <w:r>
+        <w:t xml:space="preserve">(Supplementary Fig. S14).</w:t>
+      </w:r>
+    </w:p>
+    <w:p>
+      <w:pPr>
+        <w:pStyle w:val="BodyText"/>
+      </w:pPr>
+      <w:r>
+        <w:rPr>
+          <w:b/>
+          <w:bCs/>
+        </w:rPr>
+        <w:t xml:space="preserve">Corollary: the sensitivity discount, in closed form.</w:t>
+      </w:r>
+      <w:r>
+        <w:t xml:space="preserve"> </w:t>
+      </w:r>
+      <w:r>
+        <w:t xml:space="preserve">With</w:t>
+      </w:r>
+      <w:r>
+        <w:t xml:space="preserve"> </w:t>
+      </w:r>
+      <w:r>
+        <w:rPr>
+          <w:rStyle w:val="VerbatimChar"/>
+        </w:rPr>
+        <w:t xml:space="preserve">c = 0</w:t>
+      </w:r>
+      <w:r>
+        <w:t xml:space="preserve">, what</w:t>
+      </w:r>
+      <w:r>
+        <w:t xml:space="preserve"> </w:t>
+      </w:r>
+      <w:r>
+        <w:t xml:space="preserve">remains is a loss of sensitivity — junctions falling at segment boundaries are</w:t>
+      </w:r>
+      <w:r>
+        <w:t xml:space="preserve"> </w:t>
+      </w:r>
+      <w:r>
+        <w:t xml:space="preserve">invisible. That share is exactly the observable adjacency fraction,</w:t>
+      </w:r>
+      <w:r>
+        <w:t xml:space="preserve"> </w:t>
+      </w:r>
+      <w:r>
+        <w:rPr>
+          <w:rStyle w:val="VerbatimChar"/>
+        </w:rPr>
+        <w:t xml:space="preserve">observable_fraction ≈ 1 − (K − 1)/S</w:t>
+      </w:r>
+      <w:r>
+        <w:t xml:space="preserve">, exact to four decimals up to K = 300 on</w:t>
+      </w:r>
+      <w:r>
+        <w:t xml:space="preserve"> </w:t>
+      </w:r>
+      <w:r>
+        <w:rPr>
+          <w:i/>
+          <w:iCs/>
+        </w:rPr>
+        <w:t xml:space="preserve">E. coli</w:t>
+      </w:r>
+      <w:r>
+        <w:t xml:space="preserve"> </w:t>
+      </w:r>
+      <w:r>
+        <w:t xml:space="preserve">with the default panel, and an unbiased predictor of surviving junctions</w:t>
+      </w:r>
+      <w:r>
+        <w:t xml:space="preserve"> </w:t>
+      </w:r>
+      <w:r>
+        <w:t xml:space="preserve">(mean error −0.31, sd 1.26 against a binomial sampling sd of ≈1.5 at a truth of</w:t>
+      </w:r>
+      <w:r>
+        <w:t xml:space="preserve"> </w:t>
+      </w:r>
+      <w:r>
+        <w:t xml:space="preserve">10, over 16 fragmentation levels). In scale-free form: recovery is essentially</w:t>
+      </w:r>
+      <w:r>
+        <w:t xml:space="preserve"> </w:t>
+      </w:r>
+      <w:r>
+        <w:t xml:space="preserve">complete while segments hold ≳10 landmarks, i.e. contig N50 ≳ 10× the landmark</w:t>
+      </w:r>
+      <w:r>
+        <w:t xml:space="preserve"> </w:t>
+      </w:r>
+      <w:r>
+        <w:t xml:space="preserve">spacing (~15 kb for the default four-enzyme panel).</w:t>
+      </w:r>
+    </w:p>
+    <w:bookmarkEnd w:id="35"/>
+    <w:bookmarkEnd w:id="36"/>
     <w:sectPr>
       <w:footnotePr>
         <w:numRestart w:val="eachSect"/>
@@ -6212,6 +7816,91 @@
       </w:pPr>
     </w:lvl>
   </w:abstractNum>
+  <w:abstractNum w:abstractNumId="99731">
+    <w:nsid w:val="00A99731"/>
+    <w:multiLevelType w:val="multilevel"/>
+    <w:lvl w:ilvl="0">
+      <w:start w:val="1"/>
+      <w:numFmt w:val="lowerLetter"/>
+      <w:lvlText w:val="(%1)"/>
+      <w:lvlJc w:val="left"/>
+      <w:pPr>
+        <w:ind w:left="720" w:hanging="360"/>
+      </w:pPr>
+    </w:lvl>
+    <w:lvl w:ilvl="1">
+      <w:start w:val="1"/>
+      <w:numFmt w:val="lowerLetter"/>
+      <w:lvlText w:val="(%2)"/>
+      <w:lvlJc w:val="left"/>
+      <w:pPr>
+        <w:ind w:left="1440" w:hanging="360"/>
+      </w:pPr>
+    </w:lvl>
+    <w:lvl w:ilvl="2">
+      <w:start w:val="1"/>
+      <w:numFmt w:val="lowerLetter"/>
+      <w:lvlText w:val="(%3)"/>
+      <w:lvlJc w:val="left"/>
+      <w:pPr>
+        <w:ind w:left="2160" w:hanging="360"/>
+      </w:pPr>
+    </w:lvl>
+    <w:lvl w:ilvl="3">
+      <w:start w:val="1"/>
+      <w:numFmt w:val="lowerLetter"/>
+      <w:lvlText w:val="(%4)"/>
+      <w:lvlJc w:val="left"/>
+      <w:pPr>
+        <w:ind w:left="2880" w:hanging="360"/>
+      </w:pPr>
+    </w:lvl>
+    <w:lvl w:ilvl="4">
+      <w:start w:val="1"/>
+      <w:numFmt w:val="lowerLetter"/>
+      <w:lvlText w:val="(%5)"/>
+      <w:lvlJc w:val="left"/>
+      <w:pPr>
+        <w:ind w:left="3600" w:hanging="360"/>
+      </w:pPr>
+    </w:lvl>
+    <w:lvl w:ilvl="5">
+      <w:start w:val="1"/>
+      <w:numFmt w:val="lowerLetter"/>
+      <w:lvlText w:val="(%6)"/>
+      <w:lvlJc w:val="left"/>
+      <w:pPr>
+        <w:ind w:left="4320" w:hanging="360"/>
+      </w:pPr>
+    </w:lvl>
+    <w:lvl w:ilvl="6">
+      <w:start w:val="1"/>
+      <w:numFmt w:val="lowerLetter"/>
+      <w:lvlText w:val="(%7)"/>
+      <w:lvlJc w:val="left"/>
+      <w:pPr>
+        <w:ind w:left="5040" w:hanging="360"/>
+      </w:pPr>
+    </w:lvl>
+    <w:lvl w:ilvl="7">
+      <w:start w:val="1"/>
+      <w:numFmt w:val="lowerLetter"/>
+      <w:lvlText w:val="(%8)"/>
+      <w:lvlJc w:val="left"/>
+      <w:pPr>
+        <w:ind w:left="5760" w:hanging="360"/>
+      </w:pPr>
+    </w:lvl>
+    <w:lvl w:ilvl="8">
+      <w:start w:val="1"/>
+      <w:numFmt w:val="lowerLetter"/>
+      <w:lvlText w:val="(%9)"/>
+      <w:lvlJc w:val="left"/>
+      <w:pPr>
+        <w:ind w:left="6480" w:hanging="360"/>
+      </w:pPr>
+    </w:lvl>
+  </w:abstractNum>
   <w:abstractNum w:abstractNumId="991">
     <w:nsid w:val="0000A991"/>
     <w:multiLevelType w:val="multilevel"/>
@@ -6319,12 +8008,42 @@
     <w:abstractNumId w:val="990"/>
   </w:num>
   <w:num w:numId="1001">
-    <w:abstractNumId w:val="991"/>
+    <w:abstractNumId w:val="99731"/>
+    <w:lvlOverride w:ilvl="0">
+      <w:startOverride w:val="1"/>
+    </w:lvlOverride>
+    <w:lvlOverride w:ilvl="1">
+      <w:startOverride w:val="1"/>
+    </w:lvlOverride>
+    <w:lvlOverride w:ilvl="2">
+      <w:startOverride w:val="1"/>
+    </w:lvlOverride>
+    <w:lvlOverride w:ilvl="3">
+      <w:startOverride w:val="1"/>
+    </w:lvlOverride>
+    <w:lvlOverride w:ilvl="4">
+      <w:startOverride w:val="1"/>
+    </w:lvlOverride>
+    <w:lvlOverride w:ilvl="5">
+      <w:startOverride w:val="1"/>
+    </w:lvlOverride>
+    <w:lvlOverride w:ilvl="6">
+      <w:startOverride w:val="1"/>
+    </w:lvlOverride>
+    <w:lvlOverride w:ilvl="7">
+      <w:startOverride w:val="1"/>
+    </w:lvlOverride>
+    <w:lvlOverride w:ilvl="8">
+      <w:startOverride w:val="1"/>
+    </w:lvlOverride>
   </w:num>
   <w:num w:numId="1002">
     <w:abstractNumId w:val="991"/>
   </w:num>
   <w:num w:numId="1003">
+    <w:abstractNumId w:val="991"/>
+  </w:num>
+  <w:num w:numId="1004">
     <w:abstractNumId w:val="991"/>
   </w:num>
 </w:numbering>

</xml_diff>